<commit_message>
Refactor: Added logging to the BookingController to help see if there is a deploy error or issues that can be traced
</commit_message>
<xml_diff>
--- a/docs/school_related/verktygspresentation_clo24nikhal.docx
+++ b/docs/school_related/verktygspresentation_clo24nikhal.docx
@@ -151,31 +151,14 @@
           <w:r>
             <w:fldChar w:fldCharType="separate"/>
           </w:r>
-          <w:hyperlink w:anchor="_Toc215041196" w:history="1">
-            <w:r>
-              <w:rPr>
-                <w:rStyle w:val="Hyperlink"/>
-                <w:noProof/>
-                <w:lang w:val="sv-SE"/>
-              </w:rPr>
-              <w:t xml:space="preserve">Verktygspresentation </w:t>
-            </w:r>
-            <w:r>
-              <w:rPr>
-                <w:rStyle w:val="Hyperlink"/>
-                <w:rFonts w:hint="eastAsia"/>
-                <w:noProof/>
-                <w:lang w:val="sv-SE"/>
-              </w:rPr>
-              <w:t>–</w:t>
-            </w:r>
-            <w:r>
-              <w:rPr>
-                <w:rStyle w:val="Hyperlink"/>
-                <w:noProof/>
-                <w:lang w:val="sv-SE"/>
-              </w:rPr>
-              <w:t xml:space="preserve"> Mall</w:t>
+          <w:hyperlink w:anchor="_Toc215126456" w:history="1">
+            <w:r>
+              <w:rPr>
+                <w:rStyle w:val="Hyperlink"/>
+                <w:noProof/>
+                <w:lang w:val="sv-SE"/>
+              </w:rPr>
+              <w:t>Verktygspresentation</w:t>
             </w:r>
             <w:r>
               <w:rPr>
@@ -196,7 +179,7 @@
                 <w:noProof/>
                 <w:webHidden/>
               </w:rPr>
-              <w:instrText xml:space="preserve"> PAGEREF _Toc215041196 \h </w:instrText>
+              <w:instrText xml:space="preserve"> PAGEREF _Toc215126456 \h </w:instrText>
             </w:r>
             <w:r>
               <w:rPr>
@@ -241,14 +224,14 @@
               <w:lang w:val="en-SE" w:eastAsia="en-SE"/>
             </w:rPr>
           </w:pPr>
-          <w:hyperlink w:anchor="_Toc215041197" w:history="1">
-            <w:r>
-              <w:rPr>
-                <w:rStyle w:val="Hyperlink"/>
-                <w:noProof/>
-                <w:lang w:val="sv-SE"/>
-              </w:rPr>
-              <w:t>1. Syfte</w:t>
+          <w:hyperlink w:anchor="_Toc215126457" w:history="1">
+            <w:r>
+              <w:rPr>
+                <w:rStyle w:val="Hyperlink"/>
+                <w:noProof/>
+                <w:lang w:val="sv-SE"/>
+              </w:rPr>
+              <w:t>0. Introduktion</w:t>
             </w:r>
             <w:r>
               <w:rPr>
@@ -269,7 +252,7 @@
                 <w:noProof/>
                 <w:webHidden/>
               </w:rPr>
-              <w:instrText xml:space="preserve"> PAGEREF _Toc215041197 \h </w:instrText>
+              <w:instrText xml:space="preserve"> PAGEREF _Toc215126457 \h </w:instrText>
             </w:r>
             <w:r>
               <w:rPr>
@@ -314,14 +297,14 @@
               <w:lang w:val="en-SE" w:eastAsia="en-SE"/>
             </w:rPr>
           </w:pPr>
-          <w:hyperlink w:anchor="_Toc215041198" w:history="1">
-            <w:r>
-              <w:rPr>
-                <w:rStyle w:val="Hyperlink"/>
-                <w:noProof/>
-                <w:lang w:val="sv-SE"/>
-              </w:rPr>
-              <w:t>2. M</w:t>
+          <w:hyperlink w:anchor="_Toc215126458" w:history="1">
+            <w:r>
+              <w:rPr>
+                <w:rStyle w:val="Hyperlink"/>
+                <w:noProof/>
+                <w:lang w:val="sv-SE"/>
+              </w:rPr>
+              <w:t xml:space="preserve">1. Verktyg </w:t>
             </w:r>
             <w:r>
               <w:rPr>
@@ -330,6 +313,92 @@
                 <w:noProof/>
                 <w:lang w:val="sv-SE"/>
               </w:rPr>
+              <w:t>–</w:t>
+            </w:r>
+            <w:r>
+              <w:rPr>
+                <w:rStyle w:val="Hyperlink"/>
+                <w:noProof/>
+                <w:lang w:val="sv-SE"/>
+              </w:rPr>
+              <w:t xml:space="preserve"> syfte och funktion</w:t>
+            </w:r>
+            <w:r>
+              <w:rPr>
+                <w:noProof/>
+                <w:webHidden/>
+              </w:rPr>
+              <w:tab/>
+            </w:r>
+            <w:r>
+              <w:rPr>
+                <w:noProof/>
+                <w:webHidden/>
+              </w:rPr>
+              <w:fldChar w:fldCharType="begin"/>
+            </w:r>
+            <w:r>
+              <w:rPr>
+                <w:noProof/>
+                <w:webHidden/>
+              </w:rPr>
+              <w:instrText xml:space="preserve"> PAGEREF _Toc215126458 \h </w:instrText>
+            </w:r>
+            <w:r>
+              <w:rPr>
+                <w:noProof/>
+                <w:webHidden/>
+              </w:rPr>
+            </w:r>
+            <w:r>
+              <w:rPr>
+                <w:noProof/>
+                <w:webHidden/>
+              </w:rPr>
+              <w:fldChar w:fldCharType="separate"/>
+            </w:r>
+            <w:r>
+              <w:rPr>
+                <w:noProof/>
+                <w:webHidden/>
+              </w:rPr>
+              <w:t>2</w:t>
+            </w:r>
+            <w:r>
+              <w:rPr>
+                <w:noProof/>
+                <w:webHidden/>
+              </w:rPr>
+              <w:fldChar w:fldCharType="end"/>
+            </w:r>
+          </w:hyperlink>
+        </w:p>
+        <w:p>
+          <w:pPr>
+            <w:pStyle w:val="TOC3"/>
+            <w:tabs>
+              <w:tab w:val="right" w:leader="dot" w:pos="9016"/>
+            </w:tabs>
+            <w:rPr>
+              <w:noProof/>
+            </w:rPr>
+          </w:pPr>
+          <w:hyperlink w:anchor="_Toc215126459" w:history="1">
+            <w:r>
+              <w:rPr>
+                <w:rStyle w:val="Hyperlink"/>
+                <w:noProof/>
+                <w:lang w:val="sv-SE"/>
+              </w:rPr>
+              <w:t>1.1 Verktygsl</w:t>
+            </w:r>
+            <w:r>
+              <w:rPr>
+                <w:rStyle w:val="Hyperlink"/>
+                <w:rFonts w:hint="eastAsia"/>
+                <w:noProof/>
+                <w:lang w:val="sv-SE"/>
+              </w:rPr>
               <w:t>å</w:t>
             </w:r>
             <w:r>
@@ -338,7 +407,24 @@
                 <w:noProof/>
                 <w:lang w:val="sv-SE"/>
               </w:rPr>
-              <w:t>lgrupp</w:t>
+              <w:t xml:space="preserve">da </w:t>
+            </w:r>
+            <w:r>
+              <w:rPr>
+                <w:rStyle w:val="Hyperlink"/>
+                <w:rFonts w:hint="eastAsia"/>
+                <w:noProof/>
+                <w:lang w:val="sv-SE"/>
+              </w:rPr>
+              <w:t>–</w:t>
+            </w:r>
+            <w:r>
+              <w:rPr>
+                <w:rStyle w:val="Hyperlink"/>
+                <w:noProof/>
+                <w:lang w:val="sv-SE"/>
+              </w:rPr>
+              <w:t xml:space="preserve"> Azure</w:t>
             </w:r>
             <w:r>
               <w:rPr>
@@ -359,7 +445,7 @@
                 <w:noProof/>
                 <w:webHidden/>
               </w:rPr>
-              <w:instrText xml:space="preserve"> PAGEREF _Toc215041198 \h </w:instrText>
+              <w:instrText xml:space="preserve"> PAGEREF _Toc215126459 \h </w:instrText>
             </w:r>
             <w:r>
               <w:rPr>
@@ -379,7 +465,299 @@
                 <w:noProof/>
                 <w:webHidden/>
               </w:rPr>
-              <w:t>1</w:t>
+              <w:t>2</w:t>
+            </w:r>
+            <w:r>
+              <w:rPr>
+                <w:noProof/>
+                <w:webHidden/>
+              </w:rPr>
+              <w:fldChar w:fldCharType="end"/>
+            </w:r>
+          </w:hyperlink>
+        </w:p>
+        <w:p>
+          <w:pPr>
+            <w:pStyle w:val="TOC3"/>
+            <w:tabs>
+              <w:tab w:val="right" w:leader="dot" w:pos="9016"/>
+            </w:tabs>
+            <w:rPr>
+              <w:noProof/>
+            </w:rPr>
+          </w:pPr>
+          <w:hyperlink w:anchor="_Toc215126460" w:history="1">
+            <w:r>
+              <w:rPr>
+                <w:rStyle w:val="Hyperlink"/>
+                <w:noProof/>
+                <w:lang w:val="sv-SE"/>
+              </w:rPr>
+              <w:t>1.2 Verktygsl</w:t>
+            </w:r>
+            <w:r>
+              <w:rPr>
+                <w:rStyle w:val="Hyperlink"/>
+                <w:rFonts w:hint="eastAsia"/>
+                <w:noProof/>
+                <w:lang w:val="sv-SE"/>
+              </w:rPr>
+              <w:t>å</w:t>
+            </w:r>
+            <w:r>
+              <w:rPr>
+                <w:rStyle w:val="Hyperlink"/>
+                <w:noProof/>
+                <w:lang w:val="sv-SE"/>
+              </w:rPr>
+              <w:t>da - .NET</w:t>
+            </w:r>
+            <w:r>
+              <w:rPr>
+                <w:noProof/>
+                <w:webHidden/>
+              </w:rPr>
+              <w:tab/>
+            </w:r>
+            <w:r>
+              <w:rPr>
+                <w:noProof/>
+                <w:webHidden/>
+              </w:rPr>
+              <w:fldChar w:fldCharType="begin"/>
+            </w:r>
+            <w:r>
+              <w:rPr>
+                <w:noProof/>
+                <w:webHidden/>
+              </w:rPr>
+              <w:instrText xml:space="preserve"> PAGEREF _Toc215126460 \h </w:instrText>
+            </w:r>
+            <w:r>
+              <w:rPr>
+                <w:noProof/>
+                <w:webHidden/>
+              </w:rPr>
+            </w:r>
+            <w:r>
+              <w:rPr>
+                <w:noProof/>
+                <w:webHidden/>
+              </w:rPr>
+              <w:fldChar w:fldCharType="separate"/>
+            </w:r>
+            <w:r>
+              <w:rPr>
+                <w:noProof/>
+                <w:webHidden/>
+              </w:rPr>
+              <w:t>2</w:t>
+            </w:r>
+            <w:r>
+              <w:rPr>
+                <w:noProof/>
+                <w:webHidden/>
+              </w:rPr>
+              <w:fldChar w:fldCharType="end"/>
+            </w:r>
+          </w:hyperlink>
+        </w:p>
+        <w:p>
+          <w:pPr>
+            <w:pStyle w:val="TOC3"/>
+            <w:tabs>
+              <w:tab w:val="right" w:leader="dot" w:pos="9016"/>
+            </w:tabs>
+            <w:rPr>
+              <w:noProof/>
+            </w:rPr>
+          </w:pPr>
+          <w:hyperlink w:anchor="_Toc215126461" w:history="1">
+            <w:r>
+              <w:rPr>
+                <w:rStyle w:val="Hyperlink"/>
+                <w:noProof/>
+                <w:lang w:val="sv-SE"/>
+              </w:rPr>
+              <w:t>1.3 Verktygsl</w:t>
+            </w:r>
+            <w:r>
+              <w:rPr>
+                <w:rStyle w:val="Hyperlink"/>
+                <w:rFonts w:hint="eastAsia"/>
+                <w:noProof/>
+                <w:lang w:val="sv-SE"/>
+              </w:rPr>
+              <w:t>å</w:t>
+            </w:r>
+            <w:r>
+              <w:rPr>
+                <w:rStyle w:val="Hyperlink"/>
+                <w:noProof/>
+                <w:lang w:val="sv-SE"/>
+              </w:rPr>
+              <w:t xml:space="preserve">da </w:t>
+            </w:r>
+            <w:r>
+              <w:rPr>
+                <w:rStyle w:val="Hyperlink"/>
+                <w:rFonts w:hint="eastAsia"/>
+                <w:noProof/>
+                <w:lang w:val="sv-SE"/>
+              </w:rPr>
+              <w:t>–</w:t>
+            </w:r>
+            <w:r>
+              <w:rPr>
+                <w:rStyle w:val="Hyperlink"/>
+                <w:noProof/>
+                <w:lang w:val="sv-SE"/>
+              </w:rPr>
+              <w:t xml:space="preserve"> IaC-verktyg</w:t>
+            </w:r>
+            <w:r>
+              <w:rPr>
+                <w:noProof/>
+                <w:webHidden/>
+              </w:rPr>
+              <w:tab/>
+            </w:r>
+            <w:r>
+              <w:rPr>
+                <w:noProof/>
+                <w:webHidden/>
+              </w:rPr>
+              <w:fldChar w:fldCharType="begin"/>
+            </w:r>
+            <w:r>
+              <w:rPr>
+                <w:noProof/>
+                <w:webHidden/>
+              </w:rPr>
+              <w:instrText xml:space="preserve"> PAGEREF _Toc215126461 \h </w:instrText>
+            </w:r>
+            <w:r>
+              <w:rPr>
+                <w:noProof/>
+                <w:webHidden/>
+              </w:rPr>
+            </w:r>
+            <w:r>
+              <w:rPr>
+                <w:noProof/>
+                <w:webHidden/>
+              </w:rPr>
+              <w:fldChar w:fldCharType="separate"/>
+            </w:r>
+            <w:r>
+              <w:rPr>
+                <w:noProof/>
+                <w:webHidden/>
+              </w:rPr>
+              <w:t>2</w:t>
+            </w:r>
+            <w:r>
+              <w:rPr>
+                <w:noProof/>
+                <w:webHidden/>
+              </w:rPr>
+              <w:fldChar w:fldCharType="end"/>
+            </w:r>
+          </w:hyperlink>
+        </w:p>
+        <w:p>
+          <w:pPr>
+            <w:pStyle w:val="TOC3"/>
+            <w:tabs>
+              <w:tab w:val="right" w:leader="dot" w:pos="9016"/>
+            </w:tabs>
+            <w:rPr>
+              <w:noProof/>
+            </w:rPr>
+          </w:pPr>
+          <w:hyperlink w:anchor="_Toc215126462" w:history="1">
+            <w:r>
+              <w:rPr>
+                <w:rStyle w:val="Hyperlink"/>
+                <w:noProof/>
+                <w:lang w:val="sv-SE"/>
+              </w:rPr>
+              <w:t>1.X Verktygsl</w:t>
+            </w:r>
+            <w:r>
+              <w:rPr>
+                <w:rStyle w:val="Hyperlink"/>
+                <w:rFonts w:hint="eastAsia"/>
+                <w:noProof/>
+                <w:lang w:val="sv-SE"/>
+              </w:rPr>
+              <w:t>å</w:t>
+            </w:r>
+            <w:r>
+              <w:rPr>
+                <w:rStyle w:val="Hyperlink"/>
+                <w:noProof/>
+                <w:lang w:val="sv-SE"/>
+              </w:rPr>
+              <w:t xml:space="preserve">da </w:t>
+            </w:r>
+            <w:r>
+              <w:rPr>
+                <w:rStyle w:val="Hyperlink"/>
+                <w:rFonts w:hint="eastAsia"/>
+                <w:noProof/>
+                <w:lang w:val="sv-SE"/>
+              </w:rPr>
+              <w:t>–</w:t>
+            </w:r>
+            <w:r>
+              <w:rPr>
+                <w:rStyle w:val="Hyperlink"/>
+                <w:noProof/>
+                <w:lang w:val="sv-SE"/>
+              </w:rPr>
+              <w:t xml:space="preserve"> Programkritiskt verktyg, dess syfte och funktion</w:t>
+            </w:r>
+            <w:r>
+              <w:rPr>
+                <w:noProof/>
+                <w:webHidden/>
+              </w:rPr>
+              <w:tab/>
+            </w:r>
+            <w:r>
+              <w:rPr>
+                <w:noProof/>
+                <w:webHidden/>
+              </w:rPr>
+              <w:fldChar w:fldCharType="begin"/>
+            </w:r>
+            <w:r>
+              <w:rPr>
+                <w:noProof/>
+                <w:webHidden/>
+              </w:rPr>
+              <w:instrText xml:space="preserve"> PAGEREF _Toc215126462 \h </w:instrText>
+            </w:r>
+            <w:r>
+              <w:rPr>
+                <w:noProof/>
+                <w:webHidden/>
+              </w:rPr>
+            </w:r>
+            <w:r>
+              <w:rPr>
+                <w:noProof/>
+                <w:webHidden/>
+              </w:rPr>
+              <w:fldChar w:fldCharType="separate"/>
+            </w:r>
+            <w:r>
+              <w:rPr>
+                <w:noProof/>
+                <w:webHidden/>
+              </w:rPr>
+              <w:t>2</w:t>
             </w:r>
             <w:r>
               <w:rPr>
@@ -404,14 +782,14 @@
               <w:lang w:val="en-SE" w:eastAsia="en-SE"/>
             </w:rPr>
           </w:pPr>
-          <w:hyperlink w:anchor="_Toc215041199" w:history="1">
-            <w:r>
-              <w:rPr>
-                <w:rStyle w:val="Hyperlink"/>
-                <w:noProof/>
-                <w:lang w:val="sv-SE"/>
-              </w:rPr>
-              <w:t xml:space="preserve">3. </w:t>
+          <w:hyperlink w:anchor="_Toc215126463" w:history="1">
+            <w:r>
+              <w:rPr>
+                <w:rStyle w:val="Hyperlink"/>
+                <w:noProof/>
+                <w:lang w:val="sv-SE"/>
+              </w:rPr>
+              <w:t>2. M</w:t>
             </w:r>
             <w:r>
               <w:rPr>
@@ -420,15 +798,15 @@
                 <w:noProof/>
                 <w:lang w:val="sv-SE"/>
               </w:rPr>
-              <w:t>Ö</w:t>
-            </w:r>
-            <w:r>
-              <w:rPr>
-                <w:rStyle w:val="Hyperlink"/>
-                <w:noProof/>
-                <w:lang w:val="sv-SE"/>
-              </w:rPr>
-              <w:t>versikt</w:t>
+              <w:t>å</w:t>
+            </w:r>
+            <w:r>
+              <w:rPr>
+                <w:rStyle w:val="Hyperlink"/>
+                <w:noProof/>
+                <w:lang w:val="sv-SE"/>
+              </w:rPr>
+              <w:t>lgrupp</w:t>
             </w:r>
             <w:r>
               <w:rPr>
@@ -449,7 +827,7 @@
                 <w:noProof/>
                 <w:webHidden/>
               </w:rPr>
-              <w:instrText xml:space="preserve"> PAGEREF _Toc215041199 \h </w:instrText>
+              <w:instrText xml:space="preserve"> PAGEREF _Toc215126463 \h </w:instrText>
             </w:r>
             <w:r>
               <w:rPr>
@@ -469,7 +847,7 @@
                 <w:noProof/>
                 <w:webHidden/>
               </w:rPr>
-              <w:t>1</w:t>
+              <w:t>2</w:t>
             </w:r>
             <w:r>
               <w:rPr>
@@ -494,14 +872,31 @@
               <w:lang w:val="en-SE" w:eastAsia="en-SE"/>
             </w:rPr>
           </w:pPr>
-          <w:hyperlink w:anchor="_Toc215041200" w:history="1">
-            <w:r>
-              <w:rPr>
-                <w:rStyle w:val="Hyperlink"/>
-                <w:noProof/>
-                <w:lang w:val="sv-SE"/>
-              </w:rPr>
-              <w:t>4. Huvudfunktioner</w:t>
+          <w:hyperlink w:anchor="_Toc215126464" w:history="1">
+            <w:r>
+              <w:rPr>
+                <w:rStyle w:val="Hyperlink"/>
+                <w:noProof/>
+                <w:lang w:val="sv-SE"/>
+              </w:rPr>
+              <w:t xml:space="preserve">3. </w:t>
+            </w:r>
+            <w:r>
+              <w:rPr>
+                <w:rStyle w:val="Hyperlink"/>
+                <w:rFonts w:hint="eastAsia"/>
+                <w:noProof/>
+                <w:lang w:val="sv-SE"/>
+              </w:rPr>
+              <w:t>Ö</w:t>
+            </w:r>
+            <w:r>
+              <w:rPr>
+                <w:rStyle w:val="Hyperlink"/>
+                <w:noProof/>
+                <w:lang w:val="sv-SE"/>
+              </w:rPr>
+              <w:t>versikt</w:t>
             </w:r>
             <w:r>
               <w:rPr>
@@ -522,7 +917,7 @@
                 <w:noProof/>
                 <w:webHidden/>
               </w:rPr>
-              <w:instrText xml:space="preserve"> PAGEREF _Toc215041200 \h </w:instrText>
+              <w:instrText xml:space="preserve"> PAGEREF _Toc215126464 \h </w:instrText>
             </w:r>
             <w:r>
               <w:rPr>
@@ -542,7 +937,7 @@
                 <w:noProof/>
                 <w:webHidden/>
               </w:rPr>
-              <w:t>1</w:t>
+              <w:t>2</w:t>
             </w:r>
             <w:r>
               <w:rPr>
@@ -567,14 +962,14 @@
               <w:lang w:val="en-SE" w:eastAsia="en-SE"/>
             </w:rPr>
           </w:pPr>
-          <w:hyperlink w:anchor="_Toc215041201" w:history="1">
-            <w:r>
-              <w:rPr>
-                <w:rStyle w:val="Hyperlink"/>
-                <w:noProof/>
-                <w:lang w:val="sv-SE"/>
-              </w:rPr>
-              <w:t>5. Roller</w:t>
+          <w:hyperlink w:anchor="_Toc215126465" w:history="1">
+            <w:r>
+              <w:rPr>
+                <w:rStyle w:val="Hyperlink"/>
+                <w:noProof/>
+                <w:lang w:val="sv-SE"/>
+              </w:rPr>
+              <w:t>4. Huvudfunktioner</w:t>
             </w:r>
             <w:r>
               <w:rPr>
@@ -595,7 +990,7 @@
                 <w:noProof/>
                 <w:webHidden/>
               </w:rPr>
-              <w:instrText xml:space="preserve"> PAGEREF _Toc215041201 \h </w:instrText>
+              <w:instrText xml:space="preserve"> PAGEREF _Toc215126465 \h </w:instrText>
             </w:r>
             <w:r>
               <w:rPr>
@@ -640,31 +1035,14 @@
               <w:lang w:val="en-SE" w:eastAsia="en-SE"/>
             </w:rPr>
           </w:pPr>
-          <w:hyperlink w:anchor="_Toc215041202" w:history="1">
-            <w:r>
-              <w:rPr>
-                <w:rStyle w:val="Hyperlink"/>
-                <w:noProof/>
-                <w:lang w:val="sv-SE"/>
-              </w:rPr>
-              <w:t>6. F</w:t>
-            </w:r>
-            <w:r>
-              <w:rPr>
-                <w:rStyle w:val="Hyperlink"/>
-                <w:rFonts w:hint="eastAsia"/>
-                <w:noProof/>
-                <w:lang w:val="sv-SE"/>
-              </w:rPr>
-              <w:t>ö</w:t>
-            </w:r>
-            <w:r>
-              <w:rPr>
-                <w:rStyle w:val="Hyperlink"/>
-                <w:noProof/>
-                <w:lang w:val="sv-SE"/>
-              </w:rPr>
-              <w:t>rdelar</w:t>
+          <w:hyperlink w:anchor="_Toc215126466" w:history="1">
+            <w:r>
+              <w:rPr>
+                <w:rStyle w:val="Hyperlink"/>
+                <w:noProof/>
+                <w:lang w:val="sv-SE"/>
+              </w:rPr>
+              <w:t>5. Roller</w:t>
             </w:r>
             <w:r>
               <w:rPr>
@@ -685,7 +1063,7 @@
                 <w:noProof/>
                 <w:webHidden/>
               </w:rPr>
-              <w:instrText xml:space="preserve"> PAGEREF _Toc215041202 \h </w:instrText>
+              <w:instrText xml:space="preserve"> PAGEREF _Toc215126466 \h </w:instrText>
             </w:r>
             <w:r>
               <w:rPr>
@@ -730,14 +1108,31 @@
               <w:lang w:val="en-SE" w:eastAsia="en-SE"/>
             </w:rPr>
           </w:pPr>
-          <w:hyperlink w:anchor="_Toc215041203" w:history="1">
-            <w:r>
-              <w:rPr>
-                <w:rStyle w:val="Hyperlink"/>
-                <w:noProof/>
-                <w:lang w:val="sv-SE"/>
-              </w:rPr>
-              <w:t>7. Scenario</w:t>
+          <w:hyperlink w:anchor="_Toc215126467" w:history="1">
+            <w:r>
+              <w:rPr>
+                <w:rStyle w:val="Hyperlink"/>
+                <w:noProof/>
+                <w:lang w:val="sv-SE"/>
+              </w:rPr>
+              <w:t>6. F</w:t>
+            </w:r>
+            <w:r>
+              <w:rPr>
+                <w:rStyle w:val="Hyperlink"/>
+                <w:rFonts w:hint="eastAsia"/>
+                <w:noProof/>
+                <w:lang w:val="sv-SE"/>
+              </w:rPr>
+              <w:t>ö</w:t>
+            </w:r>
+            <w:r>
+              <w:rPr>
+                <w:rStyle w:val="Hyperlink"/>
+                <w:noProof/>
+                <w:lang w:val="sv-SE"/>
+              </w:rPr>
+              <w:t>rdelar</w:t>
             </w:r>
             <w:r>
               <w:rPr>
@@ -758,7 +1153,7 @@
                 <w:noProof/>
                 <w:webHidden/>
               </w:rPr>
-              <w:instrText xml:space="preserve"> PAGEREF _Toc215041203 \h </w:instrText>
+              <w:instrText xml:space="preserve"> PAGEREF _Toc215126467 \h </w:instrText>
             </w:r>
             <w:r>
               <w:rPr>
@@ -803,7 +1198,80 @@
               <w:lang w:val="en-SE" w:eastAsia="en-SE"/>
             </w:rPr>
           </w:pPr>
-          <w:hyperlink w:anchor="_Toc215041204" w:history="1">
+          <w:hyperlink w:anchor="_Toc215126468" w:history="1">
+            <w:r>
+              <w:rPr>
+                <w:rStyle w:val="Hyperlink"/>
+                <w:noProof/>
+                <w:lang w:val="sv-SE"/>
+              </w:rPr>
+              <w:t>7. Scenario</w:t>
+            </w:r>
+            <w:r>
+              <w:rPr>
+                <w:noProof/>
+                <w:webHidden/>
+              </w:rPr>
+              <w:tab/>
+            </w:r>
+            <w:r>
+              <w:rPr>
+                <w:noProof/>
+                <w:webHidden/>
+              </w:rPr>
+              <w:fldChar w:fldCharType="begin"/>
+            </w:r>
+            <w:r>
+              <w:rPr>
+                <w:noProof/>
+                <w:webHidden/>
+              </w:rPr>
+              <w:instrText xml:space="preserve"> PAGEREF _Toc215126468 \h </w:instrText>
+            </w:r>
+            <w:r>
+              <w:rPr>
+                <w:noProof/>
+                <w:webHidden/>
+              </w:rPr>
+            </w:r>
+            <w:r>
+              <w:rPr>
+                <w:noProof/>
+                <w:webHidden/>
+              </w:rPr>
+              <w:fldChar w:fldCharType="separate"/>
+            </w:r>
+            <w:r>
+              <w:rPr>
+                <w:noProof/>
+                <w:webHidden/>
+              </w:rPr>
+              <w:t>2</w:t>
+            </w:r>
+            <w:r>
+              <w:rPr>
+                <w:noProof/>
+                <w:webHidden/>
+              </w:rPr>
+              <w:fldChar w:fldCharType="end"/>
+            </w:r>
+          </w:hyperlink>
+        </w:p>
+        <w:p>
+          <w:pPr>
+            <w:pStyle w:val="TOC2"/>
+            <w:tabs>
+              <w:tab w:val="right" w:leader="dot" w:pos="9016"/>
+            </w:tabs>
+            <w:rPr>
+              <w:rFonts w:eastAsiaTheme="minorEastAsia"/>
+              <w:noProof/>
+              <w:sz w:val="24"/>
+              <w:szCs w:val="24"/>
+              <w:lang w:val="en-SE" w:eastAsia="en-SE"/>
+            </w:rPr>
+          </w:pPr>
+          <w:hyperlink w:anchor="_Toc215126469" w:history="1">
             <w:r>
               <w:rPr>
                 <w:rStyle w:val="Hyperlink"/>
@@ -831,7 +1299,7 @@
                 <w:noProof/>
                 <w:webHidden/>
               </w:rPr>
-              <w:instrText xml:space="preserve"> PAGEREF _Toc215041204 \h </w:instrText>
+              <w:instrText xml:space="preserve"> PAGEREF _Toc215126469 \h </w:instrText>
             </w:r>
             <w:r>
               <w:rPr>
@@ -851,7 +1319,80 @@
                 <w:noProof/>
                 <w:webHidden/>
               </w:rPr>
-              <w:t>2</w:t>
+              <w:t>3</w:t>
+            </w:r>
+            <w:r>
+              <w:rPr>
+                <w:noProof/>
+                <w:webHidden/>
+              </w:rPr>
+              <w:fldChar w:fldCharType="end"/>
+            </w:r>
+          </w:hyperlink>
+        </w:p>
+        <w:p>
+          <w:pPr>
+            <w:pStyle w:val="TOC2"/>
+            <w:tabs>
+              <w:tab w:val="right" w:leader="dot" w:pos="9016"/>
+            </w:tabs>
+            <w:rPr>
+              <w:rFonts w:eastAsiaTheme="minorEastAsia"/>
+              <w:noProof/>
+              <w:sz w:val="24"/>
+              <w:szCs w:val="24"/>
+              <w:lang w:val="en-SE" w:eastAsia="en-SE"/>
+            </w:rPr>
+          </w:pPr>
+          <w:hyperlink w:anchor="_Toc215126470" w:history="1">
+            <w:r>
+              <w:rPr>
+                <w:rStyle w:val="Hyperlink"/>
+                <w:noProof/>
+                <w:lang w:val="sv-SE"/>
+              </w:rPr>
+              <w:t>X. Referenser</w:t>
+            </w:r>
+            <w:r>
+              <w:rPr>
+                <w:noProof/>
+                <w:webHidden/>
+              </w:rPr>
+              <w:tab/>
+            </w:r>
+            <w:r>
+              <w:rPr>
+                <w:noProof/>
+                <w:webHidden/>
+              </w:rPr>
+              <w:fldChar w:fldCharType="begin"/>
+            </w:r>
+            <w:r>
+              <w:rPr>
+                <w:noProof/>
+                <w:webHidden/>
+              </w:rPr>
+              <w:instrText xml:space="preserve"> PAGEREF _Toc215126470 \h </w:instrText>
+            </w:r>
+            <w:r>
+              <w:rPr>
+                <w:noProof/>
+                <w:webHidden/>
+              </w:rPr>
+            </w:r>
+            <w:r>
+              <w:rPr>
+                <w:noProof/>
+                <w:webHidden/>
+              </w:rPr>
+              <w:fldChar w:fldCharType="separate"/>
+            </w:r>
+            <w:r>
+              <w:rPr>
+                <w:noProof/>
+                <w:webHidden/>
+              </w:rPr>
+              <w:t>3</w:t>
             </w:r>
             <w:r>
               <w:rPr>
@@ -888,7 +1429,7 @@
           <w:lang w:val="sv-SE"/>
         </w:rPr>
       </w:pPr>
-      <w:bookmarkStart w:id="0" w:name="_Toc215041196"/>
+      <w:bookmarkStart w:id="0" w:name="_Toc215126456"/>
       <w:r>
         <w:rPr>
           <w:lang w:val="sv-SE"/>
@@ -911,12 +1452,14 @@
           <w:lang w:val="sv-SE"/>
         </w:rPr>
       </w:pPr>
+      <w:bookmarkStart w:id="1" w:name="_Toc215126457"/>
       <w:r>
         <w:rPr>
           <w:lang w:val="sv-SE"/>
         </w:rPr>
         <w:t>0. Introduktion</w:t>
       </w:r>
+      <w:bookmarkEnd w:id="1"/>
     </w:p>
     <w:p>
       <w:pPr>
@@ -1062,14 +1605,188 @@
           <w:lang w:val="sv-SE"/>
         </w:rPr>
       </w:pPr>
-      <w:bookmarkStart w:id="1" w:name="_Toc215041197"/>
-      <w:r>
-        <w:rPr>
-          <w:lang w:val="sv-SE"/>
-        </w:rPr>
-        <w:t>1. Syfte</w:t>
-      </w:r>
-      <w:bookmarkEnd w:id="1"/>
+      <w:bookmarkStart w:id="2" w:name="_Toc215126458"/>
+      <w:r>
+        <w:rPr>
+          <w:lang w:val="sv-SE"/>
+        </w:rPr>
+        <w:lastRenderedPageBreak/>
+        <w:t xml:space="preserve">1. </w:t>
+      </w:r>
+      <w:r>
+        <w:rPr>
+          <w:lang w:val="sv-SE"/>
+        </w:rPr>
+        <w:t>Verktyg – syfte och funktion</w:t>
+      </w:r>
+      <w:bookmarkEnd w:id="2"/>
+    </w:p>
+    <w:p>
+      <w:pPr>
+        <w:rPr>
+          <w:rFonts w:ascii="Calibri" w:hAnsi="Calibri" w:cs="Calibri"/>
+          <w:sz w:val="24"/>
+          <w:szCs w:val="24"/>
+          <w:lang w:val="sv-SE"/>
+        </w:rPr>
+      </w:pPr>
+      <w:r>
+        <w:rPr>
+          <w:rFonts w:ascii="Calibri" w:hAnsi="Calibri" w:cs="Calibri"/>
+          <w:sz w:val="24"/>
+          <w:szCs w:val="24"/>
+          <w:lang w:val="sv-SE"/>
+        </w:rPr>
+        <w:t xml:space="preserve">Detta projekt har en bred portfölj av verktyg i verktygslådan, </w:t>
+      </w:r>
+      <w:r>
+        <w:rPr>
+          <w:rFonts w:ascii="Calibri" w:hAnsi="Calibri" w:cs="Calibri"/>
+          <w:sz w:val="24"/>
+          <w:szCs w:val="24"/>
+          <w:lang w:val="sv-SE"/>
+        </w:rPr>
+        <w:t>de presenteras nedan i olika avsnitt baserade på vilket område de tillhör.</w:t>
+      </w:r>
+    </w:p>
+    <w:p>
+      <w:pPr>
+        <w:pStyle w:val="Heading3"/>
+        <w:rPr>
+          <w:lang w:val="sv-SE"/>
+        </w:rPr>
+      </w:pPr>
+      <w:bookmarkStart w:id="3" w:name="_Toc215126459"/>
+      <w:r>
+        <w:rPr>
+          <w:lang w:val="sv-SE"/>
+        </w:rPr>
+        <w:t>1.1 Verktygslåda – Azure</w:t>
+      </w:r>
+      <w:bookmarkEnd w:id="3"/>
+    </w:p>
+    <w:p>
+      <w:pPr>
+        <w:rPr>
+          <w:rFonts w:ascii="Calibri" w:hAnsi="Calibri" w:cs="Calibri"/>
+          <w:sz w:val="24"/>
+          <w:szCs w:val="24"/>
+          <w:lang w:val="sv-SE"/>
+        </w:rPr>
+      </w:pPr>
+      <w:r>
+        <w:rPr>
+          <w:rFonts w:ascii="Calibri" w:hAnsi="Calibri" w:cs="Calibri"/>
+          <w:sz w:val="24"/>
+          <w:szCs w:val="24"/>
+          <w:lang w:val="sv-SE"/>
+        </w:rPr>
+        <w:t>Presentation av</w:t>
+      </w:r>
+    </w:p>
+    <w:p>
+      <w:pPr>
+        <w:pStyle w:val="Heading3"/>
+        <w:rPr>
+          <w:lang w:val="sv-SE"/>
+        </w:rPr>
+      </w:pPr>
+      <w:bookmarkStart w:id="4" w:name="_Toc215126460"/>
+      <w:r>
+        <w:rPr>
+          <w:lang w:val="sv-SE"/>
+        </w:rPr>
+        <w:t>1.2 Verktygslåda - .NET</w:t>
+      </w:r>
+      <w:bookmarkEnd w:id="4"/>
+    </w:p>
+    <w:p>
+      <w:pPr>
+        <w:rPr>
+          <w:rFonts w:ascii="Calibri" w:hAnsi="Calibri" w:cs="Calibri"/>
+          <w:sz w:val="24"/>
+          <w:szCs w:val="24"/>
+          <w:lang w:val="sv-SE"/>
+        </w:rPr>
+      </w:pPr>
+      <w:r>
+        <w:rPr>
+          <w:rFonts w:ascii="Calibri" w:hAnsi="Calibri" w:cs="Calibri"/>
+          <w:sz w:val="24"/>
+          <w:szCs w:val="24"/>
+          <w:lang w:val="sv-SE"/>
+        </w:rPr>
+        <w:t>Presentation av</w:t>
+      </w:r>
+    </w:p>
+    <w:p>
+      <w:pPr>
+        <w:pStyle w:val="Heading3"/>
+        <w:rPr>
+          <w:lang w:val="sv-SE"/>
+        </w:rPr>
+      </w:pPr>
+      <w:bookmarkStart w:id="5" w:name="_Toc215126461"/>
+      <w:r>
+        <w:rPr>
+          <w:lang w:val="sv-SE"/>
+        </w:rPr>
+        <w:t xml:space="preserve">1.3 Verktygslåda </w:t>
+      </w:r>
+      <w:r>
+        <w:rPr>
+          <w:lang w:val="sv-SE"/>
+        </w:rPr>
+        <w:t>–</w:t>
+      </w:r>
+      <w:r>
+        <w:rPr>
+          <w:lang w:val="sv-SE"/>
+        </w:rPr>
+        <w:t xml:space="preserve"> </w:t>
+      </w:r>
+      <w:r>
+        <w:rPr>
+          <w:lang w:val="sv-SE"/>
+        </w:rPr>
+        <w:t>IaC-verktyg</w:t>
+      </w:r>
+      <w:bookmarkEnd w:id="5"/>
+    </w:p>
+    <w:p>
+      <w:pPr>
+        <w:rPr>
+          <w:rFonts w:ascii="Calibri" w:hAnsi="Calibri" w:cs="Calibri"/>
+          <w:sz w:val="24"/>
+          <w:szCs w:val="24"/>
+          <w:lang w:val="sv-SE"/>
+        </w:rPr>
+      </w:pPr>
+      <w:r>
+        <w:rPr>
+          <w:rFonts w:ascii="Calibri" w:hAnsi="Calibri" w:cs="Calibri"/>
+          <w:sz w:val="24"/>
+          <w:szCs w:val="24"/>
+          <w:lang w:val="sv-SE"/>
+        </w:rPr>
+        <w:t>Presentation av</w:t>
+      </w:r>
+    </w:p>
+    <w:p>
+      <w:pPr>
+        <w:pStyle w:val="Heading3"/>
+        <w:rPr>
+          <w:lang w:val="sv-SE"/>
+        </w:rPr>
+      </w:pPr>
+      <w:bookmarkStart w:id="6" w:name="_Toc215126462"/>
+      <w:r>
+        <w:rPr>
+          <w:lang w:val="sv-SE"/>
+        </w:rPr>
+        <w:t>1.X Verktygslåda – Programkritiskt verktyg, dess syfte och funktion</w:t>
+      </w:r>
+      <w:bookmarkEnd w:id="6"/>
     </w:p>
     <w:p>
       <w:pPr>
@@ -1104,14 +1821,14 @@
           <w:lang w:val="sv-SE"/>
         </w:rPr>
       </w:pPr>
-      <w:bookmarkStart w:id="2" w:name="_Toc215041198"/>
+      <w:bookmarkStart w:id="7" w:name="_Toc215126463"/>
       <w:r>
         <w:rPr>
           <w:lang w:val="sv-SE"/>
         </w:rPr>
         <w:t>2. Målgrupp</w:t>
       </w:r>
-      <w:bookmarkEnd w:id="2"/>
+      <w:bookmarkEnd w:id="7"/>
     </w:p>
     <w:p>
       <w:pPr>
@@ -1146,33 +1863,243 @@
           <w:lang w:val="sv-SE"/>
         </w:rPr>
       </w:pPr>
-      <w:bookmarkStart w:id="3" w:name="_Toc215041199"/>
+      <w:bookmarkStart w:id="8" w:name="_Toc215126464"/>
+      <w:r>
+        <w:rPr>
+          <w:lang w:val="sv-SE"/>
+        </w:rPr>
+        <w:t>3. Översikt</w:t>
+      </w:r>
+      <w:bookmarkEnd w:id="8"/>
+    </w:p>
+    <w:p>
+      <w:pPr>
+        <w:rPr>
+          <w:rFonts w:ascii="Calibri" w:hAnsi="Calibri" w:cs="Calibri"/>
+          <w:sz w:val="24"/>
+          <w:szCs w:val="24"/>
+          <w:lang w:val="sv-SE"/>
+        </w:rPr>
+      </w:pPr>
+      <w:r>
+        <w:rPr>
+          <w:rFonts w:ascii="Calibri" w:hAnsi="Calibri" w:cs="Calibri"/>
+          <w:sz w:val="24"/>
+          <w:szCs w:val="24"/>
+          <w:lang w:val="sv-SE"/>
+        </w:rPr>
+        <w:t>Ge en lättöverskådlig sammanfattning av verktygets funktioner.</w:t>
+      </w:r>
+    </w:p>
+    <w:p>
+      <w:pPr>
+        <w:rPr>
+          <w:lang w:val="sv-SE"/>
+        </w:rPr>
+      </w:pPr>
+    </w:p>
+    <w:p>
+      <w:pPr>
+        <w:pStyle w:val="Heading2"/>
+        <w:rPr>
+          <w:lang w:val="sv-SE"/>
+        </w:rPr>
+      </w:pPr>
+      <w:bookmarkStart w:id="9" w:name="_Toc215126465"/>
+      <w:r>
+        <w:rPr>
+          <w:lang w:val="sv-SE"/>
+        </w:rPr>
+        <w:t>4. Huvudfunktioner</w:t>
+      </w:r>
+      <w:bookmarkEnd w:id="9"/>
+    </w:p>
+    <w:p>
+      <w:pPr>
+        <w:rPr>
+          <w:rFonts w:ascii="Calibri" w:hAnsi="Calibri" w:cs="Calibri"/>
+          <w:sz w:val="24"/>
+          <w:szCs w:val="24"/>
+          <w:lang w:val="sv-SE"/>
+        </w:rPr>
+      </w:pPr>
+      <w:r>
+        <w:rPr>
+          <w:rFonts w:ascii="Calibri" w:hAnsi="Calibri" w:cs="Calibri"/>
+          <w:sz w:val="24"/>
+          <w:szCs w:val="24"/>
+          <w:lang w:val="sv-SE"/>
+        </w:rPr>
+        <w:t>Beskriv funktionerna utan tekniska detaljer.</w:t>
+      </w:r>
+    </w:p>
+    <w:p>
+      <w:pPr>
+        <w:rPr>
+          <w:lang w:val="sv-SE"/>
+        </w:rPr>
+      </w:pPr>
+    </w:p>
+    <w:p>
+      <w:pPr>
+        <w:pStyle w:val="Heading2"/>
+        <w:rPr>
+          <w:lang w:val="sv-SE"/>
+        </w:rPr>
+      </w:pPr>
+      <w:bookmarkStart w:id="10" w:name="_Toc215126466"/>
+      <w:r>
+        <w:rPr>
+          <w:lang w:val="sv-SE"/>
+        </w:rPr>
+        <w:t>5. Roller</w:t>
+      </w:r>
+      <w:bookmarkEnd w:id="10"/>
+    </w:p>
+    <w:p>
+      <w:pPr>
+        <w:rPr>
+          <w:rFonts w:ascii="Calibri" w:hAnsi="Calibri" w:cs="Calibri"/>
+          <w:sz w:val="24"/>
+          <w:szCs w:val="24"/>
+          <w:lang w:val="sv-SE"/>
+        </w:rPr>
+      </w:pPr>
+      <w:r>
+        <w:rPr>
+          <w:rFonts w:ascii="Calibri" w:hAnsi="Calibri" w:cs="Calibri"/>
+          <w:sz w:val="24"/>
+          <w:szCs w:val="24"/>
+          <w:lang w:val="sv-SE"/>
+        </w:rPr>
+        <w:t>Beskriv användarroller på ett enkelt och tydligt sätt.</w:t>
+      </w:r>
+    </w:p>
+    <w:p>
+      <w:pPr>
+        <w:rPr>
+          <w:lang w:val="sv-SE"/>
+        </w:rPr>
+      </w:pPr>
+    </w:p>
+    <w:p>
+      <w:pPr>
+        <w:pStyle w:val="Heading2"/>
+        <w:rPr>
+          <w:lang w:val="sv-SE"/>
+        </w:rPr>
+      </w:pPr>
+      <w:bookmarkStart w:id="11" w:name="_Toc215126467"/>
+      <w:r>
+        <w:rPr>
+          <w:lang w:val="sv-SE"/>
+        </w:rPr>
+        <w:t>6. Fördelar</w:t>
+      </w:r>
+      <w:bookmarkEnd w:id="11"/>
+    </w:p>
+    <w:p>
+      <w:pPr>
+        <w:rPr>
+          <w:rFonts w:ascii="Calibri" w:hAnsi="Calibri" w:cs="Calibri"/>
+          <w:sz w:val="24"/>
+          <w:szCs w:val="24"/>
+          <w:lang w:val="sv-SE"/>
+        </w:rPr>
+      </w:pPr>
+      <w:r>
+        <w:rPr>
+          <w:rFonts w:ascii="Calibri" w:hAnsi="Calibri" w:cs="Calibri"/>
+          <w:sz w:val="24"/>
+          <w:szCs w:val="24"/>
+          <w:lang w:val="sv-SE"/>
+        </w:rPr>
+        <w:t>Sammanfatta nyttan och konkreta vinster för användaren.</w:t>
+      </w:r>
+    </w:p>
+    <w:p>
+      <w:pPr>
+        <w:rPr>
+          <w:lang w:val="sv-SE"/>
+        </w:rPr>
+      </w:pPr>
+    </w:p>
+    <w:p>
+      <w:pPr>
+        <w:pStyle w:val="Heading2"/>
+        <w:rPr>
+          <w:lang w:val="sv-SE"/>
+        </w:rPr>
+      </w:pPr>
+      <w:bookmarkStart w:id="12" w:name="_Toc215126468"/>
+      <w:r>
+        <w:rPr>
+          <w:lang w:val="sv-SE"/>
+        </w:rPr>
+        <w:t>7. Scenario</w:t>
+      </w:r>
+      <w:bookmarkEnd w:id="12"/>
+    </w:p>
+    <w:p>
+      <w:pPr>
+        <w:rPr>
+          <w:rFonts w:ascii="Calibri" w:hAnsi="Calibri" w:cs="Calibri"/>
+          <w:sz w:val="24"/>
+          <w:szCs w:val="24"/>
+          <w:lang w:val="sv-SE"/>
+        </w:rPr>
+      </w:pPr>
+      <w:r>
+        <w:rPr>
+          <w:rFonts w:ascii="Calibri" w:hAnsi="Calibri" w:cs="Calibri"/>
+          <w:sz w:val="24"/>
+          <w:szCs w:val="24"/>
+          <w:lang w:val="sv-SE"/>
+        </w:rPr>
+        <w:t>Ge ett verklighetsnära exempel på hur verktyget används.</w:t>
+      </w:r>
+    </w:p>
+    <w:p>
+      <w:pPr>
+        <w:rPr>
+          <w:lang w:val="sv-SE"/>
+        </w:rPr>
+      </w:pPr>
+    </w:p>
+    <w:p>
+      <w:pPr>
+        <w:pStyle w:val="Heading2"/>
+        <w:rPr>
+          <w:lang w:val="sv-SE"/>
+        </w:rPr>
+      </w:pPr>
+      <w:bookmarkStart w:id="13" w:name="_Toc215126469"/>
       <w:r>
         <w:rPr>
           <w:lang w:val="sv-SE"/>
         </w:rPr>
         <w:lastRenderedPageBreak/>
-        <w:t>3. Översikt</w:t>
-      </w:r>
-      <w:bookmarkEnd w:id="3"/>
-    </w:p>
-    <w:p>
-      <w:pPr>
-        <w:rPr>
-          <w:rFonts w:ascii="Calibri" w:hAnsi="Calibri" w:cs="Calibri"/>
-          <w:sz w:val="24"/>
-          <w:szCs w:val="24"/>
-          <w:lang w:val="sv-SE"/>
-        </w:rPr>
-      </w:pPr>
-      <w:r>
-        <w:rPr>
-          <w:rFonts w:ascii="Calibri" w:hAnsi="Calibri" w:cs="Calibri"/>
-          <w:sz w:val="24"/>
-          <w:szCs w:val="24"/>
-          <w:lang w:val="sv-SE"/>
-        </w:rPr>
-        <w:t>Ge en lättöverskådlig sammanfattning av verktygets funktioner.</w:t>
+        <w:t>8. Sammanfattning</w:t>
+      </w:r>
+      <w:bookmarkEnd w:id="13"/>
+    </w:p>
+    <w:p>
+      <w:pPr>
+        <w:rPr>
+          <w:rFonts w:ascii="Calibri" w:hAnsi="Calibri" w:cs="Calibri"/>
+          <w:sz w:val="24"/>
+          <w:szCs w:val="24"/>
+          <w:lang w:val="sv-SE"/>
+        </w:rPr>
+      </w:pPr>
+      <w:r>
+        <w:rPr>
+          <w:rFonts w:ascii="Calibri" w:hAnsi="Calibri" w:cs="Calibri"/>
+          <w:sz w:val="24"/>
+          <w:szCs w:val="24"/>
+          <w:lang w:val="sv-SE"/>
+        </w:rPr>
+        <w:t>Knyt ihop helheten kort och tydligt.</w:t>
       </w:r>
     </w:p>
     <w:p>
@@ -1189,216 +2116,7 @@
           <w:lang w:val="sv-SE"/>
         </w:rPr>
       </w:pPr>
-      <w:bookmarkStart w:id="4" w:name="_Toc215041200"/>
-      <w:r>
-        <w:rPr>
-          <w:lang w:val="sv-SE"/>
-        </w:rPr>
-        <w:t>4. Huvudfunktioner</w:t>
-      </w:r>
-      <w:bookmarkEnd w:id="4"/>
-    </w:p>
-    <w:p>
-      <w:pPr>
-        <w:rPr>
-          <w:rFonts w:ascii="Calibri" w:hAnsi="Calibri" w:cs="Calibri"/>
-          <w:sz w:val="24"/>
-          <w:szCs w:val="24"/>
-          <w:lang w:val="sv-SE"/>
-        </w:rPr>
-      </w:pPr>
-      <w:r>
-        <w:rPr>
-          <w:rFonts w:ascii="Calibri" w:hAnsi="Calibri" w:cs="Calibri"/>
-          <w:sz w:val="24"/>
-          <w:szCs w:val="24"/>
-          <w:lang w:val="sv-SE"/>
-        </w:rPr>
-        <w:t>Beskriv funktionerna utan tekniska detaljer.</w:t>
-      </w:r>
-    </w:p>
-    <w:p>
-      <w:pPr>
-        <w:rPr>
-          <w:lang w:val="sv-SE"/>
-        </w:rPr>
-      </w:pPr>
-    </w:p>
-    <w:p>
-      <w:pPr>
-        <w:pStyle w:val="Heading2"/>
-        <w:rPr>
-          <w:lang w:val="sv-SE"/>
-        </w:rPr>
-      </w:pPr>
-      <w:bookmarkStart w:id="5" w:name="_Toc215041201"/>
-      <w:r>
-        <w:rPr>
-          <w:lang w:val="sv-SE"/>
-        </w:rPr>
-        <w:t>5. Roller</w:t>
-      </w:r>
-      <w:bookmarkEnd w:id="5"/>
-    </w:p>
-    <w:p>
-      <w:pPr>
-        <w:rPr>
-          <w:rFonts w:ascii="Calibri" w:hAnsi="Calibri" w:cs="Calibri"/>
-          <w:sz w:val="24"/>
-          <w:szCs w:val="24"/>
-          <w:lang w:val="sv-SE"/>
-        </w:rPr>
-      </w:pPr>
-      <w:r>
-        <w:rPr>
-          <w:rFonts w:ascii="Calibri" w:hAnsi="Calibri" w:cs="Calibri"/>
-          <w:sz w:val="24"/>
-          <w:szCs w:val="24"/>
-          <w:lang w:val="sv-SE"/>
-        </w:rPr>
-        <w:t>Beskriv användarroller på ett enkelt och tydligt sätt.</w:t>
-      </w:r>
-    </w:p>
-    <w:p>
-      <w:pPr>
-        <w:rPr>
-          <w:lang w:val="sv-SE"/>
-        </w:rPr>
-      </w:pPr>
-    </w:p>
-    <w:p>
-      <w:pPr>
-        <w:pStyle w:val="Heading2"/>
-        <w:rPr>
-          <w:lang w:val="sv-SE"/>
-        </w:rPr>
-      </w:pPr>
-      <w:bookmarkStart w:id="6" w:name="_Toc215041202"/>
-      <w:r>
-        <w:rPr>
-          <w:lang w:val="sv-SE"/>
-        </w:rPr>
-        <w:t>6. Fördelar</w:t>
-      </w:r>
-      <w:bookmarkEnd w:id="6"/>
-    </w:p>
-    <w:p>
-      <w:pPr>
-        <w:rPr>
-          <w:rFonts w:ascii="Calibri" w:hAnsi="Calibri" w:cs="Calibri"/>
-          <w:sz w:val="24"/>
-          <w:szCs w:val="24"/>
-          <w:lang w:val="sv-SE"/>
-        </w:rPr>
-      </w:pPr>
-      <w:r>
-        <w:rPr>
-          <w:rFonts w:ascii="Calibri" w:hAnsi="Calibri" w:cs="Calibri"/>
-          <w:sz w:val="24"/>
-          <w:szCs w:val="24"/>
-          <w:lang w:val="sv-SE"/>
-        </w:rPr>
-        <w:t>Sammanfatta nyttan och konkreta vinster för användaren.</w:t>
-      </w:r>
-    </w:p>
-    <w:p>
-      <w:pPr>
-        <w:rPr>
-          <w:lang w:val="sv-SE"/>
-        </w:rPr>
-      </w:pPr>
-    </w:p>
-    <w:p>
-      <w:pPr>
-        <w:pStyle w:val="Heading2"/>
-        <w:rPr>
-          <w:lang w:val="sv-SE"/>
-        </w:rPr>
-      </w:pPr>
-      <w:bookmarkStart w:id="7" w:name="_Toc215041203"/>
-      <w:r>
-        <w:rPr>
-          <w:lang w:val="sv-SE"/>
-        </w:rPr>
-        <w:t>7. Scenario</w:t>
-      </w:r>
-      <w:bookmarkEnd w:id="7"/>
-    </w:p>
-    <w:p>
-      <w:pPr>
-        <w:rPr>
-          <w:rFonts w:ascii="Calibri" w:hAnsi="Calibri" w:cs="Calibri"/>
-          <w:sz w:val="24"/>
-          <w:szCs w:val="24"/>
-          <w:lang w:val="sv-SE"/>
-        </w:rPr>
-      </w:pPr>
-      <w:r>
-        <w:rPr>
-          <w:rFonts w:ascii="Calibri" w:hAnsi="Calibri" w:cs="Calibri"/>
-          <w:sz w:val="24"/>
-          <w:szCs w:val="24"/>
-          <w:lang w:val="sv-SE"/>
-        </w:rPr>
-        <w:t>Ge ett verklighetsnära exempel på hur verktyget används.</w:t>
-      </w:r>
-    </w:p>
-    <w:p>
-      <w:pPr>
-        <w:rPr>
-          <w:lang w:val="sv-SE"/>
-        </w:rPr>
-      </w:pPr>
-    </w:p>
-    <w:p>
-      <w:pPr>
-        <w:pStyle w:val="Heading2"/>
-        <w:rPr>
-          <w:lang w:val="sv-SE"/>
-        </w:rPr>
-      </w:pPr>
-      <w:bookmarkStart w:id="8" w:name="_Toc215041204"/>
-      <w:r>
-        <w:rPr>
-          <w:lang w:val="sv-SE"/>
-        </w:rPr>
-        <w:t>8. Sammanfattning</w:t>
-      </w:r>
-      <w:bookmarkEnd w:id="8"/>
-    </w:p>
-    <w:p>
-      <w:pPr>
-        <w:rPr>
-          <w:rFonts w:ascii="Calibri" w:hAnsi="Calibri" w:cs="Calibri"/>
-          <w:sz w:val="24"/>
-          <w:szCs w:val="24"/>
-          <w:lang w:val="sv-SE"/>
-        </w:rPr>
-      </w:pPr>
-      <w:r>
-        <w:rPr>
-          <w:rFonts w:ascii="Calibri" w:hAnsi="Calibri" w:cs="Calibri"/>
-          <w:sz w:val="24"/>
-          <w:szCs w:val="24"/>
-          <w:lang w:val="sv-SE"/>
-        </w:rPr>
-        <w:t>Knyt ihop helheten kort och tydligt.</w:t>
-      </w:r>
-    </w:p>
-    <w:p>
-      <w:pPr>
-        <w:rPr>
-          <w:lang w:val="sv-SE"/>
-        </w:rPr>
-      </w:pPr>
-    </w:p>
-    <w:p>
-      <w:pPr>
-        <w:pStyle w:val="Heading2"/>
-        <w:rPr>
-          <w:lang w:val="sv-SE"/>
-        </w:rPr>
-      </w:pPr>
+      <w:bookmarkStart w:id="14" w:name="_Toc215126470"/>
       <w:r>
         <w:rPr>
           <w:lang w:val="sv-SE"/>
@@ -1411,6 +2129,7 @@
         </w:rPr>
         <w:t>Referenser</w:t>
       </w:r>
+      <w:bookmarkEnd w:id="14"/>
     </w:p>
     <w:p>
       <w:pPr>
@@ -1894,7 +2613,6 @@
     <w:next w:val="Normal"/>
     <w:link w:val="Heading3Char"/>
     <w:uiPriority w:val="9"/>
-    <w:semiHidden/>
     <w:unhideWhenUsed/>
     <w:qFormat/>
     <w:rsid w:val="005B01D2"/>
@@ -2103,7 +2821,6 @@
     <w:basedOn w:val="DefaultParagraphFont"/>
     <w:link w:val="Heading3"/>
     <w:uiPriority w:val="9"/>
-    <w:semiHidden/>
     <w:rsid w:val="005B01D2"/>
     <w:rPr>
       <w:rFonts w:eastAsiaTheme="majorEastAsia" w:cstheme="majorBidi"/>
@@ -2439,6 +3156,19 @@
       <w:color w:val="605E5C"/>
       <w:shd w:val="clear" w:color="auto" w:fill="E1DFDD"/>
     </w:rPr>
+  </w:style>
+  <w:style w:type="paragraph" w:styleId="TOC3">
+    <w:name w:val="toc 3"/>
+    <w:basedOn w:val="Normal"/>
+    <w:next w:val="Normal"/>
+    <w:autoRedefine/>
+    <w:uiPriority w:val="39"/>
+    <w:unhideWhenUsed/>
+    <w:rsid w:val="00A3521F"/>
+    <w:pPr>
+      <w:spacing w:after="100"/>
+      <w:ind w:left="440"/>
+    </w:pPr>
   </w:style>
 </w:styles>
 </file>

</xml_diff>

<commit_message>
Refactor: Updated documentation to reflect changes after implementing feature flags
</commit_message>
<xml_diff>
--- a/docs/school_related/verktygspresentation_clo24nikhal.docx
+++ b/docs/school_related/verktygspresentation_clo24nikhal.docx
@@ -151,14 +151,14 @@
           <w:r>
             <w:fldChar w:fldCharType="separate"/>
           </w:r>
-          <w:hyperlink w:anchor="_Toc215126456" w:history="1">
+          <w:hyperlink w:anchor="_Toc215137004" w:history="1">
             <w:r>
               <w:rPr>
                 <w:rStyle w:val="Hyperlink"/>
                 <w:noProof/>
                 <w:lang w:val="sv-SE"/>
               </w:rPr>
-              <w:t>Verktygspresentation</w:t>
+              <w:t>Verktyg-/projektspresentation</w:t>
             </w:r>
             <w:r>
               <w:rPr>
@@ -179,7 +179,7 @@
                 <w:noProof/>
                 <w:webHidden/>
               </w:rPr>
-              <w:instrText xml:space="preserve"> PAGEREF _Toc215126456 \h </w:instrText>
+              <w:instrText xml:space="preserve"> PAGEREF _Toc215137004 \h </w:instrText>
             </w:r>
             <w:r>
               <w:rPr>
@@ -224,7 +224,7 @@
               <w:lang w:val="en-SE" w:eastAsia="en-SE"/>
             </w:rPr>
           </w:pPr>
-          <w:hyperlink w:anchor="_Toc215126457" w:history="1">
+          <w:hyperlink w:anchor="_Toc215137005" w:history="1">
             <w:r>
               <w:rPr>
                 <w:rStyle w:val="Hyperlink"/>
@@ -252,7 +252,7 @@
                 <w:noProof/>
                 <w:webHidden/>
               </w:rPr>
-              <w:instrText xml:space="preserve"> PAGEREF _Toc215126457 \h </w:instrText>
+              <w:instrText xml:space="preserve"> PAGEREF _Toc215137005 \h </w:instrText>
             </w:r>
             <w:r>
               <w:rPr>
@@ -297,31 +297,14 @@
               <w:lang w:val="en-SE" w:eastAsia="en-SE"/>
             </w:rPr>
           </w:pPr>
-          <w:hyperlink w:anchor="_Toc215126458" w:history="1">
+          <w:hyperlink w:anchor="_Toc215137006" w:history="1">
             <w:r>
               <w:rPr>
                 <w:rStyle w:val="Hyperlink"/>
                 <w:noProof/>
                 <w:lang w:val="sv-SE"/>
               </w:rPr>
-              <w:t xml:space="preserve">1. Verktyg </w:t>
-            </w:r>
-            <w:r>
-              <w:rPr>
-                <w:rStyle w:val="Hyperlink"/>
-                <w:rFonts w:hint="eastAsia"/>
-                <w:noProof/>
-                <w:lang w:val="sv-SE"/>
-              </w:rPr>
-              <w:t>–</w:t>
-            </w:r>
-            <w:r>
-              <w:rPr>
-                <w:rStyle w:val="Hyperlink"/>
-                <w:noProof/>
-                <w:lang w:val="sv-SE"/>
-              </w:rPr>
-              <w:t xml:space="preserve"> syfte och funktion</w:t>
+              <w:t>1. Projektets syfte och funktion</w:t>
             </w:r>
             <w:r>
               <w:rPr>
@@ -342,7 +325,7 @@
                 <w:noProof/>
                 <w:webHidden/>
               </w:rPr>
-              <w:instrText xml:space="preserve"> PAGEREF _Toc215126458 \h </w:instrText>
+              <w:instrText xml:space="preserve"> PAGEREF _Toc215137006 \h </w:instrText>
             </w:r>
             <w:r>
               <w:rPr>
@@ -362,402 +345,7 @@
                 <w:noProof/>
                 <w:webHidden/>
               </w:rPr>
-              <w:t>2</w:t>
-            </w:r>
-            <w:r>
-              <w:rPr>
-                <w:noProof/>
-                <w:webHidden/>
-              </w:rPr>
-              <w:fldChar w:fldCharType="end"/>
-            </w:r>
-          </w:hyperlink>
-        </w:p>
-        <w:p>
-          <w:pPr>
-            <w:pStyle w:val="TOC3"/>
-            <w:tabs>
-              <w:tab w:val="right" w:leader="dot" w:pos="9016"/>
-            </w:tabs>
-            <w:rPr>
-              <w:noProof/>
-            </w:rPr>
-          </w:pPr>
-          <w:hyperlink w:anchor="_Toc215126459" w:history="1">
-            <w:r>
-              <w:rPr>
-                <w:rStyle w:val="Hyperlink"/>
-                <w:noProof/>
-                <w:lang w:val="sv-SE"/>
-              </w:rPr>
-              <w:t>1.1 Verktygsl</w:t>
-            </w:r>
-            <w:r>
-              <w:rPr>
-                <w:rStyle w:val="Hyperlink"/>
-                <w:rFonts w:hint="eastAsia"/>
-                <w:noProof/>
-                <w:lang w:val="sv-SE"/>
-              </w:rPr>
-              <w:t>å</w:t>
-            </w:r>
-            <w:r>
-              <w:rPr>
-                <w:rStyle w:val="Hyperlink"/>
-                <w:noProof/>
-                <w:lang w:val="sv-SE"/>
-              </w:rPr>
-              <w:t xml:space="preserve">da </w:t>
-            </w:r>
-            <w:r>
-              <w:rPr>
-                <w:rStyle w:val="Hyperlink"/>
-                <w:rFonts w:hint="eastAsia"/>
-                <w:noProof/>
-                <w:lang w:val="sv-SE"/>
-              </w:rPr>
-              <w:t>–</w:t>
-            </w:r>
-            <w:r>
-              <w:rPr>
-                <w:rStyle w:val="Hyperlink"/>
-                <w:noProof/>
-                <w:lang w:val="sv-SE"/>
-              </w:rPr>
-              <w:t xml:space="preserve"> Azure</w:t>
-            </w:r>
-            <w:r>
-              <w:rPr>
-                <w:noProof/>
-                <w:webHidden/>
-              </w:rPr>
-              <w:tab/>
-            </w:r>
-            <w:r>
-              <w:rPr>
-                <w:noProof/>
-                <w:webHidden/>
-              </w:rPr>
-              <w:fldChar w:fldCharType="begin"/>
-            </w:r>
-            <w:r>
-              <w:rPr>
-                <w:noProof/>
-                <w:webHidden/>
-              </w:rPr>
-              <w:instrText xml:space="preserve"> PAGEREF _Toc215126459 \h </w:instrText>
-            </w:r>
-            <w:r>
-              <w:rPr>
-                <w:noProof/>
-                <w:webHidden/>
-              </w:rPr>
-            </w:r>
-            <w:r>
-              <w:rPr>
-                <w:noProof/>
-                <w:webHidden/>
-              </w:rPr>
-              <w:fldChar w:fldCharType="separate"/>
-            </w:r>
-            <w:r>
-              <w:rPr>
-                <w:noProof/>
-                <w:webHidden/>
-              </w:rPr>
-              <w:t>2</w:t>
-            </w:r>
-            <w:r>
-              <w:rPr>
-                <w:noProof/>
-                <w:webHidden/>
-              </w:rPr>
-              <w:fldChar w:fldCharType="end"/>
-            </w:r>
-          </w:hyperlink>
-        </w:p>
-        <w:p>
-          <w:pPr>
-            <w:pStyle w:val="TOC3"/>
-            <w:tabs>
-              <w:tab w:val="right" w:leader="dot" w:pos="9016"/>
-            </w:tabs>
-            <w:rPr>
-              <w:noProof/>
-            </w:rPr>
-          </w:pPr>
-          <w:hyperlink w:anchor="_Toc215126460" w:history="1">
-            <w:r>
-              <w:rPr>
-                <w:rStyle w:val="Hyperlink"/>
-                <w:noProof/>
-                <w:lang w:val="sv-SE"/>
-              </w:rPr>
-              <w:t>1.2 Verktygsl</w:t>
-            </w:r>
-            <w:r>
-              <w:rPr>
-                <w:rStyle w:val="Hyperlink"/>
-                <w:rFonts w:hint="eastAsia"/>
-                <w:noProof/>
-                <w:lang w:val="sv-SE"/>
-              </w:rPr>
-              <w:t>å</w:t>
-            </w:r>
-            <w:r>
-              <w:rPr>
-                <w:rStyle w:val="Hyperlink"/>
-                <w:noProof/>
-                <w:lang w:val="sv-SE"/>
-              </w:rPr>
-              <w:t>da - .NET</w:t>
-            </w:r>
-            <w:r>
-              <w:rPr>
-                <w:noProof/>
-                <w:webHidden/>
-              </w:rPr>
-              <w:tab/>
-            </w:r>
-            <w:r>
-              <w:rPr>
-                <w:noProof/>
-                <w:webHidden/>
-              </w:rPr>
-              <w:fldChar w:fldCharType="begin"/>
-            </w:r>
-            <w:r>
-              <w:rPr>
-                <w:noProof/>
-                <w:webHidden/>
-              </w:rPr>
-              <w:instrText xml:space="preserve"> PAGEREF _Toc215126460 \h </w:instrText>
-            </w:r>
-            <w:r>
-              <w:rPr>
-                <w:noProof/>
-                <w:webHidden/>
-              </w:rPr>
-            </w:r>
-            <w:r>
-              <w:rPr>
-                <w:noProof/>
-                <w:webHidden/>
-              </w:rPr>
-              <w:fldChar w:fldCharType="separate"/>
-            </w:r>
-            <w:r>
-              <w:rPr>
-                <w:noProof/>
-                <w:webHidden/>
-              </w:rPr>
-              <w:t>2</w:t>
-            </w:r>
-            <w:r>
-              <w:rPr>
-                <w:noProof/>
-                <w:webHidden/>
-              </w:rPr>
-              <w:fldChar w:fldCharType="end"/>
-            </w:r>
-          </w:hyperlink>
-        </w:p>
-        <w:p>
-          <w:pPr>
-            <w:pStyle w:val="TOC3"/>
-            <w:tabs>
-              <w:tab w:val="right" w:leader="dot" w:pos="9016"/>
-            </w:tabs>
-            <w:rPr>
-              <w:noProof/>
-            </w:rPr>
-          </w:pPr>
-          <w:hyperlink w:anchor="_Toc215126461" w:history="1">
-            <w:r>
-              <w:rPr>
-                <w:rStyle w:val="Hyperlink"/>
-                <w:noProof/>
-                <w:lang w:val="sv-SE"/>
-              </w:rPr>
-              <w:t>1.3 Verktygsl</w:t>
-            </w:r>
-            <w:r>
-              <w:rPr>
-                <w:rStyle w:val="Hyperlink"/>
-                <w:rFonts w:hint="eastAsia"/>
-                <w:noProof/>
-                <w:lang w:val="sv-SE"/>
-              </w:rPr>
-              <w:t>å</w:t>
-            </w:r>
-            <w:r>
-              <w:rPr>
-                <w:rStyle w:val="Hyperlink"/>
-                <w:noProof/>
-                <w:lang w:val="sv-SE"/>
-              </w:rPr>
-              <w:t xml:space="preserve">da </w:t>
-            </w:r>
-            <w:r>
-              <w:rPr>
-                <w:rStyle w:val="Hyperlink"/>
-                <w:rFonts w:hint="eastAsia"/>
-                <w:noProof/>
-                <w:lang w:val="sv-SE"/>
-              </w:rPr>
-              <w:t>–</w:t>
-            </w:r>
-            <w:r>
-              <w:rPr>
-                <w:rStyle w:val="Hyperlink"/>
-                <w:noProof/>
-                <w:lang w:val="sv-SE"/>
-              </w:rPr>
-              <w:t xml:space="preserve"> IaC-verktyg</w:t>
-            </w:r>
-            <w:r>
-              <w:rPr>
-                <w:noProof/>
-                <w:webHidden/>
-              </w:rPr>
-              <w:tab/>
-            </w:r>
-            <w:r>
-              <w:rPr>
-                <w:noProof/>
-                <w:webHidden/>
-              </w:rPr>
-              <w:fldChar w:fldCharType="begin"/>
-            </w:r>
-            <w:r>
-              <w:rPr>
-                <w:noProof/>
-                <w:webHidden/>
-              </w:rPr>
-              <w:instrText xml:space="preserve"> PAGEREF _Toc215126461 \h </w:instrText>
-            </w:r>
-            <w:r>
-              <w:rPr>
-                <w:noProof/>
-                <w:webHidden/>
-              </w:rPr>
-            </w:r>
-            <w:r>
-              <w:rPr>
-                <w:noProof/>
-                <w:webHidden/>
-              </w:rPr>
-              <w:fldChar w:fldCharType="separate"/>
-            </w:r>
-            <w:r>
-              <w:rPr>
-                <w:noProof/>
-                <w:webHidden/>
-              </w:rPr>
-              <w:t>2</w:t>
-            </w:r>
-            <w:r>
-              <w:rPr>
-                <w:noProof/>
-                <w:webHidden/>
-              </w:rPr>
-              <w:fldChar w:fldCharType="end"/>
-            </w:r>
-          </w:hyperlink>
-        </w:p>
-        <w:p>
-          <w:pPr>
-            <w:pStyle w:val="TOC3"/>
-            <w:tabs>
-              <w:tab w:val="right" w:leader="dot" w:pos="9016"/>
-            </w:tabs>
-            <w:rPr>
-              <w:noProof/>
-            </w:rPr>
-          </w:pPr>
-          <w:hyperlink w:anchor="_Toc215126462" w:history="1">
-            <w:r>
-              <w:rPr>
-                <w:rStyle w:val="Hyperlink"/>
-                <w:noProof/>
-                <w:lang w:val="sv-SE"/>
-              </w:rPr>
-              <w:t>1.X Verktygsl</w:t>
-            </w:r>
-            <w:r>
-              <w:rPr>
-                <w:rStyle w:val="Hyperlink"/>
-                <w:rFonts w:hint="eastAsia"/>
-                <w:noProof/>
-                <w:lang w:val="sv-SE"/>
-              </w:rPr>
-              <w:t>å</w:t>
-            </w:r>
-            <w:r>
-              <w:rPr>
-                <w:rStyle w:val="Hyperlink"/>
-                <w:noProof/>
-                <w:lang w:val="sv-SE"/>
-              </w:rPr>
-              <w:t xml:space="preserve">da </w:t>
-            </w:r>
-            <w:r>
-              <w:rPr>
-                <w:rStyle w:val="Hyperlink"/>
-                <w:rFonts w:hint="eastAsia"/>
-                <w:noProof/>
-                <w:lang w:val="sv-SE"/>
-              </w:rPr>
-              <w:t>–</w:t>
-            </w:r>
-            <w:r>
-              <w:rPr>
-                <w:rStyle w:val="Hyperlink"/>
-                <w:noProof/>
-                <w:lang w:val="sv-SE"/>
-              </w:rPr>
-              <w:t xml:space="preserve"> Programkritiskt verktyg, dess syfte och funktion</w:t>
-            </w:r>
-            <w:r>
-              <w:rPr>
-                <w:noProof/>
-                <w:webHidden/>
-              </w:rPr>
-              <w:tab/>
-            </w:r>
-            <w:r>
-              <w:rPr>
-                <w:noProof/>
-                <w:webHidden/>
-              </w:rPr>
-              <w:fldChar w:fldCharType="begin"/>
-            </w:r>
-            <w:r>
-              <w:rPr>
-                <w:noProof/>
-                <w:webHidden/>
-              </w:rPr>
-              <w:instrText xml:space="preserve"> PAGEREF _Toc215126462 \h </w:instrText>
-            </w:r>
-            <w:r>
-              <w:rPr>
-                <w:noProof/>
-                <w:webHidden/>
-              </w:rPr>
-            </w:r>
-            <w:r>
-              <w:rPr>
-                <w:noProof/>
-                <w:webHidden/>
-              </w:rPr>
-              <w:fldChar w:fldCharType="separate"/>
-            </w:r>
-            <w:r>
-              <w:rPr>
-                <w:noProof/>
-                <w:webHidden/>
-              </w:rPr>
-              <w:t>2</w:t>
+              <w:t>1</w:t>
             </w:r>
             <w:r>
               <w:rPr>
@@ -782,7 +370,7 @@
               <w:lang w:val="en-SE" w:eastAsia="en-SE"/>
             </w:rPr>
           </w:pPr>
-          <w:hyperlink w:anchor="_Toc215126463" w:history="1">
+          <w:hyperlink w:anchor="_Toc215137007" w:history="1">
             <w:r>
               <w:rPr>
                 <w:rStyle w:val="Hyperlink"/>
@@ -827,7 +415,7 @@
                 <w:noProof/>
                 <w:webHidden/>
               </w:rPr>
-              <w:instrText xml:space="preserve"> PAGEREF _Toc215126463 \h </w:instrText>
+              <w:instrText xml:space="preserve"> PAGEREF _Toc215137007 \h </w:instrText>
             </w:r>
             <w:r>
               <w:rPr>
@@ -872,7 +460,7 @@
               <w:lang w:val="en-SE" w:eastAsia="en-SE"/>
             </w:rPr>
           </w:pPr>
-          <w:hyperlink w:anchor="_Toc215126464" w:history="1">
+          <w:hyperlink w:anchor="_Toc215137008" w:history="1">
             <w:r>
               <w:rPr>
                 <w:rStyle w:val="Hyperlink"/>
@@ -917,7 +505,7 @@
                 <w:noProof/>
                 <w:webHidden/>
               </w:rPr>
-              <w:instrText xml:space="preserve"> PAGEREF _Toc215126464 \h </w:instrText>
+              <w:instrText xml:space="preserve"> PAGEREF _Toc215137008 \h </w:instrText>
             </w:r>
             <w:r>
               <w:rPr>
@@ -962,7 +550,7 @@
               <w:lang w:val="en-SE" w:eastAsia="en-SE"/>
             </w:rPr>
           </w:pPr>
-          <w:hyperlink w:anchor="_Toc215126465" w:history="1">
+          <w:hyperlink w:anchor="_Toc215137009" w:history="1">
             <w:r>
               <w:rPr>
                 <w:rStyle w:val="Hyperlink"/>
@@ -990,7 +578,7 @@
                 <w:noProof/>
                 <w:webHidden/>
               </w:rPr>
-              <w:instrText xml:space="preserve"> PAGEREF _Toc215126465 \h </w:instrText>
+              <w:instrText xml:space="preserve"> PAGEREF _Toc215137009 \h </w:instrText>
             </w:r>
             <w:r>
               <w:rPr>
@@ -1035,7 +623,7 @@
               <w:lang w:val="en-SE" w:eastAsia="en-SE"/>
             </w:rPr>
           </w:pPr>
-          <w:hyperlink w:anchor="_Toc215126466" w:history="1">
+          <w:hyperlink w:anchor="_Toc215137010" w:history="1">
             <w:r>
               <w:rPr>
                 <w:rStyle w:val="Hyperlink"/>
@@ -1063,7 +651,7 @@
                 <w:noProof/>
                 <w:webHidden/>
               </w:rPr>
-              <w:instrText xml:space="preserve"> PAGEREF _Toc215126466 \h </w:instrText>
+              <w:instrText xml:space="preserve"> PAGEREF _Toc215137010 \h </w:instrText>
             </w:r>
             <w:r>
               <w:rPr>
@@ -1108,7 +696,7 @@
               <w:lang w:val="en-SE" w:eastAsia="en-SE"/>
             </w:rPr>
           </w:pPr>
-          <w:hyperlink w:anchor="_Toc215126467" w:history="1">
+          <w:hyperlink w:anchor="_Toc215137011" w:history="1">
             <w:r>
               <w:rPr>
                 <w:rStyle w:val="Hyperlink"/>
@@ -1153,7 +741,7 @@
                 <w:noProof/>
                 <w:webHidden/>
               </w:rPr>
-              <w:instrText xml:space="preserve"> PAGEREF _Toc215126467 \h </w:instrText>
+              <w:instrText xml:space="preserve"> PAGEREF _Toc215137011 \h </w:instrText>
             </w:r>
             <w:r>
               <w:rPr>
@@ -1198,7 +786,7 @@
               <w:lang w:val="en-SE" w:eastAsia="en-SE"/>
             </w:rPr>
           </w:pPr>
-          <w:hyperlink w:anchor="_Toc215126468" w:history="1">
+          <w:hyperlink w:anchor="_Toc215137012" w:history="1">
             <w:r>
               <w:rPr>
                 <w:rStyle w:val="Hyperlink"/>
@@ -1226,7 +814,7 @@
                 <w:noProof/>
                 <w:webHidden/>
               </w:rPr>
-              <w:instrText xml:space="preserve"> PAGEREF _Toc215126468 \h </w:instrText>
+              <w:instrText xml:space="preserve"> PAGEREF _Toc215137012 \h </w:instrText>
             </w:r>
             <w:r>
               <w:rPr>
@@ -1271,7 +859,7 @@
               <w:lang w:val="en-SE" w:eastAsia="en-SE"/>
             </w:rPr>
           </w:pPr>
-          <w:hyperlink w:anchor="_Toc215126469" w:history="1">
+          <w:hyperlink w:anchor="_Toc215137013" w:history="1">
             <w:r>
               <w:rPr>
                 <w:rStyle w:val="Hyperlink"/>
@@ -1299,7 +887,7 @@
                 <w:noProof/>
                 <w:webHidden/>
               </w:rPr>
-              <w:instrText xml:space="preserve"> PAGEREF _Toc215126469 \h </w:instrText>
+              <w:instrText xml:space="preserve"> PAGEREF _Toc215137013 \h </w:instrText>
             </w:r>
             <w:r>
               <w:rPr>
@@ -1319,7 +907,7 @@
                 <w:noProof/>
                 <w:webHidden/>
               </w:rPr>
-              <w:t>3</w:t>
+              <w:t>2</w:t>
             </w:r>
             <w:r>
               <w:rPr>
@@ -1344,7 +932,7 @@
               <w:lang w:val="en-SE" w:eastAsia="en-SE"/>
             </w:rPr>
           </w:pPr>
-          <w:hyperlink w:anchor="_Toc215126470" w:history="1">
+          <w:hyperlink w:anchor="_Toc215137014" w:history="1">
             <w:r>
               <w:rPr>
                 <w:rStyle w:val="Hyperlink"/>
@@ -1372,7 +960,7 @@
                 <w:noProof/>
                 <w:webHidden/>
               </w:rPr>
-              <w:instrText xml:space="preserve"> PAGEREF _Toc215126470 \h </w:instrText>
+              <w:instrText xml:space="preserve"> PAGEREF _Toc215137014 \h </w:instrText>
             </w:r>
             <w:r>
               <w:rPr>
@@ -1392,7 +980,7 @@
                 <w:noProof/>
                 <w:webHidden/>
               </w:rPr>
-              <w:t>3</w:t>
+              <w:t>2</w:t>
             </w:r>
             <w:r>
               <w:rPr>
@@ -1429,14 +1017,34 @@
           <w:lang w:val="sv-SE"/>
         </w:rPr>
       </w:pPr>
-      <w:bookmarkStart w:id="0" w:name="_Toc215126456"/>
-      <w:r>
-        <w:rPr>
-          <w:lang w:val="sv-SE"/>
-        </w:rPr>
-        <w:t>Verktygspresentation</w:t>
+      <w:bookmarkStart w:id="0" w:name="_Toc215137004"/>
+      <w:r>
+        <w:rPr>
+          <w:lang w:val="sv-SE"/>
+        </w:rPr>
+        <w:t>Verkt</w:t>
+      </w:r>
+      <w:r>
+        <w:rPr>
+          <w:lang w:val="sv-SE"/>
+        </w:rPr>
+        <w:t>yg-/</w:t>
+      </w:r>
+      <w:proofErr w:type="spellStart"/>
+      <w:r>
+        <w:rPr>
+          <w:lang w:val="sv-SE"/>
+        </w:rPr>
+        <w:t>projekt</w:t>
+      </w:r>
+      <w:r>
+        <w:rPr>
+          <w:lang w:val="sv-SE"/>
+        </w:rPr>
+        <w:t>spresentation</w:t>
       </w:r>
       <w:bookmarkEnd w:id="0"/>
+      <w:proofErr w:type="spellEnd"/>
     </w:p>
     <w:p>
       <w:pPr>
@@ -1452,7 +1060,7 @@
           <w:lang w:val="sv-SE"/>
         </w:rPr>
       </w:pPr>
-      <w:bookmarkStart w:id="1" w:name="_Toc215126457"/>
+      <w:bookmarkStart w:id="1" w:name="_Toc215137005"/>
       <w:r>
         <w:rPr>
           <w:lang w:val="sv-SE"/>
@@ -1526,7 +1134,27 @@
           <w:szCs w:val="24"/>
           <w:lang w:val="sv-SE"/>
         </w:rPr>
-        <w:t xml:space="preserve"> som återfinns i foldern docs. En hel del är teknisk presentation på engelska, men det finns en del mer lättviktigt material som förklarar syfte och kontext. Kan rekommendera följande:</w:t>
+        <w:t xml:space="preserve"> som återfinns i foldern </w:t>
+      </w:r>
+      <w:proofErr w:type="spellStart"/>
+      <w:r>
+        <w:rPr>
+          <w:rFonts w:ascii="Calibri" w:hAnsi="Calibri" w:cs="Calibri"/>
+          <w:sz w:val="24"/>
+          <w:szCs w:val="24"/>
+          <w:lang w:val="sv-SE"/>
+        </w:rPr>
+        <w:t>docs</w:t>
+      </w:r>
+      <w:proofErr w:type="spellEnd"/>
+      <w:r>
+        <w:rPr>
+          <w:rFonts w:ascii="Calibri" w:hAnsi="Calibri" w:cs="Calibri"/>
+          <w:sz w:val="24"/>
+          <w:szCs w:val="24"/>
+          <w:lang w:val="sv-SE"/>
+        </w:rPr>
+        <w:t>. En hel del är teknisk presentation på engelska, men det finns en del mer lättviktigt material som förklarar syfte och kontext. Kan rekommendera följande:</w:t>
       </w:r>
     </w:p>
     <w:p>
@@ -1539,6 +1167,7 @@
         </w:rPr>
       </w:pPr>
       <w:hyperlink r:id="rId6" w:history="1">
+        <w:proofErr w:type="spellStart"/>
         <w:r>
           <w:rPr>
             <w:rStyle w:val="Hyperlink"/>
@@ -1549,6 +1178,7 @@
           </w:rPr>
           <w:t>Glossary</w:t>
         </w:r>
+        <w:proofErr w:type="spellEnd"/>
       </w:hyperlink>
       <w:r>
         <w:rPr>
@@ -1605,19 +1235,24 @@
           <w:lang w:val="sv-SE"/>
         </w:rPr>
       </w:pPr>
-      <w:bookmarkStart w:id="2" w:name="_Toc215126458"/>
-      <w:r>
-        <w:rPr>
-          <w:lang w:val="sv-SE"/>
-        </w:rPr>
-        <w:lastRenderedPageBreak/>
+      <w:bookmarkStart w:id="2" w:name="_Toc215137006"/>
+      <w:r>
+        <w:rPr>
+          <w:lang w:val="sv-SE"/>
+        </w:rPr>
         <w:t xml:space="preserve">1. </w:t>
       </w:r>
       <w:r>
         <w:rPr>
           <w:lang w:val="sv-SE"/>
         </w:rPr>
-        <w:t>Verktyg – syfte och funktion</w:t>
+        <w:t>Projektets</w:t>
+      </w:r>
+      <w:r>
+        <w:rPr>
+          <w:lang w:val="sv-SE"/>
+        </w:rPr>
+        <w:t xml:space="preserve"> syfte och funktion</w:t>
       </w:r>
       <w:bookmarkEnd w:id="2"/>
     </w:p>
@@ -1637,31 +1272,109 @@
           <w:szCs w:val="24"/>
           <w:lang w:val="sv-SE"/>
         </w:rPr>
-        <w:t xml:space="preserve">Detta projekt har en bred portfölj av verktyg i verktygslådan, </w:t>
-      </w:r>
-      <w:r>
-        <w:rPr>
-          <w:rFonts w:ascii="Calibri" w:hAnsi="Calibri" w:cs="Calibri"/>
-          <w:sz w:val="24"/>
-          <w:szCs w:val="24"/>
-          <w:lang w:val="sv-SE"/>
-        </w:rPr>
-        <w:t>de presenteras nedan i olika avsnitt baserade på vilket område de tillhör.</w:t>
-      </w:r>
-    </w:p>
-    <w:p>
-      <w:pPr>
-        <w:pStyle w:val="Heading3"/>
-        <w:rPr>
-          <w:lang w:val="sv-SE"/>
-        </w:rPr>
-      </w:pPr>
-      <w:bookmarkStart w:id="3" w:name="_Toc215126459"/>
-      <w:r>
-        <w:rPr>
-          <w:lang w:val="sv-SE"/>
-        </w:rPr>
-        <w:t>1.1 Verktygslåda – Azure</w:t>
+        <w:t xml:space="preserve">Kunden har idag en applikation där ett äldre och ett nyare system fungerar sida vid sida. Vissa verktyg har </w:t>
+      </w:r>
+      <w:proofErr w:type="spellStart"/>
+      <w:r>
+        <w:rPr>
+          <w:rFonts w:ascii="Calibri" w:hAnsi="Calibri" w:cs="Calibri"/>
+          <w:sz w:val="24"/>
+          <w:szCs w:val="24"/>
+          <w:lang w:val="sv-SE"/>
+        </w:rPr>
+        <w:t>refaktorerats</w:t>
+      </w:r>
+      <w:proofErr w:type="spellEnd"/>
+      <w:r>
+        <w:rPr>
+          <w:rFonts w:ascii="Calibri" w:hAnsi="Calibri" w:cs="Calibri"/>
+          <w:sz w:val="24"/>
+          <w:szCs w:val="24"/>
+          <w:lang w:val="sv-SE"/>
+        </w:rPr>
+        <w:t xml:space="preserve"> och integrerats i det nya verktyget, </w:t>
+      </w:r>
+      <w:proofErr w:type="gramStart"/>
+      <w:r>
+        <w:rPr>
+          <w:rFonts w:ascii="Calibri" w:hAnsi="Calibri" w:cs="Calibri"/>
+          <w:sz w:val="24"/>
+          <w:szCs w:val="24"/>
+          <w:lang w:val="sv-SE"/>
+        </w:rPr>
+        <w:t>medans</w:t>
+      </w:r>
+      <w:proofErr w:type="gramEnd"/>
+      <w:r>
+        <w:rPr>
+          <w:rFonts w:ascii="Calibri" w:hAnsi="Calibri" w:cs="Calibri"/>
+          <w:sz w:val="24"/>
+          <w:szCs w:val="24"/>
+          <w:lang w:val="sv-SE"/>
+        </w:rPr>
+        <w:t xml:space="preserve"> andra lever kvar i det äldre. På grund av det så arbetar kunden i dagsläget i två system, samtidigt.</w:t>
+      </w:r>
+    </w:p>
+    <w:p>
+      <w:pPr>
+        <w:rPr>
+          <w:rFonts w:ascii="Calibri" w:hAnsi="Calibri" w:cs="Calibri"/>
+          <w:sz w:val="24"/>
+          <w:szCs w:val="24"/>
+          <w:lang w:val="sv-SE"/>
+        </w:rPr>
+      </w:pPr>
+      <w:r>
+        <w:rPr>
+          <w:rFonts w:ascii="Calibri" w:hAnsi="Calibri" w:cs="Calibri"/>
+          <w:sz w:val="24"/>
+          <w:szCs w:val="24"/>
+          <w:lang w:val="sv-SE"/>
+        </w:rPr>
+        <w:t>Mål</w:t>
+      </w:r>
+      <w:r>
+        <w:rPr>
+          <w:rFonts w:ascii="Calibri" w:hAnsi="Calibri" w:cs="Calibri"/>
+          <w:sz w:val="24"/>
+          <w:szCs w:val="24"/>
+          <w:lang w:val="sv-SE"/>
+        </w:rPr>
+        <w:t>et</w:t>
+      </w:r>
+      <w:r>
+        <w:rPr>
+          <w:rFonts w:ascii="Calibri" w:hAnsi="Calibri" w:cs="Calibri"/>
+          <w:sz w:val="24"/>
+          <w:szCs w:val="24"/>
+          <w:lang w:val="sv-SE"/>
+        </w:rPr>
+        <w:t xml:space="preserve"> med detta projekt är att skapa ett verktyg för att kunna hantera båda systemen inom samma flöde, och ha verktyg för att successivt kunna flytta över funktionalitet från det gamla till det nya systemet.</w:t>
+      </w:r>
+    </w:p>
+    <w:p>
+      <w:pPr>
+        <w:rPr>
+          <w:rFonts w:ascii="Calibri" w:hAnsi="Calibri" w:cs="Calibri"/>
+          <w:sz w:val="24"/>
+          <w:szCs w:val="24"/>
+          <w:lang w:val="sv-SE"/>
+        </w:rPr>
+      </w:pPr>
+    </w:p>
+    <w:p>
+      <w:pPr>
+        <w:pStyle w:val="Heading2"/>
+        <w:rPr>
+          <w:lang w:val="sv-SE"/>
+        </w:rPr>
+      </w:pPr>
+      <w:bookmarkStart w:id="3" w:name="_Toc215137007"/>
+      <w:r>
+        <w:rPr>
+          <w:lang w:val="sv-SE"/>
+        </w:rPr>
+        <w:t>2. Målgrupp</w:t>
       </w:r>
       <w:bookmarkEnd w:id="3"/>
     </w:p>
@@ -1681,22 +1394,86 @@
           <w:szCs w:val="24"/>
           <w:lang w:val="sv-SE"/>
         </w:rPr>
-        <w:t>Presentation av</w:t>
-      </w:r>
-    </w:p>
-    <w:p>
-      <w:pPr>
-        <w:pStyle w:val="Heading3"/>
-        <w:rPr>
-          <w:lang w:val="sv-SE"/>
-        </w:rPr>
-      </w:pPr>
-      <w:bookmarkStart w:id="4" w:name="_Toc215126460"/>
-      <w:r>
-        <w:rPr>
-          <w:lang w:val="sv-SE"/>
-        </w:rPr>
-        <w:t>1.2 Verktygslåda - .NET</w:t>
+        <w:t xml:space="preserve">Verktyget är </w:t>
+      </w:r>
+      <w:r>
+        <w:rPr>
+          <w:rFonts w:ascii="Calibri" w:hAnsi="Calibri" w:cs="Calibri"/>
+          <w:sz w:val="24"/>
+          <w:szCs w:val="24"/>
+          <w:lang w:val="sv-SE"/>
+        </w:rPr>
+        <w:t>framför allt</w:t>
+      </w:r>
+      <w:r>
+        <w:rPr>
+          <w:rFonts w:ascii="Calibri" w:hAnsi="Calibri" w:cs="Calibri"/>
+          <w:sz w:val="24"/>
+          <w:szCs w:val="24"/>
+          <w:lang w:val="sv-SE"/>
+        </w:rPr>
+        <w:t xml:space="preserve"> till för utvecklare som i dagsläget använder båda systemen samtidigt. Användare av kundens applikation ser inte vilket systemet de använder, men utvecklare har en miljö där de byter mellan systemen.</w:t>
+      </w:r>
+    </w:p>
+    <w:p>
+      <w:pPr>
+        <w:rPr>
+          <w:rFonts w:ascii="Calibri" w:hAnsi="Calibri" w:cs="Calibri"/>
+          <w:sz w:val="24"/>
+          <w:szCs w:val="24"/>
+          <w:lang w:val="sv-SE"/>
+        </w:rPr>
+      </w:pPr>
+      <w:r>
+        <w:rPr>
+          <w:rFonts w:ascii="Calibri" w:hAnsi="Calibri" w:cs="Calibri"/>
+          <w:sz w:val="24"/>
+          <w:szCs w:val="24"/>
+          <w:lang w:val="sv-SE"/>
+        </w:rPr>
+        <w:t xml:space="preserve">Tanken är att utvecklarna skall kunna använda detta projekts verktyg genom att knyta ihop de två systemen, kunna </w:t>
+      </w:r>
+      <w:proofErr w:type="spellStart"/>
+      <w:r>
+        <w:rPr>
+          <w:rFonts w:ascii="Calibri" w:hAnsi="Calibri" w:cs="Calibri"/>
+          <w:sz w:val="24"/>
+          <w:szCs w:val="24"/>
+          <w:lang w:val="sv-SE"/>
+        </w:rPr>
+        <w:t>refaktorera</w:t>
+      </w:r>
+      <w:proofErr w:type="spellEnd"/>
+      <w:r>
+        <w:rPr>
+          <w:rFonts w:ascii="Calibri" w:hAnsi="Calibri" w:cs="Calibri"/>
+          <w:sz w:val="24"/>
+          <w:szCs w:val="24"/>
+          <w:lang w:val="sv-SE"/>
+        </w:rPr>
+        <w:t xml:space="preserve"> kod från det gamla systemet och successivt föra över funktionalitet till det nya, utan att behöva ta ner huvudapplikationen.</w:t>
+      </w:r>
+    </w:p>
+    <w:p>
+      <w:pPr>
+        <w:rPr>
+          <w:lang w:val="sv-SE"/>
+        </w:rPr>
+      </w:pPr>
+    </w:p>
+    <w:p>
+      <w:pPr>
+        <w:pStyle w:val="Heading2"/>
+        <w:rPr>
+          <w:lang w:val="sv-SE"/>
+        </w:rPr>
+      </w:pPr>
+      <w:bookmarkStart w:id="4" w:name="_Toc215137008"/>
+      <w:r>
+        <w:rPr>
+          <w:lang w:val="sv-SE"/>
+        </w:rPr>
+        <w:t>3. Översikt</w:t>
       </w:r>
       <w:bookmarkEnd w:id="4"/>
     </w:p>
@@ -1716,40 +1493,29 @@
           <w:szCs w:val="24"/>
           <w:lang w:val="sv-SE"/>
         </w:rPr>
-        <w:t>Presentation av</w:t>
-      </w:r>
-    </w:p>
-    <w:p>
-      <w:pPr>
-        <w:pStyle w:val="Heading3"/>
-        <w:rPr>
-          <w:lang w:val="sv-SE"/>
-        </w:rPr>
-      </w:pPr>
-      <w:bookmarkStart w:id="5" w:name="_Toc215126461"/>
-      <w:r>
-        <w:rPr>
-          <w:lang w:val="sv-SE"/>
-        </w:rPr>
-        <w:t xml:space="preserve">1.3 Verktygslåda </w:t>
-      </w:r>
-      <w:r>
-        <w:rPr>
-          <w:lang w:val="sv-SE"/>
-        </w:rPr>
-        <w:t>–</w:t>
-      </w:r>
-      <w:r>
-        <w:rPr>
-          <w:lang w:val="sv-SE"/>
-        </w:rPr>
-        <w:t xml:space="preserve"> </w:t>
-      </w:r>
-      <w:r>
-        <w:rPr>
-          <w:lang w:val="sv-SE"/>
-        </w:rPr>
-        <w:t>IaC-verktyg</w:t>
+        <w:t>Ge en lättöverskådlig sammanfattning av verktygets funktioner.</w:t>
+      </w:r>
+    </w:p>
+    <w:p>
+      <w:pPr>
+        <w:rPr>
+          <w:lang w:val="sv-SE"/>
+        </w:rPr>
+      </w:pPr>
+    </w:p>
+    <w:p>
+      <w:pPr>
+        <w:pStyle w:val="Heading2"/>
+        <w:rPr>
+          <w:lang w:val="sv-SE"/>
+        </w:rPr>
+      </w:pPr>
+      <w:bookmarkStart w:id="5" w:name="_Toc215137009"/>
+      <w:r>
+        <w:rPr>
+          <w:lang w:val="sv-SE"/>
+        </w:rPr>
+        <w:t>4. Huvudfunktioner</w:t>
       </w:r>
       <w:bookmarkEnd w:id="5"/>
     </w:p>
@@ -1769,22 +1535,29 @@
           <w:szCs w:val="24"/>
           <w:lang w:val="sv-SE"/>
         </w:rPr>
-        <w:t>Presentation av</w:t>
-      </w:r>
-    </w:p>
-    <w:p>
-      <w:pPr>
-        <w:pStyle w:val="Heading3"/>
-        <w:rPr>
-          <w:lang w:val="sv-SE"/>
-        </w:rPr>
-      </w:pPr>
-      <w:bookmarkStart w:id="6" w:name="_Toc215126462"/>
-      <w:r>
-        <w:rPr>
-          <w:lang w:val="sv-SE"/>
-        </w:rPr>
-        <w:t>1.X Verktygslåda – Programkritiskt verktyg, dess syfte och funktion</w:t>
+        <w:t>Beskriv funktionerna utan tekniska detaljer.</w:t>
+      </w:r>
+    </w:p>
+    <w:p>
+      <w:pPr>
+        <w:rPr>
+          <w:lang w:val="sv-SE"/>
+        </w:rPr>
+      </w:pPr>
+    </w:p>
+    <w:p>
+      <w:pPr>
+        <w:pStyle w:val="Heading2"/>
+        <w:rPr>
+          <w:lang w:val="sv-SE"/>
+        </w:rPr>
+      </w:pPr>
+      <w:bookmarkStart w:id="6" w:name="_Toc215137010"/>
+      <w:r>
+        <w:rPr>
+          <w:lang w:val="sv-SE"/>
+        </w:rPr>
+        <w:t>5. Roller</w:t>
       </w:r>
       <w:bookmarkEnd w:id="6"/>
     </w:p>
@@ -1804,7 +1577,7 @@
           <w:szCs w:val="24"/>
           <w:lang w:val="sv-SE"/>
         </w:rPr>
-        <w:t>Beskriv vilket behov verktyget löser och varför det skapades.</w:t>
+        <w:t>Beskriv användarroller på ett enkelt och tydligt sätt.</w:t>
       </w:r>
     </w:p>
     <w:p>
@@ -1821,12 +1594,12 @@
           <w:lang w:val="sv-SE"/>
         </w:rPr>
       </w:pPr>
-      <w:bookmarkStart w:id="7" w:name="_Toc215126463"/>
-      <w:r>
-        <w:rPr>
-          <w:lang w:val="sv-SE"/>
-        </w:rPr>
-        <w:t>2. Målgrupp</w:t>
+      <w:bookmarkStart w:id="7" w:name="_Toc215137011"/>
+      <w:r>
+        <w:rPr>
+          <w:lang w:val="sv-SE"/>
+        </w:rPr>
+        <w:t>6. Fördelar</w:t>
       </w:r>
       <w:bookmarkEnd w:id="7"/>
     </w:p>
@@ -1846,7 +1619,7 @@
           <w:szCs w:val="24"/>
           <w:lang w:val="sv-SE"/>
         </w:rPr>
-        <w:t>Definiera vem verktyget riktar sig till och hur de ska använda det.</w:t>
+        <w:t>Sammanfatta nyttan och konkreta vinster för användaren.</w:t>
       </w:r>
     </w:p>
     <w:p>
@@ -1863,12 +1636,12 @@
           <w:lang w:val="sv-SE"/>
         </w:rPr>
       </w:pPr>
-      <w:bookmarkStart w:id="8" w:name="_Toc215126464"/>
-      <w:r>
-        <w:rPr>
-          <w:lang w:val="sv-SE"/>
-        </w:rPr>
-        <w:t>3. Översikt</w:t>
+      <w:bookmarkStart w:id="8" w:name="_Toc215137012"/>
+      <w:r>
+        <w:rPr>
+          <w:lang w:val="sv-SE"/>
+        </w:rPr>
+        <w:t>7. Scenario</w:t>
       </w:r>
       <w:bookmarkEnd w:id="8"/>
     </w:p>
@@ -1888,7 +1661,7 @@
           <w:szCs w:val="24"/>
           <w:lang w:val="sv-SE"/>
         </w:rPr>
-        <w:t>Ge en lättöverskådlig sammanfattning av verktygets funktioner.</w:t>
+        <w:t>Ge ett verklighetsnära exempel på hur verktyget används.</w:t>
       </w:r>
     </w:p>
     <w:p>
@@ -1905,12 +1678,12 @@
           <w:lang w:val="sv-SE"/>
         </w:rPr>
       </w:pPr>
-      <w:bookmarkStart w:id="9" w:name="_Toc215126465"/>
-      <w:r>
-        <w:rPr>
-          <w:lang w:val="sv-SE"/>
-        </w:rPr>
-        <w:t>4. Huvudfunktioner</w:t>
+      <w:bookmarkStart w:id="9" w:name="_Toc215137013"/>
+      <w:r>
+        <w:rPr>
+          <w:lang w:val="sv-SE"/>
+        </w:rPr>
+        <w:t>8. Sammanfattning</w:t>
       </w:r>
       <w:bookmarkEnd w:id="9"/>
     </w:p>
@@ -1930,7 +1703,7 @@
           <w:szCs w:val="24"/>
           <w:lang w:val="sv-SE"/>
         </w:rPr>
-        <w:t>Beskriv funktionerna utan tekniska detaljer.</w:t>
+        <w:t>Knyt ihop helheten kort och tydligt.</w:t>
       </w:r>
     </w:p>
     <w:p>
@@ -1947,12 +1720,18 @@
           <w:lang w:val="sv-SE"/>
         </w:rPr>
       </w:pPr>
-      <w:bookmarkStart w:id="10" w:name="_Toc215126466"/>
-      <w:r>
-        <w:rPr>
-          <w:lang w:val="sv-SE"/>
-        </w:rPr>
-        <w:t>5. Roller</w:t>
+      <w:bookmarkStart w:id="10" w:name="_Toc215137014"/>
+      <w:r>
+        <w:rPr>
+          <w:lang w:val="sv-SE"/>
+        </w:rPr>
+        <w:t xml:space="preserve">X. </w:t>
+      </w:r>
+      <w:r>
+        <w:rPr>
+          <w:lang w:val="sv-SE"/>
+        </w:rPr>
+        <w:t>Referenser</w:t>
       </w:r>
       <w:bookmarkEnd w:id="10"/>
     </w:p>
@@ -1965,181 +1744,7 @@
           <w:lang w:val="sv-SE"/>
         </w:rPr>
       </w:pPr>
-      <w:r>
-        <w:rPr>
-          <w:rFonts w:ascii="Calibri" w:hAnsi="Calibri" w:cs="Calibri"/>
-          <w:sz w:val="24"/>
-          <w:szCs w:val="24"/>
-          <w:lang w:val="sv-SE"/>
-        </w:rPr>
-        <w:t>Beskriv användarroller på ett enkelt och tydligt sätt.</w:t>
-      </w:r>
-    </w:p>
-    <w:p>
-      <w:pPr>
-        <w:rPr>
-          <w:lang w:val="sv-SE"/>
-        </w:rPr>
-      </w:pPr>
-    </w:p>
-    <w:p>
-      <w:pPr>
-        <w:pStyle w:val="Heading2"/>
-        <w:rPr>
-          <w:lang w:val="sv-SE"/>
-        </w:rPr>
-      </w:pPr>
-      <w:bookmarkStart w:id="11" w:name="_Toc215126467"/>
-      <w:r>
-        <w:rPr>
-          <w:lang w:val="sv-SE"/>
-        </w:rPr>
-        <w:t>6. Fördelar</w:t>
-      </w:r>
-      <w:bookmarkEnd w:id="11"/>
-    </w:p>
-    <w:p>
-      <w:pPr>
-        <w:rPr>
-          <w:rFonts w:ascii="Calibri" w:hAnsi="Calibri" w:cs="Calibri"/>
-          <w:sz w:val="24"/>
-          <w:szCs w:val="24"/>
-          <w:lang w:val="sv-SE"/>
-        </w:rPr>
-      </w:pPr>
-      <w:r>
-        <w:rPr>
-          <w:rFonts w:ascii="Calibri" w:hAnsi="Calibri" w:cs="Calibri"/>
-          <w:sz w:val="24"/>
-          <w:szCs w:val="24"/>
-          <w:lang w:val="sv-SE"/>
-        </w:rPr>
-        <w:t>Sammanfatta nyttan och konkreta vinster för användaren.</w:t>
-      </w:r>
-    </w:p>
-    <w:p>
-      <w:pPr>
-        <w:rPr>
-          <w:lang w:val="sv-SE"/>
-        </w:rPr>
-      </w:pPr>
-    </w:p>
-    <w:p>
-      <w:pPr>
-        <w:pStyle w:val="Heading2"/>
-        <w:rPr>
-          <w:lang w:val="sv-SE"/>
-        </w:rPr>
-      </w:pPr>
-      <w:bookmarkStart w:id="12" w:name="_Toc215126468"/>
-      <w:r>
-        <w:rPr>
-          <w:lang w:val="sv-SE"/>
-        </w:rPr>
-        <w:t>7. Scenario</w:t>
-      </w:r>
-      <w:bookmarkEnd w:id="12"/>
-    </w:p>
-    <w:p>
-      <w:pPr>
-        <w:rPr>
-          <w:rFonts w:ascii="Calibri" w:hAnsi="Calibri" w:cs="Calibri"/>
-          <w:sz w:val="24"/>
-          <w:szCs w:val="24"/>
-          <w:lang w:val="sv-SE"/>
-        </w:rPr>
-      </w:pPr>
-      <w:r>
-        <w:rPr>
-          <w:rFonts w:ascii="Calibri" w:hAnsi="Calibri" w:cs="Calibri"/>
-          <w:sz w:val="24"/>
-          <w:szCs w:val="24"/>
-          <w:lang w:val="sv-SE"/>
-        </w:rPr>
-        <w:t>Ge ett verklighetsnära exempel på hur verktyget används.</w:t>
-      </w:r>
-    </w:p>
-    <w:p>
-      <w:pPr>
-        <w:rPr>
-          <w:lang w:val="sv-SE"/>
-        </w:rPr>
-      </w:pPr>
-    </w:p>
-    <w:p>
-      <w:pPr>
-        <w:pStyle w:val="Heading2"/>
-        <w:rPr>
-          <w:lang w:val="sv-SE"/>
-        </w:rPr>
-      </w:pPr>
-      <w:bookmarkStart w:id="13" w:name="_Toc215126469"/>
-      <w:r>
-        <w:rPr>
-          <w:lang w:val="sv-SE"/>
-        </w:rPr>
-        <w:lastRenderedPageBreak/>
-        <w:t>8. Sammanfattning</w:t>
-      </w:r>
-      <w:bookmarkEnd w:id="13"/>
-    </w:p>
-    <w:p>
-      <w:pPr>
-        <w:rPr>
-          <w:rFonts w:ascii="Calibri" w:hAnsi="Calibri" w:cs="Calibri"/>
-          <w:sz w:val="24"/>
-          <w:szCs w:val="24"/>
-          <w:lang w:val="sv-SE"/>
-        </w:rPr>
-      </w:pPr>
-      <w:r>
-        <w:rPr>
-          <w:rFonts w:ascii="Calibri" w:hAnsi="Calibri" w:cs="Calibri"/>
-          <w:sz w:val="24"/>
-          <w:szCs w:val="24"/>
-          <w:lang w:val="sv-SE"/>
-        </w:rPr>
-        <w:t>Knyt ihop helheten kort och tydligt.</w:t>
-      </w:r>
-    </w:p>
-    <w:p>
-      <w:pPr>
-        <w:rPr>
-          <w:lang w:val="sv-SE"/>
-        </w:rPr>
-      </w:pPr>
-    </w:p>
-    <w:p>
-      <w:pPr>
-        <w:pStyle w:val="Heading2"/>
-        <w:rPr>
-          <w:lang w:val="sv-SE"/>
-        </w:rPr>
-      </w:pPr>
-      <w:bookmarkStart w:id="14" w:name="_Toc215126470"/>
-      <w:r>
-        <w:rPr>
-          <w:lang w:val="sv-SE"/>
-        </w:rPr>
-        <w:t xml:space="preserve">X. </w:t>
-      </w:r>
-      <w:r>
-        <w:rPr>
-          <w:lang w:val="sv-SE"/>
-        </w:rPr>
-        <w:t>Referenser</w:t>
-      </w:r>
-      <w:bookmarkEnd w:id="14"/>
-    </w:p>
-    <w:p>
-      <w:pPr>
-        <w:rPr>
-          <w:rFonts w:ascii="Calibri" w:hAnsi="Calibri" w:cs="Calibri"/>
-          <w:sz w:val="24"/>
-          <w:szCs w:val="24"/>
-          <w:lang w:val="sv-SE"/>
-        </w:rPr>
-      </w:pPr>
+      <w:proofErr w:type="spellStart"/>
       <w:r>
         <w:rPr>
           <w:rFonts w:ascii="Calibri" w:hAnsi="Calibri" w:cs="Calibri"/>
@@ -2149,6 +1754,7 @@
         </w:rPr>
         <w:t>Meow</w:t>
       </w:r>
+      <w:proofErr w:type="spellEnd"/>
     </w:p>
     <w:sectPr>
       <w:pgSz w:w="11906" w:h="16838"/>

</xml_diff>

<commit_message>
Documentation: Updated verktygspresentation and ADR005
</commit_message>
<xml_diff>
--- a/docs/school_related/verktygspresentation_clo24nikhal.docx
+++ b/docs/school_related/verktygspresentation_clo24nikhal.docx
@@ -151,14 +151,14 @@
           <w:r>
             <w:fldChar w:fldCharType="separate"/>
           </w:r>
-          <w:hyperlink w:anchor="_Toc215137004" w:history="1">
+          <w:hyperlink w:anchor="_Toc215740454" w:history="1">
             <w:r>
               <w:rPr>
                 <w:rStyle w:val="Hyperlink"/>
                 <w:noProof/>
                 <w:lang w:val="sv-SE"/>
               </w:rPr>
-              <w:t>Verktyg-/projektspresentation</w:t>
+              <w:t>Presentation av verktyg: .NET och Azure</w:t>
             </w:r>
             <w:r>
               <w:rPr>
@@ -179,7 +179,7 @@
                 <w:noProof/>
                 <w:webHidden/>
               </w:rPr>
-              <w:instrText xml:space="preserve"> PAGEREF _Toc215137004 \h </w:instrText>
+              <w:instrText xml:space="preserve"> PAGEREF _Toc215740454 \h </w:instrText>
             </w:r>
             <w:r>
               <w:rPr>
@@ -224,14 +224,14 @@
               <w:lang w:val="en-SE" w:eastAsia="en-SE"/>
             </w:rPr>
           </w:pPr>
-          <w:hyperlink w:anchor="_Toc215137005" w:history="1">
+          <w:hyperlink w:anchor="_Toc215740455" w:history="1">
             <w:r>
               <w:rPr>
                 <w:rStyle w:val="Hyperlink"/>
                 <w:noProof/>
                 <w:lang w:val="sv-SE"/>
               </w:rPr>
-              <w:t>0. Introduktion</w:t>
+              <w:t>0. Inledning</w:t>
             </w:r>
             <w:r>
               <w:rPr>
@@ -252,7 +252,7 @@
                 <w:noProof/>
                 <w:webHidden/>
               </w:rPr>
-              <w:instrText xml:space="preserve"> PAGEREF _Toc215137005 \h </w:instrText>
+              <w:instrText xml:space="preserve"> PAGEREF _Toc215740455 \h </w:instrText>
             </w:r>
             <w:r>
               <w:rPr>
@@ -297,14 +297,31 @@
               <w:lang w:val="en-SE" w:eastAsia="en-SE"/>
             </w:rPr>
           </w:pPr>
-          <w:hyperlink w:anchor="_Toc215137006" w:history="1">
+          <w:hyperlink w:anchor="_Toc215740456" w:history="1">
             <w:r>
               <w:rPr>
                 <w:rStyle w:val="Hyperlink"/>
                 <w:noProof/>
                 <w:lang w:val="sv-SE"/>
               </w:rPr>
-              <w:t>1. Projektets syfte och funktion</w:t>
+              <w:t xml:space="preserve">1. </w:t>
+            </w:r>
+            <w:r>
+              <w:rPr>
+                <w:rStyle w:val="Hyperlink"/>
+                <w:rFonts w:hint="eastAsia"/>
+                <w:noProof/>
+                <w:lang w:val="sv-SE"/>
+              </w:rPr>
+              <w:t>Ö</w:t>
+            </w:r>
+            <w:r>
+              <w:rPr>
+                <w:rStyle w:val="Hyperlink"/>
+                <w:noProof/>
+                <w:lang w:val="sv-SE"/>
+              </w:rPr>
+              <w:t>versikt av verktygsval och motivering till valen</w:t>
             </w:r>
             <w:r>
               <w:rPr>
@@ -325,7 +342,7 @@
                 <w:noProof/>
                 <w:webHidden/>
               </w:rPr>
-              <w:instrText xml:space="preserve"> PAGEREF _Toc215137006 \h </w:instrText>
+              <w:instrText xml:space="preserve"> PAGEREF _Toc215740456 \h </w:instrText>
             </w:r>
             <w:r>
               <w:rPr>
@@ -345,7 +362,7 @@
                 <w:noProof/>
                 <w:webHidden/>
               </w:rPr>
-              <w:t>1</w:t>
+              <w:t>2</w:t>
             </w:r>
             <w:r>
               <w:rPr>
@@ -370,31 +387,160 @@
               <w:lang w:val="en-SE" w:eastAsia="en-SE"/>
             </w:rPr>
           </w:pPr>
-          <w:hyperlink w:anchor="_Toc215137007" w:history="1">
+          <w:hyperlink w:anchor="_Toc215740457" w:history="1">
             <w:r>
               <w:rPr>
                 <w:rStyle w:val="Hyperlink"/>
                 <w:noProof/>
                 <w:lang w:val="sv-SE"/>
               </w:rPr>
-              <w:t>2. M</w:t>
-            </w:r>
+              <w:t>2. .NET och Blazor Server (mjukvarukod, backend och webfront)</w:t>
+            </w:r>
+            <w:r>
+              <w:rPr>
+                <w:noProof/>
+                <w:webHidden/>
+              </w:rPr>
+              <w:tab/>
+            </w:r>
+            <w:r>
+              <w:rPr>
+                <w:noProof/>
+                <w:webHidden/>
+              </w:rPr>
+              <w:fldChar w:fldCharType="begin"/>
+            </w:r>
+            <w:r>
+              <w:rPr>
+                <w:noProof/>
+                <w:webHidden/>
+              </w:rPr>
+              <w:instrText xml:space="preserve"> PAGEREF _Toc215740457 \h </w:instrText>
+            </w:r>
+            <w:r>
+              <w:rPr>
+                <w:noProof/>
+                <w:webHidden/>
+              </w:rPr>
+            </w:r>
+            <w:r>
+              <w:rPr>
+                <w:noProof/>
+                <w:webHidden/>
+              </w:rPr>
+              <w:fldChar w:fldCharType="separate"/>
+            </w:r>
+            <w:r>
+              <w:rPr>
+                <w:noProof/>
+                <w:webHidden/>
+              </w:rPr>
+              <w:t>2</w:t>
+            </w:r>
+            <w:r>
+              <w:rPr>
+                <w:noProof/>
+                <w:webHidden/>
+              </w:rPr>
+              <w:fldChar w:fldCharType="end"/>
+            </w:r>
+          </w:hyperlink>
+        </w:p>
+        <w:p>
+          <w:pPr>
+            <w:pStyle w:val="TOC3"/>
+            <w:tabs>
+              <w:tab w:val="right" w:leader="dot" w:pos="9016"/>
+            </w:tabs>
+            <w:rPr>
+              <w:rFonts w:eastAsiaTheme="minorEastAsia"/>
+              <w:noProof/>
+              <w:sz w:val="24"/>
+              <w:szCs w:val="24"/>
+              <w:lang w:val="en-SE" w:eastAsia="en-SE"/>
+            </w:rPr>
+          </w:pPr>
+          <w:hyperlink w:anchor="_Toc215740458" w:history="1">
             <w:r>
               <w:rPr>
                 <w:rStyle w:val="Hyperlink"/>
-                <w:rFonts w:hint="eastAsia"/>
                 <w:noProof/>
                 <w:lang w:val="sv-SE"/>
               </w:rPr>
-              <w:t>å</w:t>
-            </w:r>
+              <w:t>2.1 .NET djupdyk</w:t>
+            </w:r>
+            <w:r>
+              <w:rPr>
+                <w:noProof/>
+                <w:webHidden/>
+              </w:rPr>
+              <w:tab/>
+            </w:r>
+            <w:r>
+              <w:rPr>
+                <w:noProof/>
+                <w:webHidden/>
+              </w:rPr>
+              <w:fldChar w:fldCharType="begin"/>
+            </w:r>
+            <w:r>
+              <w:rPr>
+                <w:noProof/>
+                <w:webHidden/>
+              </w:rPr>
+              <w:instrText xml:space="preserve"> PAGEREF _Toc215740458 \h </w:instrText>
+            </w:r>
+            <w:r>
+              <w:rPr>
+                <w:noProof/>
+                <w:webHidden/>
+              </w:rPr>
+            </w:r>
+            <w:r>
+              <w:rPr>
+                <w:noProof/>
+                <w:webHidden/>
+              </w:rPr>
+              <w:fldChar w:fldCharType="separate"/>
+            </w:r>
+            <w:r>
+              <w:rPr>
+                <w:noProof/>
+                <w:webHidden/>
+              </w:rPr>
+              <w:t>2</w:t>
+            </w:r>
+            <w:r>
+              <w:rPr>
+                <w:noProof/>
+                <w:webHidden/>
+              </w:rPr>
+              <w:fldChar w:fldCharType="end"/>
+            </w:r>
+          </w:hyperlink>
+        </w:p>
+        <w:p>
+          <w:pPr>
+            <w:pStyle w:val="TOC3"/>
+            <w:tabs>
+              <w:tab w:val="right" w:leader="dot" w:pos="9016"/>
+            </w:tabs>
+            <w:rPr>
+              <w:rFonts w:eastAsiaTheme="minorEastAsia"/>
+              <w:noProof/>
+              <w:sz w:val="24"/>
+              <w:szCs w:val="24"/>
+              <w:lang w:val="en-SE" w:eastAsia="en-SE"/>
+            </w:rPr>
+          </w:pPr>
+          <w:hyperlink w:anchor="_Toc215740459" w:history="1">
             <w:r>
               <w:rPr>
                 <w:rStyle w:val="Hyperlink"/>
                 <w:noProof/>
                 <w:lang w:val="sv-SE"/>
               </w:rPr>
-              <w:t>lgrupp</w:t>
+              <w:t>2.2 Blazor Server djupdyk</w:t>
             </w:r>
             <w:r>
               <w:rPr>
@@ -415,7 +561,7 @@
                 <w:noProof/>
                 <w:webHidden/>
               </w:rPr>
-              <w:instrText xml:space="preserve"> PAGEREF _Toc215137007 \h </w:instrText>
+              <w:instrText xml:space="preserve"> PAGEREF _Toc215740459 \h </w:instrText>
             </w:r>
             <w:r>
               <w:rPr>
@@ -460,14 +606,14 @@
               <w:lang w:val="en-SE" w:eastAsia="en-SE"/>
             </w:rPr>
           </w:pPr>
-          <w:hyperlink w:anchor="_Toc215137008" w:history="1">
+          <w:hyperlink w:anchor="_Toc215740460" w:history="1">
             <w:r>
               <w:rPr>
                 <w:rStyle w:val="Hyperlink"/>
                 <w:noProof/>
                 <w:lang w:val="sv-SE"/>
               </w:rPr>
-              <w:t xml:space="preserve">3. </w:t>
+              <w:t>3. Azure och CosmosDB (molntj</w:t>
             </w:r>
             <w:r>
               <w:rPr>
@@ -476,7 +622,7 @@
                 <w:noProof/>
                 <w:lang w:val="sv-SE"/>
               </w:rPr>
-              <w:t>Ö</w:t>
+              <w:t>ä</w:t>
             </w:r>
             <w:r>
               <w:rPr>
@@ -484,7 +630,7 @@
                 <w:noProof/>
                 <w:lang w:val="sv-SE"/>
               </w:rPr>
-              <w:t>versikt</w:t>
+              <w:t>nster och databas)</w:t>
             </w:r>
             <w:r>
               <w:rPr>
@@ -505,7 +651,7 @@
                 <w:noProof/>
                 <w:webHidden/>
               </w:rPr>
-              <w:instrText xml:space="preserve"> PAGEREF _Toc215137008 \h </w:instrText>
+              <w:instrText xml:space="preserve"> PAGEREF _Toc215740460 \h </w:instrText>
             </w:r>
             <w:r>
               <w:rPr>
@@ -526,6 +672,529 @@
                 <w:webHidden/>
               </w:rPr>
               <w:t>2</w:t>
+            </w:r>
+            <w:r>
+              <w:rPr>
+                <w:noProof/>
+                <w:webHidden/>
+              </w:rPr>
+              <w:fldChar w:fldCharType="end"/>
+            </w:r>
+          </w:hyperlink>
+        </w:p>
+        <w:p>
+          <w:pPr>
+            <w:pStyle w:val="TOC3"/>
+            <w:tabs>
+              <w:tab w:val="right" w:leader="dot" w:pos="9016"/>
+            </w:tabs>
+            <w:rPr>
+              <w:rFonts w:eastAsiaTheme="minorEastAsia"/>
+              <w:noProof/>
+              <w:sz w:val="24"/>
+              <w:szCs w:val="24"/>
+              <w:lang w:val="en-SE" w:eastAsia="en-SE"/>
+            </w:rPr>
+          </w:pPr>
+          <w:hyperlink w:anchor="_Toc215740461" w:history="1">
+            <w:r>
+              <w:rPr>
+                <w:rStyle w:val="Hyperlink"/>
+                <w:noProof/>
+                <w:lang w:val="sv-SE"/>
+              </w:rPr>
+              <w:t>3.1 Azure-tj</w:t>
+            </w:r>
+            <w:r>
+              <w:rPr>
+                <w:rStyle w:val="Hyperlink"/>
+                <w:rFonts w:hint="eastAsia"/>
+                <w:noProof/>
+                <w:lang w:val="sv-SE"/>
+              </w:rPr>
+              <w:t>ä</w:t>
+            </w:r>
+            <w:r>
+              <w:rPr>
+                <w:rStyle w:val="Hyperlink"/>
+                <w:noProof/>
+                <w:lang w:val="sv-SE"/>
+              </w:rPr>
+              <w:t>nst ett</w:t>
+            </w:r>
+            <w:r>
+              <w:rPr>
+                <w:noProof/>
+                <w:webHidden/>
+              </w:rPr>
+              <w:tab/>
+            </w:r>
+            <w:r>
+              <w:rPr>
+                <w:noProof/>
+                <w:webHidden/>
+              </w:rPr>
+              <w:fldChar w:fldCharType="begin"/>
+            </w:r>
+            <w:r>
+              <w:rPr>
+                <w:noProof/>
+                <w:webHidden/>
+              </w:rPr>
+              <w:instrText xml:space="preserve"> PAGEREF _Toc215740461 \h </w:instrText>
+            </w:r>
+            <w:r>
+              <w:rPr>
+                <w:noProof/>
+                <w:webHidden/>
+              </w:rPr>
+            </w:r>
+            <w:r>
+              <w:rPr>
+                <w:noProof/>
+                <w:webHidden/>
+              </w:rPr>
+              <w:fldChar w:fldCharType="separate"/>
+            </w:r>
+            <w:r>
+              <w:rPr>
+                <w:noProof/>
+                <w:webHidden/>
+              </w:rPr>
+              <w:t>2</w:t>
+            </w:r>
+            <w:r>
+              <w:rPr>
+                <w:noProof/>
+                <w:webHidden/>
+              </w:rPr>
+              <w:fldChar w:fldCharType="end"/>
+            </w:r>
+          </w:hyperlink>
+        </w:p>
+        <w:p>
+          <w:pPr>
+            <w:pStyle w:val="TOC3"/>
+            <w:tabs>
+              <w:tab w:val="right" w:leader="dot" w:pos="9016"/>
+            </w:tabs>
+            <w:rPr>
+              <w:rFonts w:eastAsiaTheme="minorEastAsia"/>
+              <w:noProof/>
+              <w:sz w:val="24"/>
+              <w:szCs w:val="24"/>
+              <w:lang w:val="en-SE" w:eastAsia="en-SE"/>
+            </w:rPr>
+          </w:pPr>
+          <w:hyperlink w:anchor="_Toc215740462" w:history="1">
+            <w:r>
+              <w:rPr>
+                <w:rStyle w:val="Hyperlink"/>
+                <w:noProof/>
+                <w:lang w:val="sv-SE"/>
+              </w:rPr>
+              <w:t>3.2 Azure-tj</w:t>
+            </w:r>
+            <w:r>
+              <w:rPr>
+                <w:rStyle w:val="Hyperlink"/>
+                <w:rFonts w:hint="eastAsia"/>
+                <w:noProof/>
+                <w:lang w:val="sv-SE"/>
+              </w:rPr>
+              <w:t>ä</w:t>
+            </w:r>
+            <w:r>
+              <w:rPr>
+                <w:rStyle w:val="Hyperlink"/>
+                <w:noProof/>
+                <w:lang w:val="sv-SE"/>
+              </w:rPr>
+              <w:t>nst ett</w:t>
+            </w:r>
+            <w:r>
+              <w:rPr>
+                <w:noProof/>
+                <w:webHidden/>
+              </w:rPr>
+              <w:tab/>
+            </w:r>
+            <w:r>
+              <w:rPr>
+                <w:noProof/>
+                <w:webHidden/>
+              </w:rPr>
+              <w:fldChar w:fldCharType="begin"/>
+            </w:r>
+            <w:r>
+              <w:rPr>
+                <w:noProof/>
+                <w:webHidden/>
+              </w:rPr>
+              <w:instrText xml:space="preserve"> PAGEREF _Toc215740462 \h </w:instrText>
+            </w:r>
+            <w:r>
+              <w:rPr>
+                <w:noProof/>
+                <w:webHidden/>
+              </w:rPr>
+            </w:r>
+            <w:r>
+              <w:rPr>
+                <w:noProof/>
+                <w:webHidden/>
+              </w:rPr>
+              <w:fldChar w:fldCharType="separate"/>
+            </w:r>
+            <w:r>
+              <w:rPr>
+                <w:noProof/>
+                <w:webHidden/>
+              </w:rPr>
+              <w:t>3</w:t>
+            </w:r>
+            <w:r>
+              <w:rPr>
+                <w:noProof/>
+                <w:webHidden/>
+              </w:rPr>
+              <w:fldChar w:fldCharType="end"/>
+            </w:r>
+          </w:hyperlink>
+        </w:p>
+        <w:p>
+          <w:pPr>
+            <w:pStyle w:val="TOC3"/>
+            <w:tabs>
+              <w:tab w:val="right" w:leader="dot" w:pos="9016"/>
+            </w:tabs>
+            <w:rPr>
+              <w:rFonts w:eastAsiaTheme="minorEastAsia"/>
+              <w:noProof/>
+              <w:sz w:val="24"/>
+              <w:szCs w:val="24"/>
+              <w:lang w:val="en-SE" w:eastAsia="en-SE"/>
+            </w:rPr>
+          </w:pPr>
+          <w:hyperlink w:anchor="_Toc215740463" w:history="1">
+            <w:r>
+              <w:rPr>
+                <w:rStyle w:val="Hyperlink"/>
+                <w:noProof/>
+                <w:lang w:val="sv-SE"/>
+              </w:rPr>
+              <w:t>3.3 Azure-tj</w:t>
+            </w:r>
+            <w:r>
+              <w:rPr>
+                <w:rStyle w:val="Hyperlink"/>
+                <w:rFonts w:hint="eastAsia"/>
+                <w:noProof/>
+                <w:lang w:val="sv-SE"/>
+              </w:rPr>
+              <w:t>ä</w:t>
+            </w:r>
+            <w:r>
+              <w:rPr>
+                <w:rStyle w:val="Hyperlink"/>
+                <w:noProof/>
+                <w:lang w:val="sv-SE"/>
+              </w:rPr>
+              <w:t>nst ett</w:t>
+            </w:r>
+            <w:r>
+              <w:rPr>
+                <w:noProof/>
+                <w:webHidden/>
+              </w:rPr>
+              <w:tab/>
+            </w:r>
+            <w:r>
+              <w:rPr>
+                <w:noProof/>
+                <w:webHidden/>
+              </w:rPr>
+              <w:fldChar w:fldCharType="begin"/>
+            </w:r>
+            <w:r>
+              <w:rPr>
+                <w:noProof/>
+                <w:webHidden/>
+              </w:rPr>
+              <w:instrText xml:space="preserve"> PAGEREF _Toc215740463 \h </w:instrText>
+            </w:r>
+            <w:r>
+              <w:rPr>
+                <w:noProof/>
+                <w:webHidden/>
+              </w:rPr>
+            </w:r>
+            <w:r>
+              <w:rPr>
+                <w:noProof/>
+                <w:webHidden/>
+              </w:rPr>
+              <w:fldChar w:fldCharType="separate"/>
+            </w:r>
+            <w:r>
+              <w:rPr>
+                <w:noProof/>
+                <w:webHidden/>
+              </w:rPr>
+              <w:t>3</w:t>
+            </w:r>
+            <w:r>
+              <w:rPr>
+                <w:noProof/>
+                <w:webHidden/>
+              </w:rPr>
+              <w:fldChar w:fldCharType="end"/>
+            </w:r>
+          </w:hyperlink>
+        </w:p>
+        <w:p>
+          <w:pPr>
+            <w:pStyle w:val="TOC3"/>
+            <w:tabs>
+              <w:tab w:val="right" w:leader="dot" w:pos="9016"/>
+            </w:tabs>
+            <w:rPr>
+              <w:rFonts w:eastAsiaTheme="minorEastAsia"/>
+              <w:noProof/>
+              <w:sz w:val="24"/>
+              <w:szCs w:val="24"/>
+              <w:lang w:val="en-SE" w:eastAsia="en-SE"/>
+            </w:rPr>
+          </w:pPr>
+          <w:hyperlink w:anchor="_Toc215740464" w:history="1">
+            <w:r>
+              <w:rPr>
+                <w:rStyle w:val="Hyperlink"/>
+                <w:noProof/>
+                <w:lang w:val="sv-SE"/>
+              </w:rPr>
+              <w:t>3.4 Azure-tj</w:t>
+            </w:r>
+            <w:r>
+              <w:rPr>
+                <w:rStyle w:val="Hyperlink"/>
+                <w:rFonts w:hint="eastAsia"/>
+                <w:noProof/>
+                <w:lang w:val="sv-SE"/>
+              </w:rPr>
+              <w:t>ä</w:t>
+            </w:r>
+            <w:r>
+              <w:rPr>
+                <w:rStyle w:val="Hyperlink"/>
+                <w:noProof/>
+                <w:lang w:val="sv-SE"/>
+              </w:rPr>
+              <w:t>nst ett</w:t>
+            </w:r>
+            <w:r>
+              <w:rPr>
+                <w:noProof/>
+                <w:webHidden/>
+              </w:rPr>
+              <w:tab/>
+            </w:r>
+            <w:r>
+              <w:rPr>
+                <w:noProof/>
+                <w:webHidden/>
+              </w:rPr>
+              <w:fldChar w:fldCharType="begin"/>
+            </w:r>
+            <w:r>
+              <w:rPr>
+                <w:noProof/>
+                <w:webHidden/>
+              </w:rPr>
+              <w:instrText xml:space="preserve"> PAGEREF _Toc215740464 \h </w:instrText>
+            </w:r>
+            <w:r>
+              <w:rPr>
+                <w:noProof/>
+                <w:webHidden/>
+              </w:rPr>
+            </w:r>
+            <w:r>
+              <w:rPr>
+                <w:noProof/>
+                <w:webHidden/>
+              </w:rPr>
+              <w:fldChar w:fldCharType="separate"/>
+            </w:r>
+            <w:r>
+              <w:rPr>
+                <w:noProof/>
+                <w:webHidden/>
+              </w:rPr>
+              <w:t>3</w:t>
+            </w:r>
+            <w:r>
+              <w:rPr>
+                <w:noProof/>
+                <w:webHidden/>
+              </w:rPr>
+              <w:fldChar w:fldCharType="end"/>
+            </w:r>
+          </w:hyperlink>
+        </w:p>
+        <w:p>
+          <w:pPr>
+            <w:pStyle w:val="TOC3"/>
+            <w:tabs>
+              <w:tab w:val="right" w:leader="dot" w:pos="9016"/>
+            </w:tabs>
+            <w:rPr>
+              <w:rFonts w:eastAsiaTheme="minorEastAsia"/>
+              <w:noProof/>
+              <w:sz w:val="24"/>
+              <w:szCs w:val="24"/>
+              <w:lang w:val="en-SE" w:eastAsia="en-SE"/>
+            </w:rPr>
+          </w:pPr>
+          <w:hyperlink w:anchor="_Toc215740465" w:history="1">
+            <w:r>
+              <w:rPr>
+                <w:rStyle w:val="Hyperlink"/>
+                <w:noProof/>
+                <w:lang w:val="sv-SE"/>
+              </w:rPr>
+              <w:t>3.5 Azure-tj</w:t>
+            </w:r>
+            <w:r>
+              <w:rPr>
+                <w:rStyle w:val="Hyperlink"/>
+                <w:rFonts w:hint="eastAsia"/>
+                <w:noProof/>
+                <w:lang w:val="sv-SE"/>
+              </w:rPr>
+              <w:t>ä</w:t>
+            </w:r>
+            <w:r>
+              <w:rPr>
+                <w:rStyle w:val="Hyperlink"/>
+                <w:noProof/>
+                <w:lang w:val="sv-SE"/>
+              </w:rPr>
+              <w:t>nst ett</w:t>
+            </w:r>
+            <w:r>
+              <w:rPr>
+                <w:noProof/>
+                <w:webHidden/>
+              </w:rPr>
+              <w:tab/>
+            </w:r>
+            <w:r>
+              <w:rPr>
+                <w:noProof/>
+                <w:webHidden/>
+              </w:rPr>
+              <w:fldChar w:fldCharType="begin"/>
+            </w:r>
+            <w:r>
+              <w:rPr>
+                <w:noProof/>
+                <w:webHidden/>
+              </w:rPr>
+              <w:instrText xml:space="preserve"> PAGEREF _Toc215740465 \h </w:instrText>
+            </w:r>
+            <w:r>
+              <w:rPr>
+                <w:noProof/>
+                <w:webHidden/>
+              </w:rPr>
+            </w:r>
+            <w:r>
+              <w:rPr>
+                <w:noProof/>
+                <w:webHidden/>
+              </w:rPr>
+              <w:fldChar w:fldCharType="separate"/>
+            </w:r>
+            <w:r>
+              <w:rPr>
+                <w:noProof/>
+                <w:webHidden/>
+              </w:rPr>
+              <w:t>3</w:t>
+            </w:r>
+            <w:r>
+              <w:rPr>
+                <w:noProof/>
+                <w:webHidden/>
+              </w:rPr>
+              <w:fldChar w:fldCharType="end"/>
+            </w:r>
+          </w:hyperlink>
+        </w:p>
+        <w:p>
+          <w:pPr>
+            <w:pStyle w:val="TOC3"/>
+            <w:tabs>
+              <w:tab w:val="right" w:leader="dot" w:pos="9016"/>
+            </w:tabs>
+            <w:rPr>
+              <w:rFonts w:eastAsiaTheme="minorEastAsia"/>
+              <w:noProof/>
+              <w:sz w:val="24"/>
+              <w:szCs w:val="24"/>
+              <w:lang w:val="en-SE" w:eastAsia="en-SE"/>
+            </w:rPr>
+          </w:pPr>
+          <w:hyperlink w:anchor="_Toc215740466" w:history="1">
+            <w:r>
+              <w:rPr>
+                <w:rStyle w:val="Hyperlink"/>
+                <w:noProof/>
+                <w:lang w:val="sv-SE"/>
+              </w:rPr>
+              <w:t>3.6 CosmosDB</w:t>
+            </w:r>
+            <w:r>
+              <w:rPr>
+                <w:noProof/>
+                <w:webHidden/>
+              </w:rPr>
+              <w:tab/>
+            </w:r>
+            <w:r>
+              <w:rPr>
+                <w:noProof/>
+                <w:webHidden/>
+              </w:rPr>
+              <w:fldChar w:fldCharType="begin"/>
+            </w:r>
+            <w:r>
+              <w:rPr>
+                <w:noProof/>
+                <w:webHidden/>
+              </w:rPr>
+              <w:instrText xml:space="preserve"> PAGEREF _Toc215740466 \h </w:instrText>
+            </w:r>
+            <w:r>
+              <w:rPr>
+                <w:noProof/>
+                <w:webHidden/>
+              </w:rPr>
+            </w:r>
+            <w:r>
+              <w:rPr>
+                <w:noProof/>
+                <w:webHidden/>
+              </w:rPr>
+              <w:fldChar w:fldCharType="separate"/>
+            </w:r>
+            <w:r>
+              <w:rPr>
+                <w:noProof/>
+                <w:webHidden/>
+              </w:rPr>
+              <w:t>3</w:t>
             </w:r>
             <w:r>
               <w:rPr>
@@ -550,14 +1219,14 @@
               <w:lang w:val="en-SE" w:eastAsia="en-SE"/>
             </w:rPr>
           </w:pPr>
-          <w:hyperlink w:anchor="_Toc215137009" w:history="1">
+          <w:hyperlink w:anchor="_Toc215740467" w:history="1">
             <w:r>
               <w:rPr>
                 <w:rStyle w:val="Hyperlink"/>
                 <w:noProof/>
                 <w:lang w:val="sv-SE"/>
               </w:rPr>
-              <w:t>4. Huvudfunktioner</w:t>
+              <w:t>4. GitHub och Docker (IaC)</w:t>
             </w:r>
             <w:r>
               <w:rPr>
@@ -578,7 +1247,7 @@
                 <w:noProof/>
                 <w:webHidden/>
               </w:rPr>
-              <w:instrText xml:space="preserve"> PAGEREF _Toc215137009 \h </w:instrText>
+              <w:instrText xml:space="preserve"> PAGEREF _Toc215740467 \h </w:instrText>
             </w:r>
             <w:r>
               <w:rPr>
@@ -598,7 +1267,153 @@
                 <w:noProof/>
                 <w:webHidden/>
               </w:rPr>
-              <w:t>2</w:t>
+              <w:t>3</w:t>
+            </w:r>
+            <w:r>
+              <w:rPr>
+                <w:noProof/>
+                <w:webHidden/>
+              </w:rPr>
+              <w:fldChar w:fldCharType="end"/>
+            </w:r>
+          </w:hyperlink>
+        </w:p>
+        <w:p>
+          <w:pPr>
+            <w:pStyle w:val="TOC3"/>
+            <w:tabs>
+              <w:tab w:val="right" w:leader="dot" w:pos="9016"/>
+            </w:tabs>
+            <w:rPr>
+              <w:rFonts w:eastAsiaTheme="minorEastAsia"/>
+              <w:noProof/>
+              <w:sz w:val="24"/>
+              <w:szCs w:val="24"/>
+              <w:lang w:val="en-SE" w:eastAsia="en-SE"/>
+            </w:rPr>
+          </w:pPr>
+          <w:hyperlink w:anchor="_Toc215740468" w:history="1">
+            <w:r>
+              <w:rPr>
+                <w:rStyle w:val="Hyperlink"/>
+                <w:noProof/>
+                <w:lang w:val="sv-SE"/>
+              </w:rPr>
+              <w:t>4.1 GitHub</w:t>
+            </w:r>
+            <w:r>
+              <w:rPr>
+                <w:noProof/>
+                <w:webHidden/>
+              </w:rPr>
+              <w:tab/>
+            </w:r>
+            <w:r>
+              <w:rPr>
+                <w:noProof/>
+                <w:webHidden/>
+              </w:rPr>
+              <w:fldChar w:fldCharType="begin"/>
+            </w:r>
+            <w:r>
+              <w:rPr>
+                <w:noProof/>
+                <w:webHidden/>
+              </w:rPr>
+              <w:instrText xml:space="preserve"> PAGEREF _Toc215740468 \h </w:instrText>
+            </w:r>
+            <w:r>
+              <w:rPr>
+                <w:noProof/>
+                <w:webHidden/>
+              </w:rPr>
+            </w:r>
+            <w:r>
+              <w:rPr>
+                <w:noProof/>
+                <w:webHidden/>
+              </w:rPr>
+              <w:fldChar w:fldCharType="separate"/>
+            </w:r>
+            <w:r>
+              <w:rPr>
+                <w:noProof/>
+                <w:webHidden/>
+              </w:rPr>
+              <w:t>3</w:t>
+            </w:r>
+            <w:r>
+              <w:rPr>
+                <w:noProof/>
+                <w:webHidden/>
+              </w:rPr>
+              <w:fldChar w:fldCharType="end"/>
+            </w:r>
+          </w:hyperlink>
+        </w:p>
+        <w:p>
+          <w:pPr>
+            <w:pStyle w:val="TOC3"/>
+            <w:tabs>
+              <w:tab w:val="right" w:leader="dot" w:pos="9016"/>
+            </w:tabs>
+            <w:rPr>
+              <w:rFonts w:eastAsiaTheme="minorEastAsia"/>
+              <w:noProof/>
+              <w:sz w:val="24"/>
+              <w:szCs w:val="24"/>
+              <w:lang w:val="en-SE" w:eastAsia="en-SE"/>
+            </w:rPr>
+          </w:pPr>
+          <w:hyperlink w:anchor="_Toc215740469" w:history="1">
+            <w:r>
+              <w:rPr>
+                <w:rStyle w:val="Hyperlink"/>
+                <w:noProof/>
+                <w:lang w:val="sv-SE"/>
+              </w:rPr>
+              <w:t>4.2 Docker</w:t>
+            </w:r>
+            <w:r>
+              <w:rPr>
+                <w:noProof/>
+                <w:webHidden/>
+              </w:rPr>
+              <w:tab/>
+            </w:r>
+            <w:r>
+              <w:rPr>
+                <w:noProof/>
+                <w:webHidden/>
+              </w:rPr>
+              <w:fldChar w:fldCharType="begin"/>
+            </w:r>
+            <w:r>
+              <w:rPr>
+                <w:noProof/>
+                <w:webHidden/>
+              </w:rPr>
+              <w:instrText xml:space="preserve"> PAGEREF _Toc215740469 \h </w:instrText>
+            </w:r>
+            <w:r>
+              <w:rPr>
+                <w:noProof/>
+                <w:webHidden/>
+              </w:rPr>
+            </w:r>
+            <w:r>
+              <w:rPr>
+                <w:noProof/>
+                <w:webHidden/>
+              </w:rPr>
+              <w:fldChar w:fldCharType="separate"/>
+            </w:r>
+            <w:r>
+              <w:rPr>
+                <w:noProof/>
+                <w:webHidden/>
+              </w:rPr>
+              <w:t>3</w:t>
             </w:r>
             <w:r>
               <w:rPr>
@@ -623,14 +1438,48 @@
               <w:lang w:val="en-SE" w:eastAsia="en-SE"/>
             </w:rPr>
           </w:pPr>
-          <w:hyperlink w:anchor="_Toc215137010" w:history="1">
+          <w:hyperlink w:anchor="_Toc215740470" w:history="1">
             <w:r>
               <w:rPr>
                 <w:rStyle w:val="Hyperlink"/>
                 <w:noProof/>
                 <w:lang w:val="sv-SE"/>
               </w:rPr>
-              <w:t>5. Roller</w:t>
+              <w:t xml:space="preserve">5. Huvudfunktionen </w:t>
+            </w:r>
+            <w:r>
+              <w:rPr>
+                <w:rStyle w:val="Hyperlink"/>
+                <w:rFonts w:hint="eastAsia"/>
+                <w:noProof/>
+                <w:lang w:val="sv-SE"/>
+              </w:rPr>
+              <w:t>–</w:t>
+            </w:r>
+            <w:r>
+              <w:rPr>
+                <w:rStyle w:val="Hyperlink"/>
+                <w:noProof/>
+                <w:lang w:val="sv-SE"/>
+              </w:rPr>
+              <w:t xml:space="preserve"> Den Stora R</w:t>
+            </w:r>
+            <w:r>
+              <w:rPr>
+                <w:rStyle w:val="Hyperlink"/>
+                <w:rFonts w:hint="eastAsia"/>
+                <w:noProof/>
+                <w:lang w:val="sv-SE"/>
+              </w:rPr>
+              <w:t>ö</w:t>
+            </w:r>
+            <w:r>
+              <w:rPr>
+                <w:rStyle w:val="Hyperlink"/>
+                <w:noProof/>
+                <w:lang w:val="sv-SE"/>
+              </w:rPr>
+              <w:t>da Knappen</w:t>
             </w:r>
             <w:r>
               <w:rPr>
@@ -651,7 +1500,7 @@
                 <w:noProof/>
                 <w:webHidden/>
               </w:rPr>
-              <w:instrText xml:space="preserve"> PAGEREF _Toc215137010 \h </w:instrText>
+              <w:instrText xml:space="preserve"> PAGEREF _Toc215740470 \h </w:instrText>
             </w:r>
             <w:r>
               <w:rPr>
@@ -671,7 +1520,7 @@
                 <w:noProof/>
                 <w:webHidden/>
               </w:rPr>
-              <w:t>2</w:t>
+              <w:t>3</w:t>
             </w:r>
             <w:r>
               <w:rPr>
@@ -696,31 +1545,14 @@
               <w:lang w:val="en-SE" w:eastAsia="en-SE"/>
             </w:rPr>
           </w:pPr>
-          <w:hyperlink w:anchor="_Toc215137011" w:history="1">
+          <w:hyperlink w:anchor="_Toc215740471" w:history="1">
             <w:r>
               <w:rPr>
                 <w:rStyle w:val="Hyperlink"/>
                 <w:noProof/>
                 <w:lang w:val="sv-SE"/>
               </w:rPr>
-              <w:t>6. F</w:t>
-            </w:r>
-            <w:r>
-              <w:rPr>
-                <w:rStyle w:val="Hyperlink"/>
-                <w:rFonts w:hint="eastAsia"/>
-                <w:noProof/>
-                <w:lang w:val="sv-SE"/>
-              </w:rPr>
-              <w:t>ö</w:t>
-            </w:r>
-            <w:r>
-              <w:rPr>
-                <w:rStyle w:val="Hyperlink"/>
-                <w:noProof/>
-                <w:lang w:val="sv-SE"/>
-              </w:rPr>
-              <w:t>rdelar</w:t>
+              <w:t>6. Sammanfattning och samspel</w:t>
             </w:r>
             <w:r>
               <w:rPr>
@@ -741,7 +1573,7 @@
                 <w:noProof/>
                 <w:webHidden/>
               </w:rPr>
-              <w:instrText xml:space="preserve"> PAGEREF _Toc215137011 \h </w:instrText>
+              <w:instrText xml:space="preserve"> PAGEREF _Toc215740471 \h </w:instrText>
             </w:r>
             <w:r>
               <w:rPr>
@@ -761,7 +1593,7 @@
                 <w:noProof/>
                 <w:webHidden/>
               </w:rPr>
-              <w:t>2</w:t>
+              <w:t>4</w:t>
             </w:r>
             <w:r>
               <w:rPr>
@@ -786,14 +1618,14 @@
               <w:lang w:val="en-SE" w:eastAsia="en-SE"/>
             </w:rPr>
           </w:pPr>
-          <w:hyperlink w:anchor="_Toc215137012" w:history="1">
+          <w:hyperlink w:anchor="_Toc215740472" w:history="1">
             <w:r>
               <w:rPr>
                 <w:rStyle w:val="Hyperlink"/>
                 <w:noProof/>
                 <w:lang w:val="sv-SE"/>
               </w:rPr>
-              <w:t>7. Scenario</w:t>
+              <w:t>X. Referenser</w:t>
             </w:r>
             <w:r>
               <w:rPr>
@@ -814,7 +1646,7 @@
                 <w:noProof/>
                 <w:webHidden/>
               </w:rPr>
-              <w:instrText xml:space="preserve"> PAGEREF _Toc215137012 \h </w:instrText>
+              <w:instrText xml:space="preserve"> PAGEREF _Toc215740472 \h </w:instrText>
             </w:r>
             <w:r>
               <w:rPr>
@@ -834,153 +1666,7 @@
                 <w:noProof/>
                 <w:webHidden/>
               </w:rPr>
-              <w:t>2</w:t>
-            </w:r>
-            <w:r>
-              <w:rPr>
-                <w:noProof/>
-                <w:webHidden/>
-              </w:rPr>
-              <w:fldChar w:fldCharType="end"/>
-            </w:r>
-          </w:hyperlink>
-        </w:p>
-        <w:p>
-          <w:pPr>
-            <w:pStyle w:val="TOC2"/>
-            <w:tabs>
-              <w:tab w:val="right" w:leader="dot" w:pos="9016"/>
-            </w:tabs>
-            <w:rPr>
-              <w:rFonts w:eastAsiaTheme="minorEastAsia"/>
-              <w:noProof/>
-              <w:sz w:val="24"/>
-              <w:szCs w:val="24"/>
-              <w:lang w:val="en-SE" w:eastAsia="en-SE"/>
-            </w:rPr>
-          </w:pPr>
-          <w:hyperlink w:anchor="_Toc215137013" w:history="1">
-            <w:r>
-              <w:rPr>
-                <w:rStyle w:val="Hyperlink"/>
-                <w:noProof/>
-                <w:lang w:val="sv-SE"/>
-              </w:rPr>
-              <w:t>8. Sammanfattning</w:t>
-            </w:r>
-            <w:r>
-              <w:rPr>
-                <w:noProof/>
-                <w:webHidden/>
-              </w:rPr>
-              <w:tab/>
-            </w:r>
-            <w:r>
-              <w:rPr>
-                <w:noProof/>
-                <w:webHidden/>
-              </w:rPr>
-              <w:fldChar w:fldCharType="begin"/>
-            </w:r>
-            <w:r>
-              <w:rPr>
-                <w:noProof/>
-                <w:webHidden/>
-              </w:rPr>
-              <w:instrText xml:space="preserve"> PAGEREF _Toc215137013 \h </w:instrText>
-            </w:r>
-            <w:r>
-              <w:rPr>
-                <w:noProof/>
-                <w:webHidden/>
-              </w:rPr>
-            </w:r>
-            <w:r>
-              <w:rPr>
-                <w:noProof/>
-                <w:webHidden/>
-              </w:rPr>
-              <w:fldChar w:fldCharType="separate"/>
-            </w:r>
-            <w:r>
-              <w:rPr>
-                <w:noProof/>
-                <w:webHidden/>
-              </w:rPr>
-              <w:t>2</w:t>
-            </w:r>
-            <w:r>
-              <w:rPr>
-                <w:noProof/>
-                <w:webHidden/>
-              </w:rPr>
-              <w:fldChar w:fldCharType="end"/>
-            </w:r>
-          </w:hyperlink>
-        </w:p>
-        <w:p>
-          <w:pPr>
-            <w:pStyle w:val="TOC2"/>
-            <w:tabs>
-              <w:tab w:val="right" w:leader="dot" w:pos="9016"/>
-            </w:tabs>
-            <w:rPr>
-              <w:rFonts w:eastAsiaTheme="minorEastAsia"/>
-              <w:noProof/>
-              <w:sz w:val="24"/>
-              <w:szCs w:val="24"/>
-              <w:lang w:val="en-SE" w:eastAsia="en-SE"/>
-            </w:rPr>
-          </w:pPr>
-          <w:hyperlink w:anchor="_Toc215137014" w:history="1">
-            <w:r>
-              <w:rPr>
-                <w:rStyle w:val="Hyperlink"/>
-                <w:noProof/>
-                <w:lang w:val="sv-SE"/>
-              </w:rPr>
-              <w:t>X. Referenser</w:t>
-            </w:r>
-            <w:r>
-              <w:rPr>
-                <w:noProof/>
-                <w:webHidden/>
-              </w:rPr>
-              <w:tab/>
-            </w:r>
-            <w:r>
-              <w:rPr>
-                <w:noProof/>
-                <w:webHidden/>
-              </w:rPr>
-              <w:fldChar w:fldCharType="begin"/>
-            </w:r>
-            <w:r>
-              <w:rPr>
-                <w:noProof/>
-                <w:webHidden/>
-              </w:rPr>
-              <w:instrText xml:space="preserve"> PAGEREF _Toc215137014 \h </w:instrText>
-            </w:r>
-            <w:r>
-              <w:rPr>
-                <w:noProof/>
-                <w:webHidden/>
-              </w:rPr>
-            </w:r>
-            <w:r>
-              <w:rPr>
-                <w:noProof/>
-                <w:webHidden/>
-              </w:rPr>
-              <w:fldChar w:fldCharType="separate"/>
-            </w:r>
-            <w:r>
-              <w:rPr>
-                <w:noProof/>
-                <w:webHidden/>
-              </w:rPr>
-              <w:t>2</w:t>
+              <w:t>4</w:t>
             </w:r>
             <w:r>
               <w:rPr>
@@ -1017,31 +1703,31 @@
           <w:lang w:val="sv-SE"/>
         </w:rPr>
       </w:pPr>
-      <w:bookmarkStart w:id="0" w:name="_Toc215137004"/>
-      <w:r>
-        <w:rPr>
-          <w:lang w:val="sv-SE"/>
-        </w:rPr>
-        <w:t>Verkt</w:t>
-      </w:r>
-      <w:r>
-        <w:rPr>
-          <w:lang w:val="sv-SE"/>
-        </w:rPr>
-        <w:t>yg-/</w:t>
+      <w:bookmarkStart w:id="0" w:name="_Toc215740454"/>
+      <w:r>
+        <w:rPr>
+          <w:lang w:val="sv-SE"/>
+        </w:rPr>
+        <w:t xml:space="preserve">Presentation av </w:t>
+      </w:r>
+      <w:r>
+        <w:rPr>
+          <w:lang w:val="sv-SE"/>
+        </w:rPr>
+        <w:t>verktyg</w:t>
+      </w:r>
+      <w:r>
+        <w:rPr>
+          <w:lang w:val="sv-SE"/>
+        </w:rPr>
+        <w:t xml:space="preserve">: .NET och </w:t>
       </w:r>
       <w:proofErr w:type="spellStart"/>
       <w:r>
         <w:rPr>
           <w:lang w:val="sv-SE"/>
         </w:rPr>
-        <w:t>projekt</w:t>
-      </w:r>
-      <w:r>
-        <w:rPr>
-          <w:lang w:val="sv-SE"/>
-        </w:rPr>
-        <w:t>spresentation</w:t>
+        <w:t>Azure</w:t>
       </w:r>
       <w:bookmarkEnd w:id="0"/>
       <w:proofErr w:type="spellEnd"/>
@@ -1060,12 +1746,18 @@
           <w:lang w:val="sv-SE"/>
         </w:rPr>
       </w:pPr>
-      <w:bookmarkStart w:id="1" w:name="_Toc215137005"/>
-      <w:r>
-        <w:rPr>
-          <w:lang w:val="sv-SE"/>
-        </w:rPr>
-        <w:t>0. Introduktion</w:t>
+      <w:bookmarkStart w:id="1" w:name="_Toc215740455"/>
+      <w:r>
+        <w:rPr>
+          <w:lang w:val="sv-SE"/>
+        </w:rPr>
+        <w:t>0. In</w:t>
+      </w:r>
+      <w:r>
+        <w:rPr>
+          <w:lang w:val="sv-SE"/>
+        </w:rPr>
+        <w:t>ledning</w:t>
       </w:r>
       <w:bookmarkEnd w:id="1"/>
     </w:p>
@@ -1096,7 +1788,7 @@
         </w:rPr>
         <w:br/>
       </w:r>
-      <w:hyperlink r:id="rId5" w:history="1">
+      <w:hyperlink r:id="rId6" w:history="1">
         <w:r>
           <w:rPr>
             <w:rStyle w:val="Hyperlink"/>
@@ -1166,7 +1858,7 @@
           <w:lang w:val="sv-SE"/>
         </w:rPr>
       </w:pPr>
-      <w:hyperlink r:id="rId6" w:history="1">
+      <w:hyperlink r:id="rId7" w:history="1">
         <w:proofErr w:type="spellStart"/>
         <w:r>
           <w:rPr>
@@ -1199,7 +1891,7 @@
           <w:lang w:val="sv-SE"/>
         </w:rPr>
       </w:pPr>
-      <w:hyperlink r:id="rId7" w:history="1">
+      <w:hyperlink r:id="rId8" w:history="1">
         <w:r>
           <w:rPr>
             <w:rStyle w:val="Hyperlink"/>
@@ -1235,7 +1927,7 @@
           <w:lang w:val="sv-SE"/>
         </w:rPr>
       </w:pPr>
-      <w:bookmarkStart w:id="2" w:name="_Toc215137006"/>
+      <w:bookmarkStart w:id="2" w:name="_Toc215740456"/>
       <w:r>
         <w:rPr>
           <w:lang w:val="sv-SE"/>
@@ -1246,13 +1938,7 @@
         <w:rPr>
           <w:lang w:val="sv-SE"/>
         </w:rPr>
-        <w:t>Projektets</w:t>
-      </w:r>
-      <w:r>
-        <w:rPr>
-          <w:lang w:val="sv-SE"/>
-        </w:rPr>
-        <w:t xml:space="preserve"> syfte och funktion</w:t>
+        <w:t>Översikt av verktygsval och motivering till valen</w:t>
       </w:r>
       <w:bookmarkEnd w:id="2"/>
     </w:p>
@@ -1292,72 +1978,2023 @@
           <w:szCs w:val="24"/>
           <w:lang w:val="sv-SE"/>
         </w:rPr>
-        <w:t xml:space="preserve"> och integrerats i det nya verktyget, </w:t>
+        <w:t xml:space="preserve"> och integrerats i det nya verktyget, medan andra lever kvar i det äldre. På grund av det så arbetar kunden i dagsläget i två system, samtidigt.</w:t>
+      </w:r>
+    </w:p>
+    <w:p>
+      <w:pPr>
+        <w:rPr>
+          <w:rFonts w:ascii="Calibri" w:hAnsi="Calibri" w:cs="Calibri"/>
+          <w:sz w:val="24"/>
+          <w:szCs w:val="24"/>
+          <w:lang w:val="sv-SE"/>
+        </w:rPr>
+      </w:pPr>
+      <w:r>
+        <w:rPr>
+          <w:rFonts w:ascii="Calibri" w:hAnsi="Calibri" w:cs="Calibri"/>
+          <w:sz w:val="24"/>
+          <w:szCs w:val="24"/>
+          <w:lang w:val="sv-SE"/>
+        </w:rPr>
+        <w:t>Mål</w:t>
+      </w:r>
+      <w:r>
+        <w:rPr>
+          <w:rFonts w:ascii="Calibri" w:hAnsi="Calibri" w:cs="Calibri"/>
+          <w:sz w:val="24"/>
+          <w:szCs w:val="24"/>
+          <w:lang w:val="sv-SE"/>
+        </w:rPr>
+        <w:t>et</w:t>
+      </w:r>
+      <w:r>
+        <w:rPr>
+          <w:rFonts w:ascii="Calibri" w:hAnsi="Calibri" w:cs="Calibri"/>
+          <w:sz w:val="24"/>
+          <w:szCs w:val="24"/>
+          <w:lang w:val="sv-SE"/>
+        </w:rPr>
+        <w:t xml:space="preserve"> med detta projekt är att skapa ett </w:t>
+      </w:r>
+      <w:r>
+        <w:rPr>
+          <w:rFonts w:ascii="Calibri" w:hAnsi="Calibri" w:cs="Calibri"/>
+          <w:sz w:val="24"/>
+          <w:szCs w:val="24"/>
+          <w:lang w:val="sv-SE"/>
+        </w:rPr>
+        <w:t>gränssnitt</w:t>
+      </w:r>
+      <w:r>
+        <w:rPr>
+          <w:rFonts w:ascii="Calibri" w:hAnsi="Calibri" w:cs="Calibri"/>
+          <w:sz w:val="24"/>
+          <w:szCs w:val="24"/>
+          <w:lang w:val="sv-SE"/>
+        </w:rPr>
+        <w:t xml:space="preserve"> för att kunna hantera båda systemen inom samma flöde, </w:t>
+      </w:r>
+      <w:r>
+        <w:rPr>
+          <w:rFonts w:ascii="Calibri" w:hAnsi="Calibri" w:cs="Calibri"/>
+          <w:sz w:val="24"/>
+          <w:szCs w:val="24"/>
+          <w:lang w:val="sv-SE"/>
+        </w:rPr>
+        <w:t>den tekniska lösningen</w:t>
+      </w:r>
+      <w:r>
+        <w:rPr>
+          <w:rFonts w:ascii="Calibri" w:hAnsi="Calibri" w:cs="Calibri"/>
+          <w:sz w:val="24"/>
+          <w:szCs w:val="24"/>
+          <w:lang w:val="sv-SE"/>
+        </w:rPr>
+        <w:t xml:space="preserve"> blir ett</w:t>
+      </w:r>
+      <w:r>
+        <w:rPr>
+          <w:rFonts w:ascii="Calibri" w:hAnsi="Calibri" w:cs="Calibri"/>
+          <w:sz w:val="24"/>
+          <w:szCs w:val="24"/>
+          <w:lang w:val="sv-SE"/>
+        </w:rPr>
+        <w:t xml:space="preserve"> verktyg för att successivt kunna flytta över funktionalitet från det gamla till det nya systemet.</w:t>
+      </w:r>
+    </w:p>
+    <w:p>
+      <w:pPr>
+        <w:rPr>
+          <w:rFonts w:ascii="Calibri" w:hAnsi="Calibri" w:cs="Calibri"/>
+          <w:sz w:val="24"/>
+          <w:szCs w:val="24"/>
+          <w:lang w:val="sv-SE"/>
+        </w:rPr>
+      </w:pPr>
+      <w:r>
+        <w:rPr>
+          <w:rFonts w:ascii="Calibri" w:hAnsi="Calibri" w:cs="Calibri"/>
+          <w:sz w:val="24"/>
+          <w:szCs w:val="24"/>
+          <w:lang w:val="sv-SE"/>
+        </w:rPr>
+        <w:t xml:space="preserve">För att inte behöva bygga två fullständiga parallella system, så väljer jag att simulera den här </w:t>
+      </w:r>
+      <w:proofErr w:type="spellStart"/>
+      <w:r>
+        <w:rPr>
+          <w:rFonts w:ascii="Calibri" w:hAnsi="Calibri" w:cs="Calibri"/>
+          <w:sz w:val="24"/>
+          <w:szCs w:val="24"/>
+          <w:lang w:val="sv-SE"/>
+        </w:rPr>
+        <w:t>refaktoreringen</w:t>
+      </w:r>
+      <w:proofErr w:type="spellEnd"/>
+      <w:r>
+        <w:rPr>
+          <w:rFonts w:ascii="Calibri" w:hAnsi="Calibri" w:cs="Calibri"/>
+          <w:sz w:val="24"/>
+          <w:szCs w:val="24"/>
+          <w:lang w:val="sv-SE"/>
+        </w:rPr>
+        <w:t xml:space="preserve"> och hanteringen genom att bygga ett system som kan byta mellan de två systemen genom en </w:t>
+      </w:r>
+      <w:proofErr w:type="spellStart"/>
+      <w:r>
+        <w:rPr>
+          <w:rFonts w:ascii="Calibri" w:hAnsi="Calibri" w:cs="Calibri"/>
+          <w:sz w:val="24"/>
+          <w:szCs w:val="24"/>
+          <w:lang w:val="sv-SE"/>
+        </w:rPr>
+        <w:t>toggle</w:t>
+      </w:r>
+      <w:proofErr w:type="spellEnd"/>
+      <w:r>
+        <w:rPr>
+          <w:rFonts w:ascii="Calibri" w:hAnsi="Calibri" w:cs="Calibri"/>
+          <w:sz w:val="24"/>
+          <w:szCs w:val="24"/>
+          <w:lang w:val="sv-SE"/>
+        </w:rPr>
+        <w:t xml:space="preserve"> switch.</w:t>
+      </w:r>
+    </w:p>
+    <w:p>
+      <w:pPr>
+        <w:rPr>
+          <w:rFonts w:ascii="Calibri" w:hAnsi="Calibri" w:cs="Calibri"/>
+          <w:sz w:val="24"/>
+          <w:szCs w:val="24"/>
+          <w:lang w:val="sv-SE"/>
+        </w:rPr>
+      </w:pPr>
+      <w:r>
+        <w:rPr>
+          <w:rFonts w:ascii="Calibri" w:hAnsi="Calibri" w:cs="Calibri"/>
+          <w:sz w:val="24"/>
+          <w:szCs w:val="24"/>
+          <w:lang w:val="sv-SE"/>
+        </w:rPr>
+        <w:t xml:space="preserve">Som huvudsakliga verktyg har jag valt .NET som helhetslösning för koden, </w:t>
+      </w:r>
+      <w:proofErr w:type="spellStart"/>
+      <w:r>
+        <w:rPr>
+          <w:rFonts w:ascii="Calibri" w:hAnsi="Calibri" w:cs="Calibri"/>
+          <w:sz w:val="24"/>
+          <w:szCs w:val="24"/>
+          <w:lang w:val="sv-SE"/>
+        </w:rPr>
+        <w:t>CosmosDB</w:t>
+      </w:r>
+      <w:proofErr w:type="spellEnd"/>
+      <w:r>
+        <w:rPr>
+          <w:rFonts w:ascii="Calibri" w:hAnsi="Calibri" w:cs="Calibri"/>
+          <w:sz w:val="24"/>
+          <w:szCs w:val="24"/>
+          <w:lang w:val="sv-SE"/>
+        </w:rPr>
+        <w:t xml:space="preserve"> som databas och </w:t>
+      </w:r>
+      <w:proofErr w:type="spellStart"/>
+      <w:r>
+        <w:rPr>
+          <w:rFonts w:ascii="Calibri" w:hAnsi="Calibri" w:cs="Calibri"/>
+          <w:sz w:val="24"/>
+          <w:szCs w:val="24"/>
+          <w:lang w:val="sv-SE"/>
+        </w:rPr>
+        <w:t>Azure</w:t>
+      </w:r>
+      <w:proofErr w:type="spellEnd"/>
+      <w:r>
+        <w:rPr>
+          <w:rFonts w:ascii="Calibri" w:hAnsi="Calibri" w:cs="Calibri"/>
+          <w:sz w:val="24"/>
+          <w:szCs w:val="24"/>
+          <w:lang w:val="sv-SE"/>
+        </w:rPr>
+        <w:t xml:space="preserve"> för molnlösningarna. Skälet till val av verktyg är helt enkelt att det är de verktyg som kunden använder redan idag.</w:t>
+      </w:r>
+    </w:p>
+    <w:p>
+      <w:pPr>
+        <w:rPr>
+          <w:rFonts w:ascii="Calibri" w:hAnsi="Calibri" w:cs="Calibri"/>
+          <w:sz w:val="24"/>
+          <w:szCs w:val="24"/>
+          <w:lang w:val="sv-SE"/>
+        </w:rPr>
+      </w:pPr>
+    </w:p>
+    <w:p>
+      <w:pPr>
+        <w:pStyle w:val="Heading2"/>
+        <w:rPr>
+          <w:lang w:val="sv-SE"/>
+        </w:rPr>
+      </w:pPr>
+      <w:bookmarkStart w:id="3" w:name="_Toc215740457"/>
+      <w:r>
+        <w:rPr>
+          <w:lang w:val="sv-SE"/>
+        </w:rPr>
+        <w:t xml:space="preserve">2. </w:t>
+      </w:r>
+      <w:r>
+        <w:rPr>
+          <w:lang w:val="sv-SE"/>
+        </w:rPr>
+        <w:t xml:space="preserve">.NET och </w:t>
+      </w:r>
+      <w:proofErr w:type="spellStart"/>
+      <w:r>
+        <w:rPr>
+          <w:lang w:val="sv-SE"/>
+        </w:rPr>
+        <w:t>Blazor</w:t>
+      </w:r>
+      <w:proofErr w:type="spellEnd"/>
+      <w:r>
+        <w:rPr>
+          <w:lang w:val="sv-SE"/>
+        </w:rPr>
+        <w:t xml:space="preserve"> Server</w:t>
+      </w:r>
+      <w:r>
+        <w:rPr>
+          <w:lang w:val="sv-SE"/>
+        </w:rPr>
+        <w:t xml:space="preserve"> (mjukvarukod, </w:t>
+      </w:r>
+      <w:proofErr w:type="spellStart"/>
+      <w:r>
+        <w:rPr>
+          <w:lang w:val="sv-SE"/>
+        </w:rPr>
+        <w:t>backend</w:t>
+      </w:r>
+      <w:proofErr w:type="spellEnd"/>
+      <w:r>
+        <w:rPr>
+          <w:lang w:val="sv-SE"/>
+        </w:rPr>
+        <w:t xml:space="preserve"> och webfront)</w:t>
+      </w:r>
+      <w:bookmarkEnd w:id="3"/>
+    </w:p>
+    <w:p>
+      <w:pPr>
+        <w:rPr>
+          <w:rFonts w:ascii="Calibri" w:hAnsi="Calibri" w:cs="Calibri"/>
+          <w:sz w:val="24"/>
+          <w:szCs w:val="24"/>
+          <w:lang w:val="sv-SE"/>
+        </w:rPr>
+      </w:pPr>
+      <w:r>
+        <w:rPr>
+          <w:rFonts w:ascii="Calibri" w:hAnsi="Calibri" w:cs="Calibri"/>
+          <w:sz w:val="24"/>
+          <w:szCs w:val="24"/>
+          <w:lang w:val="sv-SE"/>
+        </w:rPr>
+        <w:t xml:space="preserve">Verktyget är </w:t>
+      </w:r>
+      <w:r>
+        <w:rPr>
+          <w:rFonts w:ascii="Calibri" w:hAnsi="Calibri" w:cs="Calibri"/>
+          <w:sz w:val="24"/>
+          <w:szCs w:val="24"/>
+          <w:lang w:val="sv-SE"/>
+        </w:rPr>
+        <w:t>framför allt</w:t>
+      </w:r>
+      <w:r>
+        <w:rPr>
+          <w:rFonts w:ascii="Calibri" w:hAnsi="Calibri" w:cs="Calibri"/>
+          <w:sz w:val="24"/>
+          <w:szCs w:val="24"/>
+          <w:lang w:val="sv-SE"/>
+        </w:rPr>
+        <w:t xml:space="preserve"> till för utvecklare som i dagsläget använder båda systemen samtidigt. Användare av kundens applikation ser inte vilket </w:t>
+      </w:r>
+      <w:r>
+        <w:rPr>
+          <w:rFonts w:ascii="Calibri" w:hAnsi="Calibri" w:cs="Calibri"/>
+          <w:sz w:val="24"/>
+          <w:szCs w:val="24"/>
+          <w:lang w:val="sv-SE"/>
+        </w:rPr>
+        <w:t xml:space="preserve">av </w:t>
+      </w:r>
+      <w:r>
+        <w:rPr>
+          <w:rFonts w:ascii="Calibri" w:hAnsi="Calibri" w:cs="Calibri"/>
+          <w:sz w:val="24"/>
+          <w:szCs w:val="24"/>
+          <w:lang w:val="sv-SE"/>
+        </w:rPr>
+        <w:t>systeme</w:t>
+      </w:r>
+      <w:r>
+        <w:rPr>
+          <w:rFonts w:ascii="Calibri" w:hAnsi="Calibri" w:cs="Calibri"/>
+          <w:sz w:val="24"/>
+          <w:szCs w:val="24"/>
+          <w:lang w:val="sv-SE"/>
+        </w:rPr>
+        <w:t>n</w:t>
+      </w:r>
+      <w:r>
+        <w:rPr>
+          <w:rFonts w:ascii="Calibri" w:hAnsi="Calibri" w:cs="Calibri"/>
+          <w:sz w:val="24"/>
+          <w:szCs w:val="24"/>
+          <w:lang w:val="sv-SE"/>
+        </w:rPr>
+        <w:t xml:space="preserve"> de använder, men utvecklare har en miljö där de byter mellan systemen.</w:t>
+      </w:r>
+    </w:p>
+    <w:p>
+      <w:pPr>
+        <w:rPr>
+          <w:rFonts w:ascii="Calibri" w:hAnsi="Calibri" w:cs="Calibri"/>
+          <w:sz w:val="24"/>
+          <w:szCs w:val="24"/>
+          <w:lang w:val="sv-SE"/>
+        </w:rPr>
+      </w:pPr>
+      <w:r>
+        <w:rPr>
+          <w:rFonts w:ascii="Calibri" w:hAnsi="Calibri" w:cs="Calibri"/>
+          <w:sz w:val="24"/>
+          <w:szCs w:val="24"/>
+          <w:lang w:val="sv-SE"/>
+        </w:rPr>
+        <w:t xml:space="preserve">Tanken är att utvecklarna skall kunna använda detta projekts verktyg genom att knyta ihop de två systemen, kunna </w:t>
+      </w:r>
+      <w:proofErr w:type="spellStart"/>
+      <w:r>
+        <w:rPr>
+          <w:rFonts w:ascii="Calibri" w:hAnsi="Calibri" w:cs="Calibri"/>
+          <w:sz w:val="24"/>
+          <w:szCs w:val="24"/>
+          <w:lang w:val="sv-SE"/>
+        </w:rPr>
+        <w:t>refaktorera</w:t>
+      </w:r>
+      <w:proofErr w:type="spellEnd"/>
+      <w:r>
+        <w:rPr>
+          <w:rFonts w:ascii="Calibri" w:hAnsi="Calibri" w:cs="Calibri"/>
+          <w:sz w:val="24"/>
+          <w:szCs w:val="24"/>
+          <w:lang w:val="sv-SE"/>
+        </w:rPr>
+        <w:t xml:space="preserve"> kod från det gamla systemet och successivt föra över funktionalitet till det nya, utan att behöva ta ner huvudapplikationen.</w:t>
+      </w:r>
+    </w:p>
+    <w:p>
+      <w:pPr>
+        <w:rPr>
+          <w:rFonts w:ascii="Calibri" w:hAnsi="Calibri" w:cs="Calibri"/>
+          <w:sz w:val="24"/>
+          <w:szCs w:val="24"/>
+          <w:lang w:val="sv-SE"/>
+        </w:rPr>
+      </w:pPr>
+      <w:r>
+        <w:rPr>
+          <w:rFonts w:ascii="Calibri" w:hAnsi="Calibri" w:cs="Calibri"/>
+          <w:sz w:val="24"/>
+          <w:szCs w:val="24"/>
+          <w:lang w:val="sv-SE"/>
+        </w:rPr>
+        <w:t>Verktygen blir även en backup-lösning som kan styra om trafiken till det ena eller det andra systemet, om problem uppstår vid uppgradering/</w:t>
+      </w:r>
+      <w:proofErr w:type="spellStart"/>
+      <w:r>
+        <w:rPr>
+          <w:rFonts w:ascii="Calibri" w:hAnsi="Calibri" w:cs="Calibri"/>
+          <w:sz w:val="24"/>
+          <w:szCs w:val="24"/>
+          <w:lang w:val="sv-SE"/>
+        </w:rPr>
+        <w:t>refaktorering</w:t>
+      </w:r>
+      <w:proofErr w:type="spellEnd"/>
+      <w:r>
+        <w:rPr>
+          <w:rFonts w:ascii="Calibri" w:hAnsi="Calibri" w:cs="Calibri"/>
+          <w:sz w:val="24"/>
+          <w:szCs w:val="24"/>
+          <w:lang w:val="sv-SE"/>
+        </w:rPr>
+        <w:t>.</w:t>
+      </w:r>
+    </w:p>
+    <w:p>
+      <w:pPr>
+        <w:pStyle w:val="Heading3"/>
+        <w:rPr>
+          <w:lang w:val="sv-SE"/>
+        </w:rPr>
+      </w:pPr>
+      <w:bookmarkStart w:id="4" w:name="_Toc215740458"/>
+      <w:r>
+        <w:rPr>
+          <w:lang w:val="sv-SE"/>
+        </w:rPr>
+        <w:t>2.1 .NET</w:t>
+      </w:r>
+      <w:bookmarkEnd w:id="4"/>
+    </w:p>
+    <w:p>
+      <w:pPr>
+        <w:rPr>
+          <w:rFonts w:ascii="Calibri" w:hAnsi="Calibri" w:cs="Calibri"/>
+          <w:sz w:val="24"/>
+          <w:szCs w:val="24"/>
+          <w:lang w:val="sv-SE"/>
+        </w:rPr>
+      </w:pPr>
+      <w:r>
+        <w:rPr>
+          <w:rFonts w:ascii="Calibri" w:hAnsi="Calibri" w:cs="Calibri"/>
+          <w:sz w:val="24"/>
+          <w:szCs w:val="24"/>
+          <w:lang w:val="sv-SE"/>
+        </w:rPr>
+        <w:t>.NET är en helhetslösning i en utvecklingsmiljö där programspråket är C# (Uttalas C-</w:t>
+      </w:r>
+      <w:proofErr w:type="spellStart"/>
+      <w:r>
+        <w:rPr>
+          <w:rFonts w:ascii="Calibri" w:hAnsi="Calibri" w:cs="Calibri"/>
+          <w:sz w:val="24"/>
+          <w:szCs w:val="24"/>
+          <w:lang w:val="sv-SE"/>
+        </w:rPr>
+        <w:t>sharp</w:t>
+      </w:r>
+      <w:proofErr w:type="spellEnd"/>
+      <w:r>
+        <w:rPr>
+          <w:rFonts w:ascii="Calibri" w:hAnsi="Calibri" w:cs="Calibri"/>
+          <w:sz w:val="24"/>
+          <w:szCs w:val="24"/>
+          <w:lang w:val="sv-SE"/>
+        </w:rPr>
+        <w:t>). Inom den miljön finns olika verktyg och lösningar för att knyta ihop alla olika element i en modern applikation.</w:t>
+      </w:r>
+      <w:r>
+        <w:rPr>
+          <w:rFonts w:ascii="Calibri" w:hAnsi="Calibri" w:cs="Calibri"/>
+          <w:sz w:val="24"/>
+          <w:szCs w:val="24"/>
+          <w:lang w:val="sv-SE"/>
+        </w:rPr>
+        <w:t xml:space="preserve"> I detta projekt så byggs flera separata enheter som har sina egna funktioner och roller:</w:t>
+      </w:r>
+    </w:p>
+    <w:p>
+      <w:pPr>
+        <w:pStyle w:val="ListParagraph"/>
+        <w:numPr>
+          <w:ilvl w:val="0"/>
+          <w:numId w:val="1"/>
+        </w:numPr>
+        <w:rPr>
+          <w:rFonts w:ascii="Calibri" w:hAnsi="Calibri" w:cs="Calibri"/>
+          <w:sz w:val="24"/>
+          <w:szCs w:val="24"/>
+          <w:lang w:val="sv-SE"/>
+        </w:rPr>
+      </w:pPr>
+      <w:r>
+        <w:rPr>
+          <w:rFonts w:ascii="Calibri" w:hAnsi="Calibri" w:cs="Calibri"/>
+          <w:sz w:val="24"/>
+          <w:szCs w:val="24"/>
+          <w:lang w:val="sv-SE"/>
+        </w:rPr>
+        <w:t>/</w:t>
+      </w:r>
+      <w:proofErr w:type="spellStart"/>
+      <w:r>
+        <w:rPr>
+          <w:rFonts w:ascii="Calibri" w:hAnsi="Calibri" w:cs="Calibri"/>
+          <w:sz w:val="24"/>
+          <w:szCs w:val="24"/>
+          <w:lang w:val="sv-SE"/>
+        </w:rPr>
+        <w:t>api</w:t>
+      </w:r>
+      <w:proofErr w:type="spellEnd"/>
+      <w:r>
+        <w:rPr>
+          <w:rFonts w:ascii="Calibri" w:hAnsi="Calibri" w:cs="Calibri"/>
+          <w:sz w:val="24"/>
+          <w:szCs w:val="24"/>
+          <w:lang w:val="sv-SE"/>
+        </w:rPr>
+        <w:t>/</w:t>
+      </w:r>
+      <w:proofErr w:type="spellStart"/>
+      <w:r>
+        <w:rPr>
+          <w:rFonts w:ascii="Calibri" w:hAnsi="Calibri" w:cs="Calibri"/>
+          <w:sz w:val="24"/>
+          <w:szCs w:val="24"/>
+          <w:lang w:val="sv-SE"/>
+        </w:rPr>
+        <w:t>Ticketing.Api</w:t>
+      </w:r>
+      <w:proofErr w:type="spellEnd"/>
+      <w:r>
+        <w:rPr>
+          <w:rFonts w:ascii="Calibri" w:hAnsi="Calibri" w:cs="Calibri"/>
+          <w:sz w:val="24"/>
+          <w:szCs w:val="24"/>
+          <w:lang w:val="sv-SE"/>
+        </w:rPr>
+        <w:t xml:space="preserve"> </w:t>
+      </w:r>
+      <w:r>
+        <w:rPr>
+          <w:rFonts w:ascii="Calibri" w:hAnsi="Calibri" w:cs="Calibri"/>
+          <w:sz w:val="24"/>
+          <w:szCs w:val="24"/>
+          <w:lang w:val="sv-SE"/>
+        </w:rPr>
+        <w:t xml:space="preserve">- </w:t>
+      </w:r>
+      <w:r>
+        <w:rPr>
+          <w:rFonts w:ascii="Calibri" w:hAnsi="Calibri" w:cs="Calibri"/>
+          <w:sz w:val="24"/>
+          <w:szCs w:val="24"/>
+          <w:lang w:val="sv-SE"/>
+        </w:rPr>
+        <w:t>är själva grundstommen som</w:t>
+      </w:r>
+    </w:p>
+    <w:p>
+      <w:pPr>
+        <w:pStyle w:val="ListParagraph"/>
+        <w:numPr>
+          <w:ilvl w:val="0"/>
+          <w:numId w:val="1"/>
+        </w:numPr>
+        <w:rPr>
+          <w:rFonts w:ascii="Calibri" w:hAnsi="Calibri" w:cs="Calibri"/>
+          <w:sz w:val="24"/>
+          <w:szCs w:val="24"/>
+        </w:rPr>
+      </w:pPr>
+      <w:r>
+        <w:rPr>
+          <w:rFonts w:ascii="Calibri" w:hAnsi="Calibri" w:cs="Calibri"/>
+          <w:sz w:val="24"/>
+          <w:szCs w:val="24"/>
+        </w:rPr>
+        <w:t>/functions/</w:t>
+      </w:r>
+      <w:proofErr w:type="spellStart"/>
+      <w:r>
+        <w:rPr>
+          <w:rFonts w:ascii="Calibri" w:hAnsi="Calibri" w:cs="Calibri"/>
+          <w:sz w:val="24"/>
+          <w:szCs w:val="24"/>
+        </w:rPr>
+        <w:t>Ticketing.Functions</w:t>
+      </w:r>
+      <w:proofErr w:type="spellEnd"/>
+      <w:r>
+        <w:rPr>
+          <w:rFonts w:ascii="Calibri" w:hAnsi="Calibri" w:cs="Calibri"/>
+          <w:sz w:val="24"/>
+          <w:szCs w:val="24"/>
+        </w:rPr>
+        <w:t xml:space="preserve"> - meow</w:t>
+      </w:r>
+    </w:p>
+    <w:p>
+      <w:pPr>
+        <w:pStyle w:val="ListParagraph"/>
+        <w:numPr>
+          <w:ilvl w:val="0"/>
+          <w:numId w:val="1"/>
+        </w:numPr>
+        <w:rPr>
+          <w:rFonts w:ascii="Calibri" w:hAnsi="Calibri" w:cs="Calibri"/>
+          <w:sz w:val="24"/>
+          <w:szCs w:val="24"/>
+        </w:rPr>
+      </w:pPr>
+      <w:r>
+        <w:rPr>
+          <w:rFonts w:ascii="Calibri" w:hAnsi="Calibri" w:cs="Calibri"/>
+          <w:sz w:val="24"/>
+          <w:szCs w:val="24"/>
+        </w:rPr>
+        <w:t>/shared/</w:t>
+      </w:r>
+      <w:proofErr w:type="spellStart"/>
+      <w:r>
+        <w:rPr>
+          <w:rFonts w:ascii="Calibri" w:hAnsi="Calibri" w:cs="Calibri"/>
+          <w:sz w:val="24"/>
+          <w:szCs w:val="24"/>
+        </w:rPr>
+        <w:t>Ticketing.Contracts</w:t>
+      </w:r>
+      <w:proofErr w:type="spellEnd"/>
+      <w:r>
+        <w:rPr>
+          <w:rFonts w:ascii="Calibri" w:hAnsi="Calibri" w:cs="Calibri"/>
+          <w:sz w:val="24"/>
+          <w:szCs w:val="24"/>
+        </w:rPr>
+        <w:t xml:space="preserve"> - </w:t>
+      </w:r>
+    </w:p>
+    <w:p>
+      <w:pPr>
+        <w:pStyle w:val="ListParagraph"/>
+        <w:numPr>
+          <w:ilvl w:val="0"/>
+          <w:numId w:val="1"/>
+        </w:numPr>
+        <w:rPr>
+          <w:rFonts w:ascii="Calibri" w:hAnsi="Calibri" w:cs="Calibri"/>
+          <w:sz w:val="24"/>
+          <w:szCs w:val="24"/>
+        </w:rPr>
+      </w:pPr>
+      <w:r>
+        <w:rPr>
+          <w:rFonts w:ascii="Calibri" w:hAnsi="Calibri" w:cs="Calibri"/>
+          <w:sz w:val="24"/>
+          <w:szCs w:val="24"/>
+        </w:rPr>
+        <w:t>/tests/</w:t>
+      </w:r>
+      <w:proofErr w:type="spellStart"/>
+      <w:r>
+        <w:rPr>
+          <w:rFonts w:ascii="Calibri" w:hAnsi="Calibri" w:cs="Calibri"/>
+          <w:sz w:val="24"/>
+          <w:szCs w:val="24"/>
+        </w:rPr>
+        <w:t>Ticketing.Web.Tests</w:t>
+      </w:r>
+      <w:proofErr w:type="spellEnd"/>
+      <w:r>
+        <w:rPr>
+          <w:rFonts w:ascii="Calibri" w:hAnsi="Calibri" w:cs="Calibri"/>
+          <w:sz w:val="24"/>
+          <w:szCs w:val="24"/>
+        </w:rPr>
+        <w:t xml:space="preserve"> - </w:t>
+      </w:r>
+    </w:p>
+    <w:p>
+      <w:pPr>
+        <w:pStyle w:val="Heading3"/>
+      </w:pPr>
+      <w:bookmarkStart w:id="5" w:name="_Toc215740459"/>
+      <w:r>
+        <w:lastRenderedPageBreak/>
+        <w:t>2.2 Blazor Server</w:t>
+      </w:r>
+      <w:bookmarkEnd w:id="5"/>
+    </w:p>
+    <w:p>
+      <w:pPr>
+        <w:rPr>
+          <w:rFonts w:ascii="Calibri" w:hAnsi="Calibri" w:cs="Calibri"/>
+          <w:sz w:val="24"/>
+          <w:szCs w:val="24"/>
+          <w:lang w:val="sv-SE"/>
+        </w:rPr>
+      </w:pPr>
+      <w:proofErr w:type="spellStart"/>
+      <w:r>
+        <w:rPr>
+          <w:rFonts w:ascii="Calibri" w:hAnsi="Calibri" w:cs="Calibri"/>
+          <w:sz w:val="24"/>
+          <w:szCs w:val="24"/>
+          <w:lang w:val="sv-SE"/>
+        </w:rPr>
+        <w:t>Blazor</w:t>
+      </w:r>
+      <w:proofErr w:type="spellEnd"/>
+      <w:r>
+        <w:rPr>
+          <w:rFonts w:ascii="Calibri" w:hAnsi="Calibri" w:cs="Calibri"/>
+          <w:sz w:val="24"/>
+          <w:szCs w:val="24"/>
+          <w:lang w:val="sv-SE"/>
+        </w:rPr>
+        <w:t xml:space="preserve"> Server hanterar webfronten, det</w:t>
+      </w:r>
+      <w:r>
+        <w:rPr>
+          <w:rFonts w:ascii="Calibri" w:hAnsi="Calibri" w:cs="Calibri"/>
+          <w:sz w:val="24"/>
+          <w:szCs w:val="24"/>
+          <w:lang w:val="sv-SE"/>
+        </w:rPr>
+        <w:t xml:space="preserve"> du ser på själva hemsidan. </w:t>
+      </w:r>
+      <w:proofErr w:type="spellStart"/>
+      <w:r>
+        <w:rPr>
+          <w:rFonts w:ascii="Calibri" w:hAnsi="Calibri" w:cs="Calibri"/>
+          <w:sz w:val="24"/>
+          <w:szCs w:val="24"/>
+          <w:lang w:val="sv-SE"/>
+        </w:rPr>
+        <w:t>Blazor</w:t>
+      </w:r>
+      <w:proofErr w:type="spellEnd"/>
+      <w:r>
+        <w:rPr>
+          <w:rFonts w:ascii="Calibri" w:hAnsi="Calibri" w:cs="Calibri"/>
+          <w:sz w:val="24"/>
+          <w:szCs w:val="24"/>
+          <w:lang w:val="sv-SE"/>
+        </w:rPr>
+        <w:t xml:space="preserve"> är baserat på </w:t>
+      </w:r>
+      <w:proofErr w:type="spellStart"/>
+      <w:r>
+        <w:rPr>
+          <w:rFonts w:ascii="Calibri" w:hAnsi="Calibri" w:cs="Calibri"/>
+          <w:sz w:val="24"/>
+          <w:szCs w:val="24"/>
+          <w:lang w:val="sv-SE"/>
+        </w:rPr>
+        <w:t>Razor</w:t>
+      </w:r>
+      <w:proofErr w:type="spellEnd"/>
+      <w:r>
+        <w:rPr>
+          <w:rFonts w:ascii="Calibri" w:hAnsi="Calibri" w:cs="Calibri"/>
+          <w:sz w:val="24"/>
+          <w:szCs w:val="24"/>
+          <w:lang w:val="sv-SE"/>
+        </w:rPr>
+        <w:t>, vilket ger oss verktyg för att skriva C#-kod i samma kodfiler där vi redan har ren HTML-kod.</w:t>
+      </w:r>
+    </w:p>
+    <w:p>
+      <w:pPr>
+        <w:pStyle w:val="ListParagraph"/>
+        <w:numPr>
+          <w:ilvl w:val="0"/>
+          <w:numId w:val="2"/>
+        </w:numPr>
+        <w:rPr>
+          <w:rFonts w:ascii="Calibri" w:hAnsi="Calibri" w:cs="Calibri"/>
+          <w:sz w:val="24"/>
+          <w:szCs w:val="24"/>
+          <w:lang w:val="sv-SE"/>
+        </w:rPr>
+      </w:pPr>
+      <w:r>
+        <w:rPr>
+          <w:rFonts w:ascii="Calibri" w:hAnsi="Calibri" w:cs="Calibri"/>
+          <w:sz w:val="24"/>
+          <w:szCs w:val="24"/>
+          <w:lang w:val="sv-SE"/>
+        </w:rPr>
+        <w:t>/web/</w:t>
+      </w:r>
+      <w:proofErr w:type="spellStart"/>
+      <w:r>
+        <w:rPr>
+          <w:rFonts w:ascii="Calibri" w:hAnsi="Calibri" w:cs="Calibri"/>
+          <w:sz w:val="24"/>
+          <w:szCs w:val="24"/>
+          <w:lang w:val="sv-SE"/>
+        </w:rPr>
+        <w:t>Ticketing.Web</w:t>
+      </w:r>
+      <w:proofErr w:type="spellEnd"/>
+    </w:p>
+    <w:p>
+      <w:pPr>
+        <w:rPr>
+          <w:lang w:val="sv-SE"/>
+        </w:rPr>
+      </w:pPr>
+    </w:p>
+    <w:p>
+      <w:pPr>
+        <w:pStyle w:val="Heading2"/>
+        <w:rPr>
+          <w:lang w:val="sv-SE"/>
+        </w:rPr>
+      </w:pPr>
+      <w:bookmarkStart w:id="6" w:name="_Toc215740460"/>
+      <w:r>
+        <w:rPr>
+          <w:lang w:val="sv-SE"/>
+        </w:rPr>
+        <w:t xml:space="preserve">3. </w:t>
+      </w:r>
+      <w:proofErr w:type="spellStart"/>
+      <w:r>
+        <w:rPr>
+          <w:lang w:val="sv-SE"/>
+        </w:rPr>
+        <w:t>Azure</w:t>
+      </w:r>
+      <w:proofErr w:type="spellEnd"/>
+      <w:r>
+        <w:rPr>
+          <w:lang w:val="sv-SE"/>
+        </w:rPr>
+        <w:t xml:space="preserve"> och </w:t>
+      </w:r>
+      <w:proofErr w:type="spellStart"/>
+      <w:r>
+        <w:rPr>
+          <w:lang w:val="sv-SE"/>
+        </w:rPr>
+        <w:t>CosmosDB</w:t>
+      </w:r>
+      <w:proofErr w:type="spellEnd"/>
+      <w:r>
+        <w:rPr>
+          <w:lang w:val="sv-SE"/>
+        </w:rPr>
+        <w:t xml:space="preserve"> (molntjänster och databas)</w:t>
+      </w:r>
+      <w:bookmarkEnd w:id="6"/>
+    </w:p>
+    <w:p>
+      <w:pPr>
+        <w:rPr>
+          <w:rFonts w:ascii="Calibri" w:hAnsi="Calibri" w:cs="Calibri"/>
+          <w:sz w:val="24"/>
+          <w:szCs w:val="24"/>
+          <w:lang w:val="sv-SE"/>
+        </w:rPr>
+      </w:pPr>
+      <w:r>
+        <w:rPr>
+          <w:rFonts w:ascii="Calibri" w:hAnsi="Calibri" w:cs="Calibri"/>
+          <w:sz w:val="24"/>
+          <w:szCs w:val="24"/>
+          <w:lang w:val="sv-SE"/>
+        </w:rPr>
+        <w:t xml:space="preserve">Introduktion – </w:t>
+      </w:r>
+      <w:proofErr w:type="spellStart"/>
+      <w:r>
+        <w:rPr>
+          <w:rFonts w:ascii="Calibri" w:hAnsi="Calibri" w:cs="Calibri"/>
+          <w:sz w:val="24"/>
+          <w:szCs w:val="24"/>
+          <w:lang w:val="sv-SE"/>
+        </w:rPr>
+        <w:t>Lorum</w:t>
+      </w:r>
+      <w:proofErr w:type="spellEnd"/>
+      <w:r>
+        <w:rPr>
+          <w:rFonts w:ascii="Calibri" w:hAnsi="Calibri" w:cs="Calibri"/>
+          <w:sz w:val="24"/>
+          <w:szCs w:val="24"/>
+          <w:lang w:val="sv-SE"/>
+        </w:rPr>
+        <w:t xml:space="preserve"> </w:t>
+      </w:r>
+      <w:proofErr w:type="spellStart"/>
+      <w:r>
+        <w:rPr>
+          <w:rFonts w:ascii="Calibri" w:hAnsi="Calibri" w:cs="Calibri"/>
+          <w:sz w:val="24"/>
+          <w:szCs w:val="24"/>
+          <w:lang w:val="sv-SE"/>
+        </w:rPr>
+        <w:t>Ipsum</w:t>
+      </w:r>
+      <w:proofErr w:type="spellEnd"/>
+    </w:p>
+    <w:p>
+      <w:pPr>
+        <w:pStyle w:val="Heading3"/>
+        <w:rPr>
+          <w:lang w:val="sv-SE"/>
+        </w:rPr>
+      </w:pPr>
+      <w:bookmarkStart w:id="7" w:name="_Toc215740461"/>
+      <w:r>
+        <w:rPr>
+          <w:lang w:val="sv-SE"/>
+        </w:rPr>
+        <w:t xml:space="preserve">3.1 </w:t>
+      </w:r>
+      <w:proofErr w:type="spellStart"/>
+      <w:r>
+        <w:rPr>
+          <w:lang w:val="sv-SE"/>
+        </w:rPr>
+        <w:t>Azure</w:t>
+      </w:r>
+      <w:bookmarkEnd w:id="7"/>
+      <w:proofErr w:type="spellEnd"/>
+      <w:r>
+        <w:rPr>
+          <w:lang w:val="sv-SE"/>
+        </w:rPr>
+        <w:t xml:space="preserve"> Service Bus</w:t>
+      </w:r>
+    </w:p>
+    <w:p>
+      <w:pPr>
+        <w:rPr>
+          <w:rFonts w:ascii="Calibri" w:hAnsi="Calibri" w:cs="Calibri"/>
+          <w:sz w:val="24"/>
+          <w:szCs w:val="24"/>
+          <w:lang w:val="sv-SE"/>
+        </w:rPr>
+      </w:pPr>
+      <w:proofErr w:type="spellStart"/>
+      <w:r>
+        <w:rPr>
+          <w:rFonts w:ascii="Calibri" w:hAnsi="Calibri" w:cs="Calibri"/>
+          <w:sz w:val="24"/>
+          <w:szCs w:val="24"/>
+          <w:lang w:val="sv-SE"/>
+        </w:rPr>
+        <w:t>Lorum</w:t>
+      </w:r>
+      <w:proofErr w:type="spellEnd"/>
+      <w:r>
+        <w:rPr>
+          <w:rFonts w:ascii="Calibri" w:hAnsi="Calibri" w:cs="Calibri"/>
+          <w:sz w:val="24"/>
+          <w:szCs w:val="24"/>
+          <w:lang w:val="sv-SE"/>
+        </w:rPr>
+        <w:t xml:space="preserve"> </w:t>
+      </w:r>
+      <w:proofErr w:type="spellStart"/>
+      <w:r>
+        <w:rPr>
+          <w:rFonts w:ascii="Calibri" w:hAnsi="Calibri" w:cs="Calibri"/>
+          <w:sz w:val="24"/>
+          <w:szCs w:val="24"/>
+          <w:lang w:val="sv-SE"/>
+        </w:rPr>
+        <w:t>Ipsum</w:t>
+      </w:r>
+      <w:proofErr w:type="spellEnd"/>
+    </w:p>
+    <w:p>
+      <w:pPr>
+        <w:pStyle w:val="Heading3"/>
+        <w:rPr>
+          <w:lang w:val="sv-SE"/>
+        </w:rPr>
+      </w:pPr>
+      <w:bookmarkStart w:id="8" w:name="_Toc215740462"/>
+      <w:r>
+        <w:rPr>
+          <w:lang w:val="sv-SE"/>
+        </w:rPr>
+        <w:t>3.</w:t>
+      </w:r>
+      <w:r>
+        <w:rPr>
+          <w:lang w:val="sv-SE"/>
+        </w:rPr>
+        <w:t>2</w:t>
+      </w:r>
+      <w:r>
+        <w:rPr>
+          <w:lang w:val="sv-SE"/>
+        </w:rPr>
+        <w:t xml:space="preserve"> </w:t>
+      </w:r>
+      <w:proofErr w:type="spellStart"/>
+      <w:r>
+        <w:rPr>
+          <w:lang w:val="sv-SE"/>
+        </w:rPr>
+        <w:t>Azure</w:t>
+      </w:r>
+      <w:bookmarkEnd w:id="8"/>
+      <w:proofErr w:type="spellEnd"/>
+      <w:r>
+        <w:rPr>
+          <w:lang w:val="sv-SE"/>
+        </w:rPr>
+        <w:t xml:space="preserve"> </w:t>
+      </w:r>
+      <w:proofErr w:type="spellStart"/>
+      <w:r>
+        <w:rPr>
+          <w:lang w:val="sv-SE"/>
+        </w:rPr>
+        <w:t>Functions</w:t>
+      </w:r>
+      <w:proofErr w:type="spellEnd"/>
+    </w:p>
+    <w:p>
+      <w:pPr>
+        <w:rPr>
+          <w:rFonts w:ascii="Calibri" w:hAnsi="Calibri" w:cs="Calibri"/>
+          <w:sz w:val="24"/>
+          <w:szCs w:val="24"/>
+          <w:lang w:val="sv-SE"/>
+        </w:rPr>
+      </w:pPr>
+      <w:proofErr w:type="spellStart"/>
+      <w:r>
+        <w:rPr>
+          <w:rFonts w:ascii="Calibri" w:hAnsi="Calibri" w:cs="Calibri"/>
+          <w:sz w:val="24"/>
+          <w:szCs w:val="24"/>
+          <w:lang w:val="sv-SE"/>
+        </w:rPr>
+        <w:t>Lorum</w:t>
+      </w:r>
+      <w:proofErr w:type="spellEnd"/>
+      <w:r>
+        <w:rPr>
+          <w:rFonts w:ascii="Calibri" w:hAnsi="Calibri" w:cs="Calibri"/>
+          <w:sz w:val="24"/>
+          <w:szCs w:val="24"/>
+          <w:lang w:val="sv-SE"/>
+        </w:rPr>
+        <w:t xml:space="preserve"> </w:t>
+      </w:r>
+      <w:proofErr w:type="spellStart"/>
+      <w:r>
+        <w:rPr>
+          <w:rFonts w:ascii="Calibri" w:hAnsi="Calibri" w:cs="Calibri"/>
+          <w:sz w:val="24"/>
+          <w:szCs w:val="24"/>
+          <w:lang w:val="sv-SE"/>
+        </w:rPr>
+        <w:t>Ipsum</w:t>
+      </w:r>
+      <w:proofErr w:type="spellEnd"/>
+    </w:p>
+    <w:p>
+      <w:pPr>
+        <w:pStyle w:val="Heading3"/>
+      </w:pPr>
+      <w:bookmarkStart w:id="9" w:name="_Toc215740463"/>
+      <w:r>
+        <w:t>3.</w:t>
+      </w:r>
+      <w:r>
+        <w:t>3</w:t>
+      </w:r>
+      <w:r>
+        <w:t xml:space="preserve"> Azure</w:t>
+      </w:r>
+      <w:bookmarkEnd w:id="9"/>
+      <w:r>
+        <w:t xml:space="preserve"> Application In</w:t>
+      </w:r>
+      <w:r>
+        <w:t>sights</w:t>
+      </w:r>
+    </w:p>
+    <w:p>
+      <w:pPr>
+        <w:rPr>
+          <w:rFonts w:ascii="Calibri" w:hAnsi="Calibri" w:cs="Calibri"/>
+          <w:sz w:val="24"/>
+          <w:szCs w:val="24"/>
+        </w:rPr>
+      </w:pPr>
+      <w:r>
+        <w:rPr>
+          <w:rFonts w:ascii="Calibri" w:hAnsi="Calibri" w:cs="Calibri"/>
+          <w:sz w:val="24"/>
+          <w:szCs w:val="24"/>
+        </w:rPr>
+        <w:t>Lorum Ipsum</w:t>
+      </w:r>
+    </w:p>
+    <w:p>
+      <w:pPr>
+        <w:pStyle w:val="Heading3"/>
+        <w:rPr>
+          <w:lang w:val="sv-SE"/>
+        </w:rPr>
+      </w:pPr>
+      <w:bookmarkStart w:id="10" w:name="_Toc215740464"/>
+      <w:r>
+        <w:rPr>
+          <w:lang w:val="sv-SE"/>
+        </w:rPr>
+        <w:t>3.</w:t>
+      </w:r>
+      <w:r>
+        <w:rPr>
+          <w:lang w:val="sv-SE"/>
+        </w:rPr>
+        <w:t>4</w:t>
+      </w:r>
+      <w:r>
+        <w:rPr>
+          <w:lang w:val="sv-SE"/>
+        </w:rPr>
+        <w:t xml:space="preserve"> </w:t>
+      </w:r>
+      <w:proofErr w:type="spellStart"/>
+      <w:r>
+        <w:rPr>
+          <w:lang w:val="sv-SE"/>
+        </w:rPr>
+        <w:t>Azure</w:t>
+      </w:r>
+      <w:bookmarkEnd w:id="10"/>
+      <w:proofErr w:type="spellEnd"/>
+      <w:r>
+        <w:rPr>
+          <w:lang w:val="sv-SE"/>
+        </w:rPr>
+        <w:t xml:space="preserve"> </w:t>
+      </w:r>
+      <w:proofErr w:type="spellStart"/>
+      <w:r>
+        <w:rPr>
+          <w:lang w:val="sv-SE"/>
+        </w:rPr>
+        <w:t>App</w:t>
+      </w:r>
+      <w:proofErr w:type="spellEnd"/>
+      <w:r>
+        <w:rPr>
+          <w:lang w:val="sv-SE"/>
+        </w:rPr>
+        <w:t xml:space="preserve"> Services</w:t>
+      </w:r>
+    </w:p>
+    <w:p>
+      <w:pPr>
+        <w:rPr>
+          <w:rFonts w:ascii="Calibri" w:hAnsi="Calibri" w:cs="Calibri"/>
+          <w:sz w:val="24"/>
+          <w:szCs w:val="24"/>
+          <w:lang w:val="sv-SE"/>
+        </w:rPr>
+      </w:pPr>
+      <w:proofErr w:type="spellStart"/>
+      <w:r>
+        <w:rPr>
+          <w:rFonts w:ascii="Calibri" w:hAnsi="Calibri" w:cs="Calibri"/>
+          <w:sz w:val="24"/>
+          <w:szCs w:val="24"/>
+          <w:lang w:val="sv-SE"/>
+        </w:rPr>
+        <w:t>Lorum</w:t>
+      </w:r>
+      <w:proofErr w:type="spellEnd"/>
+      <w:r>
+        <w:rPr>
+          <w:rFonts w:ascii="Calibri" w:hAnsi="Calibri" w:cs="Calibri"/>
+          <w:sz w:val="24"/>
+          <w:szCs w:val="24"/>
+          <w:lang w:val="sv-SE"/>
+        </w:rPr>
+        <w:t xml:space="preserve"> </w:t>
+      </w:r>
+      <w:proofErr w:type="spellStart"/>
+      <w:r>
+        <w:rPr>
+          <w:rFonts w:ascii="Calibri" w:hAnsi="Calibri" w:cs="Calibri"/>
+          <w:sz w:val="24"/>
+          <w:szCs w:val="24"/>
+          <w:lang w:val="sv-SE"/>
+        </w:rPr>
+        <w:t>Ipsum</w:t>
+      </w:r>
+      <w:proofErr w:type="spellEnd"/>
+    </w:p>
+    <w:p>
+      <w:pPr>
+        <w:pStyle w:val="Heading3"/>
+      </w:pPr>
+      <w:bookmarkStart w:id="11" w:name="_Toc215740465"/>
+      <w:r>
+        <w:t>3.</w:t>
+      </w:r>
+      <w:r>
+        <w:t>5</w:t>
+      </w:r>
+      <w:r>
+        <w:t xml:space="preserve"> Azure</w:t>
+      </w:r>
+      <w:bookmarkEnd w:id="11"/>
+      <w:r>
+        <w:t xml:space="preserve"> A</w:t>
+      </w:r>
+      <w:r>
+        <w:t>pp Configuration</w:t>
+      </w:r>
+    </w:p>
+    <w:p>
+      <w:pPr>
+        <w:rPr>
+          <w:rFonts w:ascii="Calibri" w:hAnsi="Calibri" w:cs="Calibri"/>
+          <w:sz w:val="24"/>
+          <w:szCs w:val="24"/>
+        </w:rPr>
+      </w:pPr>
+      <w:r>
+        <w:rPr>
+          <w:rFonts w:ascii="Calibri" w:hAnsi="Calibri" w:cs="Calibri"/>
+          <w:sz w:val="24"/>
+          <w:szCs w:val="24"/>
+        </w:rPr>
+        <w:t>Lorum Ipsum</w:t>
+      </w:r>
+    </w:p>
+    <w:p>
+      <w:pPr>
+        <w:pStyle w:val="Heading3"/>
+      </w:pPr>
+      <w:r>
+        <w:t>3.</w:t>
+      </w:r>
+      <w:r>
+        <w:t>6</w:t>
+      </w:r>
+      <w:r>
+        <w:t xml:space="preserve"> Azure </w:t>
+      </w:r>
+      <w:r>
+        <w:t>Key Vault</w:t>
+      </w:r>
+    </w:p>
+    <w:p>
+      <w:pPr>
+        <w:rPr>
+          <w:rFonts w:ascii="Calibri" w:hAnsi="Calibri" w:cs="Calibri"/>
+          <w:sz w:val="24"/>
+          <w:szCs w:val="24"/>
+        </w:rPr>
+      </w:pPr>
+      <w:r>
+        <w:rPr>
+          <w:rFonts w:ascii="Calibri" w:hAnsi="Calibri" w:cs="Calibri"/>
+          <w:sz w:val="24"/>
+          <w:szCs w:val="24"/>
+        </w:rPr>
+        <w:t>Lorum Ipsum</w:t>
+      </w:r>
+    </w:p>
+    <w:p>
+      <w:pPr>
+        <w:pStyle w:val="Heading3"/>
+      </w:pPr>
+      <w:r>
+        <w:t>3.</w:t>
+      </w:r>
+      <w:r>
+        <w:t>7</w:t>
+      </w:r>
+      <w:r>
+        <w:t xml:space="preserve"> Azure </w:t>
+      </w:r>
+      <w:r>
+        <w:t>API Management (APIM)</w:t>
+      </w:r>
+    </w:p>
+    <w:p>
+      <w:pPr>
+        <w:rPr>
+          <w:rFonts w:ascii="Calibri" w:hAnsi="Calibri" w:cs="Calibri"/>
+          <w:sz w:val="24"/>
+          <w:szCs w:val="24"/>
+        </w:rPr>
+      </w:pPr>
+      <w:r>
+        <w:rPr>
+          <w:rFonts w:ascii="Calibri" w:hAnsi="Calibri" w:cs="Calibri"/>
+          <w:sz w:val="24"/>
+          <w:szCs w:val="24"/>
+        </w:rPr>
+        <w:t>Lorum Ipsum</w:t>
+      </w:r>
+    </w:p>
+    <w:p>
+      <w:pPr>
+        <w:pStyle w:val="Heading3"/>
+      </w:pPr>
+      <w:bookmarkStart w:id="12" w:name="_Toc215740466"/>
+      <w:r>
+        <w:t>3.</w:t>
+      </w:r>
+      <w:r>
+        <w:t>8</w:t>
+      </w:r>
+      <w:r>
+        <w:t xml:space="preserve"> </w:t>
+      </w:r>
+      <w:proofErr w:type="spellStart"/>
+      <w:r>
+        <w:t>CosmosDB</w:t>
+      </w:r>
+      <w:bookmarkEnd w:id="12"/>
+      <w:proofErr w:type="spellEnd"/>
+      <w:r>
+        <w:t xml:space="preserve"> serverless</w:t>
+      </w:r>
+    </w:p>
+    <w:p>
+      <w:pPr>
+        <w:rPr>
+          <w:rFonts w:ascii="Calibri" w:hAnsi="Calibri" w:cs="Calibri"/>
+          <w:sz w:val="24"/>
+          <w:szCs w:val="24"/>
+          <w:lang w:val="sv-SE"/>
+        </w:rPr>
+      </w:pPr>
+      <w:proofErr w:type="spellStart"/>
+      <w:r>
+        <w:rPr>
+          <w:rFonts w:ascii="Calibri" w:hAnsi="Calibri" w:cs="Calibri"/>
+          <w:sz w:val="24"/>
+          <w:szCs w:val="24"/>
+          <w:lang w:val="sv-SE"/>
+        </w:rPr>
+        <w:t>Lorum</w:t>
+      </w:r>
+      <w:proofErr w:type="spellEnd"/>
+      <w:r>
+        <w:rPr>
+          <w:rFonts w:ascii="Calibri" w:hAnsi="Calibri" w:cs="Calibri"/>
+          <w:sz w:val="24"/>
+          <w:szCs w:val="24"/>
+          <w:lang w:val="sv-SE"/>
+        </w:rPr>
+        <w:t xml:space="preserve"> </w:t>
+      </w:r>
+      <w:proofErr w:type="spellStart"/>
+      <w:r>
+        <w:rPr>
+          <w:rFonts w:ascii="Calibri" w:hAnsi="Calibri" w:cs="Calibri"/>
+          <w:sz w:val="24"/>
+          <w:szCs w:val="24"/>
+          <w:lang w:val="sv-SE"/>
+        </w:rPr>
+        <w:t>Ipsum</w:t>
+      </w:r>
+      <w:proofErr w:type="spellEnd"/>
+    </w:p>
+    <w:p>
+      <w:pPr>
+        <w:rPr>
+          <w:rFonts w:ascii="Calibri" w:hAnsi="Calibri" w:cs="Calibri"/>
+          <w:sz w:val="24"/>
+          <w:szCs w:val="24"/>
+          <w:lang w:val="sv-SE"/>
+        </w:rPr>
+      </w:pPr>
+    </w:p>
+    <w:p>
+      <w:pPr>
+        <w:pStyle w:val="Heading2"/>
+        <w:rPr>
+          <w:lang w:val="sv-SE"/>
+        </w:rPr>
+      </w:pPr>
+      <w:bookmarkStart w:id="13" w:name="_Toc215740467"/>
+      <w:r>
+        <w:rPr>
+          <w:lang w:val="sv-SE"/>
+        </w:rPr>
+        <w:t xml:space="preserve">4. </w:t>
+      </w:r>
+      <w:proofErr w:type="spellStart"/>
+      <w:r>
+        <w:rPr>
+          <w:lang w:val="sv-SE"/>
+        </w:rPr>
+        <w:t>GitHub</w:t>
+      </w:r>
+      <w:proofErr w:type="spellEnd"/>
+      <w:r>
+        <w:rPr>
+          <w:lang w:val="sv-SE"/>
+        </w:rPr>
+        <w:t xml:space="preserve"> och </w:t>
+      </w:r>
+      <w:proofErr w:type="spellStart"/>
+      <w:r>
+        <w:rPr>
+          <w:lang w:val="sv-SE"/>
+        </w:rPr>
+        <w:t>Docker</w:t>
+      </w:r>
+      <w:proofErr w:type="spellEnd"/>
+      <w:r>
+        <w:rPr>
+          <w:lang w:val="sv-SE"/>
+        </w:rPr>
+        <w:t xml:space="preserve"> (</w:t>
+      </w:r>
+      <w:proofErr w:type="spellStart"/>
+      <w:r>
+        <w:rPr>
+          <w:lang w:val="sv-SE"/>
+        </w:rPr>
+        <w:t>IaC</w:t>
+      </w:r>
+      <w:proofErr w:type="spellEnd"/>
+      <w:r>
+        <w:rPr>
+          <w:lang w:val="sv-SE"/>
+        </w:rPr>
+        <w:t>)</w:t>
+      </w:r>
+      <w:bookmarkEnd w:id="13"/>
+    </w:p>
+    <w:p>
+      <w:pPr>
+        <w:rPr>
+          <w:rFonts w:ascii="Calibri" w:hAnsi="Calibri" w:cs="Calibri"/>
+          <w:sz w:val="24"/>
+          <w:szCs w:val="24"/>
+          <w:lang w:val="sv-SE"/>
+        </w:rPr>
+      </w:pPr>
+      <w:r>
+        <w:rPr>
+          <w:rFonts w:ascii="Calibri" w:hAnsi="Calibri" w:cs="Calibri"/>
+          <w:sz w:val="24"/>
+          <w:szCs w:val="24"/>
+          <w:lang w:val="sv-SE"/>
+        </w:rPr>
+        <w:t xml:space="preserve">Introduktion – </w:t>
+      </w:r>
+      <w:proofErr w:type="spellStart"/>
+      <w:r>
+        <w:rPr>
+          <w:rFonts w:ascii="Calibri" w:hAnsi="Calibri" w:cs="Calibri"/>
+          <w:sz w:val="24"/>
+          <w:szCs w:val="24"/>
+          <w:lang w:val="sv-SE"/>
+        </w:rPr>
+        <w:t>Lorum</w:t>
+      </w:r>
+      <w:proofErr w:type="spellEnd"/>
+      <w:r>
+        <w:rPr>
+          <w:rFonts w:ascii="Calibri" w:hAnsi="Calibri" w:cs="Calibri"/>
+          <w:sz w:val="24"/>
+          <w:szCs w:val="24"/>
+          <w:lang w:val="sv-SE"/>
+        </w:rPr>
+        <w:t xml:space="preserve"> </w:t>
+      </w:r>
+      <w:proofErr w:type="spellStart"/>
+      <w:r>
+        <w:rPr>
+          <w:rFonts w:ascii="Calibri" w:hAnsi="Calibri" w:cs="Calibri"/>
+          <w:sz w:val="24"/>
+          <w:szCs w:val="24"/>
+          <w:lang w:val="sv-SE"/>
+        </w:rPr>
+        <w:t>Ipsum</w:t>
+      </w:r>
+      <w:proofErr w:type="spellEnd"/>
+    </w:p>
+    <w:p>
+      <w:pPr>
+        <w:pStyle w:val="Heading3"/>
+        <w:rPr>
+          <w:lang w:val="sv-SE"/>
+        </w:rPr>
+      </w:pPr>
+      <w:bookmarkStart w:id="14" w:name="_Toc215740468"/>
+      <w:r>
+        <w:rPr>
+          <w:lang w:val="sv-SE"/>
+        </w:rPr>
+        <w:t xml:space="preserve">4.1 </w:t>
+      </w:r>
+      <w:proofErr w:type="spellStart"/>
+      <w:r>
+        <w:rPr>
+          <w:lang w:val="sv-SE"/>
+        </w:rPr>
+        <w:t>GitHub</w:t>
+      </w:r>
+      <w:bookmarkEnd w:id="14"/>
+      <w:proofErr w:type="spellEnd"/>
+    </w:p>
+    <w:p>
+      <w:pPr>
+        <w:rPr>
+          <w:rFonts w:ascii="Calibri" w:hAnsi="Calibri" w:cs="Calibri"/>
+          <w:sz w:val="24"/>
+          <w:szCs w:val="24"/>
+          <w:lang w:val="sv-SE"/>
+        </w:rPr>
+      </w:pPr>
+      <w:proofErr w:type="spellStart"/>
+      <w:r>
+        <w:rPr>
+          <w:rFonts w:ascii="Calibri" w:hAnsi="Calibri" w:cs="Calibri"/>
+          <w:sz w:val="24"/>
+          <w:szCs w:val="24"/>
+          <w:lang w:val="sv-SE"/>
+        </w:rPr>
+        <w:t>Lorum</w:t>
+      </w:r>
+      <w:proofErr w:type="spellEnd"/>
+      <w:r>
+        <w:rPr>
+          <w:rFonts w:ascii="Calibri" w:hAnsi="Calibri" w:cs="Calibri"/>
+          <w:sz w:val="24"/>
+          <w:szCs w:val="24"/>
+          <w:lang w:val="sv-SE"/>
+        </w:rPr>
+        <w:t xml:space="preserve"> </w:t>
+      </w:r>
+      <w:proofErr w:type="spellStart"/>
+      <w:r>
+        <w:rPr>
+          <w:rFonts w:ascii="Calibri" w:hAnsi="Calibri" w:cs="Calibri"/>
+          <w:sz w:val="24"/>
+          <w:szCs w:val="24"/>
+          <w:lang w:val="sv-SE"/>
+        </w:rPr>
+        <w:t>Ipsum</w:t>
+      </w:r>
+      <w:proofErr w:type="spellEnd"/>
+    </w:p>
+    <w:p>
+      <w:pPr>
+        <w:pStyle w:val="Heading3"/>
+        <w:rPr>
+          <w:lang w:val="sv-SE"/>
+        </w:rPr>
+      </w:pPr>
+      <w:bookmarkStart w:id="15" w:name="_Toc215740469"/>
+      <w:r>
+        <w:rPr>
+          <w:lang w:val="sv-SE"/>
+        </w:rPr>
+        <w:lastRenderedPageBreak/>
+        <w:t xml:space="preserve">4.2 </w:t>
+      </w:r>
+      <w:proofErr w:type="spellStart"/>
+      <w:r>
+        <w:rPr>
+          <w:lang w:val="sv-SE"/>
+        </w:rPr>
+        <w:t>Docker</w:t>
+      </w:r>
+      <w:bookmarkEnd w:id="15"/>
+      <w:proofErr w:type="spellEnd"/>
+    </w:p>
+    <w:p>
+      <w:pPr>
+        <w:rPr>
+          <w:rFonts w:ascii="Calibri" w:hAnsi="Calibri" w:cs="Calibri"/>
+          <w:sz w:val="24"/>
+          <w:szCs w:val="24"/>
+          <w:lang w:val="sv-SE"/>
+        </w:rPr>
+      </w:pPr>
+      <w:proofErr w:type="spellStart"/>
+      <w:r>
+        <w:rPr>
+          <w:rFonts w:ascii="Calibri" w:hAnsi="Calibri" w:cs="Calibri"/>
+          <w:sz w:val="24"/>
+          <w:szCs w:val="24"/>
+          <w:lang w:val="sv-SE"/>
+        </w:rPr>
+        <w:t>Lorum</w:t>
+      </w:r>
+      <w:proofErr w:type="spellEnd"/>
+      <w:r>
+        <w:rPr>
+          <w:rFonts w:ascii="Calibri" w:hAnsi="Calibri" w:cs="Calibri"/>
+          <w:sz w:val="24"/>
+          <w:szCs w:val="24"/>
+          <w:lang w:val="sv-SE"/>
+        </w:rPr>
+        <w:t xml:space="preserve"> </w:t>
+      </w:r>
+      <w:proofErr w:type="spellStart"/>
+      <w:r>
+        <w:rPr>
+          <w:rFonts w:ascii="Calibri" w:hAnsi="Calibri" w:cs="Calibri"/>
+          <w:sz w:val="24"/>
+          <w:szCs w:val="24"/>
+          <w:lang w:val="sv-SE"/>
+        </w:rPr>
+        <w:t>Ipsum</w:t>
+      </w:r>
+      <w:proofErr w:type="spellEnd"/>
+    </w:p>
+    <w:p>
+      <w:pPr>
+        <w:rPr>
+          <w:lang w:val="sv-SE"/>
+        </w:rPr>
+      </w:pPr>
+    </w:p>
+    <w:p>
+      <w:pPr>
+        <w:pStyle w:val="Heading2"/>
+        <w:rPr>
+          <w:lang w:val="sv-SE"/>
+        </w:rPr>
+      </w:pPr>
+      <w:bookmarkStart w:id="16" w:name="_Toc215740470"/>
+      <w:r>
+        <w:rPr>
+          <w:lang w:val="sv-SE"/>
+        </w:rPr>
+        <w:t>5</w:t>
+      </w:r>
+      <w:r>
+        <w:rPr>
+          <w:lang w:val="sv-SE"/>
+        </w:rPr>
+        <w:t>. Huvudfunktione</w:t>
+      </w:r>
+      <w:r>
+        <w:rPr>
+          <w:lang w:val="sv-SE"/>
+        </w:rPr>
+        <w:t>n</w:t>
+      </w:r>
+      <w:r>
+        <w:rPr>
+          <w:lang w:val="sv-SE"/>
+        </w:rPr>
+        <w:t xml:space="preserve"> – Den Stor</w:t>
+      </w:r>
+      <w:r>
+        <w:rPr>
+          <w:lang w:val="sv-SE"/>
+        </w:rPr>
+        <w:t>a</w:t>
+      </w:r>
+      <w:r>
+        <w:rPr>
+          <w:lang w:val="sv-SE"/>
+        </w:rPr>
+        <w:t xml:space="preserve"> Röda Knappen</w:t>
+      </w:r>
+      <w:bookmarkEnd w:id="16"/>
+    </w:p>
+    <w:p>
+      <w:pPr>
+        <w:rPr>
+          <w:rFonts w:ascii="Calibri" w:hAnsi="Calibri" w:cs="Calibri"/>
+          <w:sz w:val="24"/>
+          <w:szCs w:val="24"/>
+          <w:lang w:val="sv-SE"/>
+        </w:rPr>
+      </w:pPr>
+      <w:r>
+        <w:rPr>
+          <w:rFonts w:ascii="Calibri" w:hAnsi="Calibri" w:cs="Calibri"/>
+          <w:noProof/>
+          <w:sz w:val="24"/>
+          <w:szCs w:val="24"/>
+          <w:lang w:val="sv-SE"/>
+        </w:rPr>
+        <w:drawing>
+          <wp:inline distT="0" distB="0" distL="0" distR="0" wp14:anchorId="018DEB95" wp14:editId="5196177B">
+            <wp:extent cx="5731510" cy="2212340"/>
+            <wp:effectExtent l="0" t="0" r="2540" b="0"/>
+            <wp:docPr id="1319249076" name="Picture 1"/>
+            <wp:cNvGraphicFramePr>
+              <a:graphicFrameLocks xmlns:a="http://schemas.openxmlformats.org/drawingml/2006/main" noChangeAspect="1"/>
+            </wp:cNvGraphicFramePr>
+            <a:graphic xmlns:a="http://schemas.openxmlformats.org/drawingml/2006/main">
+              <a:graphicData uri="http://schemas.openxmlformats.org/drawingml/2006/picture">
+                <pic:pic xmlns:pic="http://schemas.openxmlformats.org/drawingml/2006/picture">
+                  <pic:nvPicPr>
+                    <pic:cNvPr id="1319249076" name=""/>
+                    <pic:cNvPicPr/>
+                  </pic:nvPicPr>
+                  <pic:blipFill>
+                    <a:blip r:embed="rId9"/>
+                    <a:stretch>
+                      <a:fillRect/>
+                    </a:stretch>
+                  </pic:blipFill>
+                  <pic:spPr>
+                    <a:xfrm>
+                      <a:off x="0" y="0"/>
+                      <a:ext cx="5731510" cy="2212340"/>
+                    </a:xfrm>
+                    <a:prstGeom prst="rect">
+                      <a:avLst/>
+                    </a:prstGeom>
+                  </pic:spPr>
+                </pic:pic>
+              </a:graphicData>
+            </a:graphic>
+          </wp:inline>
+        </w:drawing>
+      </w:r>
+    </w:p>
+    <w:p>
+      <w:pPr>
+        <w:rPr>
+          <w:rFonts w:ascii="Calibri" w:hAnsi="Calibri" w:cs="Calibri"/>
+          <w:sz w:val="24"/>
+          <w:szCs w:val="24"/>
+          <w:lang w:val="sv-SE"/>
+        </w:rPr>
+      </w:pPr>
+      <w:r>
+        <w:rPr>
+          <w:rFonts w:ascii="Calibri" w:hAnsi="Calibri" w:cs="Calibri"/>
+          <w:sz w:val="24"/>
+          <w:szCs w:val="24"/>
+          <w:lang w:val="sv-SE"/>
+        </w:rPr>
+        <w:t xml:space="preserve">Det mest centrala verktyget vi har i den här lösningen är </w:t>
+      </w:r>
+      <w:proofErr w:type="spellStart"/>
+      <w:r>
+        <w:rPr>
+          <w:rFonts w:ascii="Calibri" w:hAnsi="Calibri" w:cs="Calibri"/>
+          <w:sz w:val="24"/>
+          <w:szCs w:val="24"/>
+          <w:lang w:val="sv-SE"/>
+        </w:rPr>
+        <w:t>Toggle</w:t>
+      </w:r>
+      <w:proofErr w:type="spellEnd"/>
+      <w:r>
+        <w:rPr>
+          <w:rFonts w:ascii="Calibri" w:hAnsi="Calibri" w:cs="Calibri"/>
+          <w:sz w:val="24"/>
+          <w:szCs w:val="24"/>
+          <w:lang w:val="sv-SE"/>
+        </w:rPr>
+        <w:t>-knappen</w:t>
+      </w:r>
+      <w:r>
+        <w:rPr>
+          <w:rFonts w:ascii="Calibri" w:hAnsi="Calibri" w:cs="Calibri"/>
+          <w:sz w:val="24"/>
+          <w:szCs w:val="24"/>
+          <w:lang w:val="sv-SE"/>
+        </w:rPr>
+        <w:t xml:space="preserve"> som </w:t>
+      </w:r>
+      <w:r>
+        <w:rPr>
+          <w:rFonts w:ascii="Calibri" w:hAnsi="Calibri" w:cs="Calibri"/>
+          <w:sz w:val="24"/>
+          <w:szCs w:val="24"/>
+          <w:lang w:val="sv-SE"/>
+        </w:rPr>
+        <w:t xml:space="preserve">hjälper </w:t>
+      </w:r>
+      <w:r>
+        <w:rPr>
+          <w:rFonts w:ascii="Calibri" w:hAnsi="Calibri" w:cs="Calibri"/>
+          <w:sz w:val="24"/>
+          <w:szCs w:val="24"/>
+          <w:lang w:val="sv-SE"/>
+        </w:rPr>
+        <w:t>oss att byta mellan de två systemen. Utan att gräva ner sig för djupt i tekniska detaljer så kan vi helt enkelt säga att det är en knapp som slår av och på hur en biljettbokning styrs. Går det direkt till databasen, eller tar det en omväg via en mellanlagring?</w:t>
+      </w:r>
+    </w:p>
+    <w:p>
+      <w:pPr>
+        <w:rPr>
+          <w:rFonts w:ascii="Calibri" w:hAnsi="Calibri" w:cs="Calibri"/>
+          <w:sz w:val="24"/>
+          <w:szCs w:val="24"/>
+          <w:lang w:val="sv-SE"/>
+        </w:rPr>
+      </w:pPr>
+      <w:r>
+        <w:rPr>
+          <w:rFonts w:ascii="Calibri" w:hAnsi="Calibri" w:cs="Calibri"/>
+          <w:sz w:val="24"/>
+          <w:szCs w:val="24"/>
+          <w:lang w:val="sv-SE"/>
+        </w:rPr>
+        <w:t xml:space="preserve">Omkring detta ligger många olika tekniska lösningar för att möjliggöra den nyss beskrivna funktionaliteten, det är multipla beroenden av </w:t>
+      </w:r>
+      <w:r>
+        <w:rPr>
+          <w:rFonts w:ascii="Calibri" w:hAnsi="Calibri" w:cs="Calibri"/>
+          <w:sz w:val="24"/>
+          <w:szCs w:val="24"/>
+          <w:lang w:val="sv-SE"/>
+        </w:rPr>
+        <w:t xml:space="preserve">olika funktioner, och </w:t>
+      </w:r>
+      <w:r>
+        <w:rPr>
+          <w:rFonts w:ascii="Calibri" w:hAnsi="Calibri" w:cs="Calibri"/>
+          <w:sz w:val="24"/>
+          <w:szCs w:val="24"/>
+          <w:lang w:val="sv-SE"/>
+        </w:rPr>
+        <w:t>symbiosen mellan dem</w:t>
+      </w:r>
+      <w:r>
+        <w:rPr>
+          <w:rFonts w:ascii="Calibri" w:hAnsi="Calibri" w:cs="Calibri"/>
+          <w:sz w:val="24"/>
+          <w:szCs w:val="24"/>
+          <w:lang w:val="sv-SE"/>
+        </w:rPr>
+        <w:t>,</w:t>
+      </w:r>
+      <w:r>
+        <w:rPr>
+          <w:rFonts w:ascii="Calibri" w:hAnsi="Calibri" w:cs="Calibri"/>
+          <w:sz w:val="24"/>
+          <w:szCs w:val="24"/>
+          <w:lang w:val="sv-SE"/>
+        </w:rPr>
+        <w:t xml:space="preserve"> som skapar de förutsättningar vi behöver för att kunna implementera ”Den Röda Knappen”. </w:t>
+      </w:r>
+    </w:p>
+    <w:p>
+      <w:pPr>
+        <w:rPr>
+          <w:rFonts w:ascii="Calibri" w:hAnsi="Calibri" w:cs="Calibri"/>
+          <w:sz w:val="24"/>
+          <w:szCs w:val="24"/>
+        </w:rPr>
+      </w:pPr>
+    </w:p>
+    <w:p>
+      <w:pPr>
+        <w:pStyle w:val="Heading2"/>
+        <w:rPr>
+          <w:lang w:val="sv-SE"/>
+        </w:rPr>
+      </w:pPr>
+      <w:bookmarkStart w:id="17" w:name="_Toc215740471"/>
+      <w:r>
+        <w:rPr>
+          <w:lang w:val="sv-SE"/>
+        </w:rPr>
+        <w:t>6</w:t>
+      </w:r>
+      <w:r>
+        <w:rPr>
+          <w:lang w:val="sv-SE"/>
+        </w:rPr>
+        <w:t>. Sammanfattning</w:t>
+      </w:r>
+      <w:r>
+        <w:rPr>
+          <w:lang w:val="sv-SE"/>
+        </w:rPr>
+        <w:t xml:space="preserve"> och samspel</w:t>
+      </w:r>
+      <w:bookmarkEnd w:id="17"/>
+    </w:p>
+    <w:p>
+      <w:pPr>
+        <w:rPr>
+          <w:rFonts w:ascii="Calibri" w:hAnsi="Calibri" w:cs="Calibri"/>
+          <w:sz w:val="24"/>
+          <w:szCs w:val="24"/>
+          <w:lang w:val="sv-SE"/>
+        </w:rPr>
+      </w:pPr>
+      <w:r>
+        <w:rPr>
+          <w:rFonts w:ascii="Calibri" w:hAnsi="Calibri" w:cs="Calibri"/>
+          <w:sz w:val="24"/>
+          <w:szCs w:val="24"/>
+          <w:lang w:val="sv-SE"/>
+        </w:rPr>
+        <w:t>Flödet mellan de olika delarna kan visualiseras så här:</w:t>
+      </w:r>
+    </w:p>
+    <w:p>
+      <w:pPr>
+        <w:rPr>
+          <w:rFonts w:ascii="Calibri" w:hAnsi="Calibri" w:cs="Calibri"/>
+          <w:color w:val="EE0000"/>
+          <w:sz w:val="28"/>
+          <w:szCs w:val="28"/>
+          <w:lang w:val="sv-SE"/>
+        </w:rPr>
+      </w:pPr>
+      <w:r>
+        <w:rPr>
+          <w:rFonts w:ascii="Calibri" w:hAnsi="Calibri" w:cs="Calibri"/>
+          <w:color w:val="EE0000"/>
+          <w:sz w:val="28"/>
+          <w:szCs w:val="28"/>
+          <w:lang w:val="sv-SE"/>
+        </w:rPr>
+        <w:t xml:space="preserve">Infoga här ett flödesschema eller liknande som visar webfront/.NET, </w:t>
+      </w:r>
+      <w:proofErr w:type="spellStart"/>
+      <w:r>
+        <w:rPr>
+          <w:rFonts w:ascii="Calibri" w:hAnsi="Calibri" w:cs="Calibri"/>
+          <w:color w:val="EE0000"/>
+          <w:sz w:val="28"/>
+          <w:szCs w:val="28"/>
+          <w:lang w:val="sv-SE"/>
+        </w:rPr>
+        <w:t>APIer</w:t>
+      </w:r>
+      <w:proofErr w:type="spellEnd"/>
+      <w:r>
+        <w:rPr>
+          <w:rFonts w:ascii="Calibri" w:hAnsi="Calibri" w:cs="Calibri"/>
+          <w:color w:val="EE0000"/>
+          <w:sz w:val="28"/>
+          <w:szCs w:val="28"/>
+          <w:lang w:val="sv-SE"/>
+        </w:rPr>
+        <w:t>/.NET, databas/</w:t>
+      </w:r>
+      <w:proofErr w:type="spellStart"/>
+      <w:r>
+        <w:rPr>
+          <w:rFonts w:ascii="Calibri" w:hAnsi="Calibri" w:cs="Calibri"/>
+          <w:color w:val="EE0000"/>
+          <w:sz w:val="28"/>
+          <w:szCs w:val="28"/>
+          <w:lang w:val="sv-SE"/>
+        </w:rPr>
+        <w:t>CosmosDB</w:t>
+      </w:r>
+      <w:proofErr w:type="spellEnd"/>
+      <w:r>
+        <w:rPr>
+          <w:rFonts w:ascii="Calibri" w:hAnsi="Calibri" w:cs="Calibri"/>
+          <w:color w:val="EE0000"/>
+          <w:sz w:val="28"/>
+          <w:szCs w:val="28"/>
+          <w:lang w:val="sv-SE"/>
+        </w:rPr>
+        <w:t xml:space="preserve"> samt olika transportsträckor: synkron direkt mellan DB och applikation, och en eventbaserad som går via Service Bus, </w:t>
+      </w:r>
+      <w:proofErr w:type="spellStart"/>
+      <w:r>
+        <w:rPr>
+          <w:rFonts w:ascii="Calibri" w:hAnsi="Calibri" w:cs="Calibri"/>
+          <w:color w:val="EE0000"/>
+          <w:sz w:val="28"/>
+          <w:szCs w:val="28"/>
+          <w:lang w:val="sv-SE"/>
+        </w:rPr>
+        <w:t>Functions</w:t>
+      </w:r>
+      <w:proofErr w:type="spellEnd"/>
+      <w:r>
+        <w:rPr>
+          <w:rFonts w:ascii="Calibri" w:hAnsi="Calibri" w:cs="Calibri"/>
+          <w:color w:val="EE0000"/>
+          <w:sz w:val="28"/>
+          <w:szCs w:val="28"/>
+          <w:lang w:val="sv-SE"/>
+        </w:rPr>
+        <w:t xml:space="preserve"> </w:t>
       </w:r>
       <w:proofErr w:type="gramStart"/>
       <w:r>
         <w:rPr>
           <w:rFonts w:ascii="Calibri" w:hAnsi="Calibri" w:cs="Calibri"/>
-          <w:sz w:val="24"/>
-          <w:szCs w:val="24"/>
-          <w:lang w:val="sv-SE"/>
-        </w:rPr>
-        <w:t>medans</w:t>
+          <w:color w:val="EE0000"/>
+          <w:sz w:val="28"/>
+          <w:szCs w:val="28"/>
+          <w:lang w:val="sv-SE"/>
+        </w:rPr>
+        <w:t>etc.</w:t>
       </w:r>
       <w:proofErr w:type="gramEnd"/>
-      <w:r>
-        <w:rPr>
-          <w:rFonts w:ascii="Calibri" w:hAnsi="Calibri" w:cs="Calibri"/>
-          <w:sz w:val="24"/>
-          <w:szCs w:val="24"/>
-          <w:lang w:val="sv-SE"/>
-        </w:rPr>
-        <w:t xml:space="preserve"> andra lever kvar i det äldre. På grund av det så arbetar kunden i dagsläget i två system, samtidigt.</w:t>
-      </w:r>
-    </w:p>
-    <w:p>
-      <w:pPr>
-        <w:rPr>
-          <w:rFonts w:ascii="Calibri" w:hAnsi="Calibri" w:cs="Calibri"/>
-          <w:sz w:val="24"/>
-          <w:szCs w:val="24"/>
-          <w:lang w:val="sv-SE"/>
-        </w:rPr>
-      </w:pPr>
-      <w:r>
-        <w:rPr>
-          <w:rFonts w:ascii="Calibri" w:hAnsi="Calibri" w:cs="Calibri"/>
-          <w:sz w:val="24"/>
-          <w:szCs w:val="24"/>
-          <w:lang w:val="sv-SE"/>
-        </w:rPr>
-        <w:t>Mål</w:t>
-      </w:r>
-      <w:r>
-        <w:rPr>
-          <w:rFonts w:ascii="Calibri" w:hAnsi="Calibri" w:cs="Calibri"/>
-          <w:sz w:val="24"/>
-          <w:szCs w:val="24"/>
-          <w:lang w:val="sv-SE"/>
-        </w:rPr>
-        <w:t>et</w:t>
-      </w:r>
-      <w:r>
-        <w:rPr>
-          <w:rFonts w:ascii="Calibri" w:hAnsi="Calibri" w:cs="Calibri"/>
-          <w:sz w:val="24"/>
-          <w:szCs w:val="24"/>
-          <w:lang w:val="sv-SE"/>
-        </w:rPr>
-        <w:t xml:space="preserve"> med detta projekt är att skapa ett verktyg för att kunna hantera båda systemen inom samma flöde, och ha verktyg för att successivt kunna flytta över funktionalitet från det gamla till det nya systemet.</w:t>
-      </w:r>
-    </w:p>
-    <w:p>
-      <w:pPr>
-        <w:rPr>
-          <w:rFonts w:ascii="Calibri" w:hAnsi="Calibri" w:cs="Calibri"/>
-          <w:sz w:val="24"/>
-          <w:szCs w:val="24"/>
+    </w:p>
+    <w:p>
+      <w:pPr>
+        <w:rPr>
           <w:lang w:val="sv-SE"/>
         </w:rPr>
       </w:pPr>
@@ -1369,358 +4006,7 @@
           <w:lang w:val="sv-SE"/>
         </w:rPr>
       </w:pPr>
-      <w:bookmarkStart w:id="3" w:name="_Toc215137007"/>
-      <w:r>
-        <w:rPr>
-          <w:lang w:val="sv-SE"/>
-        </w:rPr>
-        <w:t>2. Målgrupp</w:t>
-      </w:r>
-      <w:bookmarkEnd w:id="3"/>
-    </w:p>
-    <w:p>
-      <w:pPr>
-        <w:rPr>
-          <w:rFonts w:ascii="Calibri" w:hAnsi="Calibri" w:cs="Calibri"/>
-          <w:sz w:val="24"/>
-          <w:szCs w:val="24"/>
-          <w:lang w:val="sv-SE"/>
-        </w:rPr>
-      </w:pPr>
-      <w:r>
-        <w:rPr>
-          <w:rFonts w:ascii="Calibri" w:hAnsi="Calibri" w:cs="Calibri"/>
-          <w:sz w:val="24"/>
-          <w:szCs w:val="24"/>
-          <w:lang w:val="sv-SE"/>
-        </w:rPr>
-        <w:t xml:space="preserve">Verktyget är </w:t>
-      </w:r>
-      <w:r>
-        <w:rPr>
-          <w:rFonts w:ascii="Calibri" w:hAnsi="Calibri" w:cs="Calibri"/>
-          <w:sz w:val="24"/>
-          <w:szCs w:val="24"/>
-          <w:lang w:val="sv-SE"/>
-        </w:rPr>
-        <w:t>framför allt</w:t>
-      </w:r>
-      <w:r>
-        <w:rPr>
-          <w:rFonts w:ascii="Calibri" w:hAnsi="Calibri" w:cs="Calibri"/>
-          <w:sz w:val="24"/>
-          <w:szCs w:val="24"/>
-          <w:lang w:val="sv-SE"/>
-        </w:rPr>
-        <w:t xml:space="preserve"> till för utvecklare som i dagsläget använder båda systemen samtidigt. Användare av kundens applikation ser inte vilket systemet de använder, men utvecklare har en miljö där de byter mellan systemen.</w:t>
-      </w:r>
-    </w:p>
-    <w:p>
-      <w:pPr>
-        <w:rPr>
-          <w:rFonts w:ascii="Calibri" w:hAnsi="Calibri" w:cs="Calibri"/>
-          <w:sz w:val="24"/>
-          <w:szCs w:val="24"/>
-          <w:lang w:val="sv-SE"/>
-        </w:rPr>
-      </w:pPr>
-      <w:r>
-        <w:rPr>
-          <w:rFonts w:ascii="Calibri" w:hAnsi="Calibri" w:cs="Calibri"/>
-          <w:sz w:val="24"/>
-          <w:szCs w:val="24"/>
-          <w:lang w:val="sv-SE"/>
-        </w:rPr>
-        <w:t xml:space="preserve">Tanken är att utvecklarna skall kunna använda detta projekts verktyg genom att knyta ihop de två systemen, kunna </w:t>
-      </w:r>
-      <w:proofErr w:type="spellStart"/>
-      <w:r>
-        <w:rPr>
-          <w:rFonts w:ascii="Calibri" w:hAnsi="Calibri" w:cs="Calibri"/>
-          <w:sz w:val="24"/>
-          <w:szCs w:val="24"/>
-          <w:lang w:val="sv-SE"/>
-        </w:rPr>
-        <w:t>refaktorera</w:t>
-      </w:r>
-      <w:proofErr w:type="spellEnd"/>
-      <w:r>
-        <w:rPr>
-          <w:rFonts w:ascii="Calibri" w:hAnsi="Calibri" w:cs="Calibri"/>
-          <w:sz w:val="24"/>
-          <w:szCs w:val="24"/>
-          <w:lang w:val="sv-SE"/>
-        </w:rPr>
-        <w:t xml:space="preserve"> kod från det gamla systemet och successivt föra över funktionalitet till det nya, utan att behöva ta ner huvudapplikationen.</w:t>
-      </w:r>
-    </w:p>
-    <w:p>
-      <w:pPr>
-        <w:rPr>
-          <w:lang w:val="sv-SE"/>
-        </w:rPr>
-      </w:pPr>
-    </w:p>
-    <w:p>
-      <w:pPr>
-        <w:pStyle w:val="Heading2"/>
-        <w:rPr>
-          <w:lang w:val="sv-SE"/>
-        </w:rPr>
-      </w:pPr>
-      <w:bookmarkStart w:id="4" w:name="_Toc215137008"/>
-      <w:r>
-        <w:rPr>
-          <w:lang w:val="sv-SE"/>
-        </w:rPr>
-        <w:t>3. Översikt</w:t>
-      </w:r>
-      <w:bookmarkEnd w:id="4"/>
-    </w:p>
-    <w:p>
-      <w:pPr>
-        <w:rPr>
-          <w:rFonts w:ascii="Calibri" w:hAnsi="Calibri" w:cs="Calibri"/>
-          <w:sz w:val="24"/>
-          <w:szCs w:val="24"/>
-          <w:lang w:val="sv-SE"/>
-        </w:rPr>
-      </w:pPr>
-      <w:r>
-        <w:rPr>
-          <w:rFonts w:ascii="Calibri" w:hAnsi="Calibri" w:cs="Calibri"/>
-          <w:sz w:val="24"/>
-          <w:szCs w:val="24"/>
-          <w:lang w:val="sv-SE"/>
-        </w:rPr>
-        <w:t>Ge en lättöverskådlig sammanfattning av verktygets funktioner.</w:t>
-      </w:r>
-    </w:p>
-    <w:p>
-      <w:pPr>
-        <w:rPr>
-          <w:lang w:val="sv-SE"/>
-        </w:rPr>
-      </w:pPr>
-    </w:p>
-    <w:p>
-      <w:pPr>
-        <w:pStyle w:val="Heading2"/>
-        <w:rPr>
-          <w:lang w:val="sv-SE"/>
-        </w:rPr>
-      </w:pPr>
-      <w:bookmarkStart w:id="5" w:name="_Toc215137009"/>
-      <w:r>
-        <w:rPr>
-          <w:lang w:val="sv-SE"/>
-        </w:rPr>
-        <w:t>4. Huvudfunktioner</w:t>
-      </w:r>
-      <w:bookmarkEnd w:id="5"/>
-    </w:p>
-    <w:p>
-      <w:pPr>
-        <w:rPr>
-          <w:rFonts w:ascii="Calibri" w:hAnsi="Calibri" w:cs="Calibri"/>
-          <w:sz w:val="24"/>
-          <w:szCs w:val="24"/>
-          <w:lang w:val="sv-SE"/>
-        </w:rPr>
-      </w:pPr>
-      <w:r>
-        <w:rPr>
-          <w:rFonts w:ascii="Calibri" w:hAnsi="Calibri" w:cs="Calibri"/>
-          <w:sz w:val="24"/>
-          <w:szCs w:val="24"/>
-          <w:lang w:val="sv-SE"/>
-        </w:rPr>
-        <w:t>Beskriv funktionerna utan tekniska detaljer.</w:t>
-      </w:r>
-    </w:p>
-    <w:p>
-      <w:pPr>
-        <w:rPr>
-          <w:lang w:val="sv-SE"/>
-        </w:rPr>
-      </w:pPr>
-    </w:p>
-    <w:p>
-      <w:pPr>
-        <w:pStyle w:val="Heading2"/>
-        <w:rPr>
-          <w:lang w:val="sv-SE"/>
-        </w:rPr>
-      </w:pPr>
-      <w:bookmarkStart w:id="6" w:name="_Toc215137010"/>
-      <w:r>
-        <w:rPr>
-          <w:lang w:val="sv-SE"/>
-        </w:rPr>
-        <w:t>5. Roller</w:t>
-      </w:r>
-      <w:bookmarkEnd w:id="6"/>
-    </w:p>
-    <w:p>
-      <w:pPr>
-        <w:rPr>
-          <w:rFonts w:ascii="Calibri" w:hAnsi="Calibri" w:cs="Calibri"/>
-          <w:sz w:val="24"/>
-          <w:szCs w:val="24"/>
-          <w:lang w:val="sv-SE"/>
-        </w:rPr>
-      </w:pPr>
-      <w:r>
-        <w:rPr>
-          <w:rFonts w:ascii="Calibri" w:hAnsi="Calibri" w:cs="Calibri"/>
-          <w:sz w:val="24"/>
-          <w:szCs w:val="24"/>
-          <w:lang w:val="sv-SE"/>
-        </w:rPr>
-        <w:t>Beskriv användarroller på ett enkelt och tydligt sätt.</w:t>
-      </w:r>
-    </w:p>
-    <w:p>
-      <w:pPr>
-        <w:rPr>
-          <w:lang w:val="sv-SE"/>
-        </w:rPr>
-      </w:pPr>
-    </w:p>
-    <w:p>
-      <w:pPr>
-        <w:pStyle w:val="Heading2"/>
-        <w:rPr>
-          <w:lang w:val="sv-SE"/>
-        </w:rPr>
-      </w:pPr>
-      <w:bookmarkStart w:id="7" w:name="_Toc215137011"/>
-      <w:r>
-        <w:rPr>
-          <w:lang w:val="sv-SE"/>
-        </w:rPr>
-        <w:t>6. Fördelar</w:t>
-      </w:r>
-      <w:bookmarkEnd w:id="7"/>
-    </w:p>
-    <w:p>
-      <w:pPr>
-        <w:rPr>
-          <w:rFonts w:ascii="Calibri" w:hAnsi="Calibri" w:cs="Calibri"/>
-          <w:sz w:val="24"/>
-          <w:szCs w:val="24"/>
-          <w:lang w:val="sv-SE"/>
-        </w:rPr>
-      </w:pPr>
-      <w:r>
-        <w:rPr>
-          <w:rFonts w:ascii="Calibri" w:hAnsi="Calibri" w:cs="Calibri"/>
-          <w:sz w:val="24"/>
-          <w:szCs w:val="24"/>
-          <w:lang w:val="sv-SE"/>
-        </w:rPr>
-        <w:t>Sammanfatta nyttan och konkreta vinster för användaren.</w:t>
-      </w:r>
-    </w:p>
-    <w:p>
-      <w:pPr>
-        <w:rPr>
-          <w:lang w:val="sv-SE"/>
-        </w:rPr>
-      </w:pPr>
-    </w:p>
-    <w:p>
-      <w:pPr>
-        <w:pStyle w:val="Heading2"/>
-        <w:rPr>
-          <w:lang w:val="sv-SE"/>
-        </w:rPr>
-      </w:pPr>
-      <w:bookmarkStart w:id="8" w:name="_Toc215137012"/>
-      <w:r>
-        <w:rPr>
-          <w:lang w:val="sv-SE"/>
-        </w:rPr>
-        <w:t>7. Scenario</w:t>
-      </w:r>
-      <w:bookmarkEnd w:id="8"/>
-    </w:p>
-    <w:p>
-      <w:pPr>
-        <w:rPr>
-          <w:rFonts w:ascii="Calibri" w:hAnsi="Calibri" w:cs="Calibri"/>
-          <w:sz w:val="24"/>
-          <w:szCs w:val="24"/>
-          <w:lang w:val="sv-SE"/>
-        </w:rPr>
-      </w:pPr>
-      <w:r>
-        <w:rPr>
-          <w:rFonts w:ascii="Calibri" w:hAnsi="Calibri" w:cs="Calibri"/>
-          <w:sz w:val="24"/>
-          <w:szCs w:val="24"/>
-          <w:lang w:val="sv-SE"/>
-        </w:rPr>
-        <w:t>Ge ett verklighetsnära exempel på hur verktyget används.</w:t>
-      </w:r>
-    </w:p>
-    <w:p>
-      <w:pPr>
-        <w:rPr>
-          <w:lang w:val="sv-SE"/>
-        </w:rPr>
-      </w:pPr>
-    </w:p>
-    <w:p>
-      <w:pPr>
-        <w:pStyle w:val="Heading2"/>
-        <w:rPr>
-          <w:lang w:val="sv-SE"/>
-        </w:rPr>
-      </w:pPr>
-      <w:bookmarkStart w:id="9" w:name="_Toc215137013"/>
-      <w:r>
-        <w:rPr>
-          <w:lang w:val="sv-SE"/>
-        </w:rPr>
-        <w:t>8. Sammanfattning</w:t>
-      </w:r>
-      <w:bookmarkEnd w:id="9"/>
-    </w:p>
-    <w:p>
-      <w:pPr>
-        <w:rPr>
-          <w:rFonts w:ascii="Calibri" w:hAnsi="Calibri" w:cs="Calibri"/>
-          <w:sz w:val="24"/>
-          <w:szCs w:val="24"/>
-          <w:lang w:val="sv-SE"/>
-        </w:rPr>
-      </w:pPr>
-      <w:r>
-        <w:rPr>
-          <w:rFonts w:ascii="Calibri" w:hAnsi="Calibri" w:cs="Calibri"/>
-          <w:sz w:val="24"/>
-          <w:szCs w:val="24"/>
-          <w:lang w:val="sv-SE"/>
-        </w:rPr>
-        <w:t>Knyt ihop helheten kort och tydligt.</w:t>
-      </w:r>
-    </w:p>
-    <w:p>
-      <w:pPr>
-        <w:rPr>
-          <w:lang w:val="sv-SE"/>
-        </w:rPr>
-      </w:pPr>
-    </w:p>
-    <w:p>
-      <w:pPr>
-        <w:pStyle w:val="Heading2"/>
-        <w:rPr>
-          <w:lang w:val="sv-SE"/>
-        </w:rPr>
-      </w:pPr>
-      <w:bookmarkStart w:id="10" w:name="_Toc215137014"/>
+      <w:bookmarkStart w:id="18" w:name="_Toc215740472"/>
       <w:r>
         <w:rPr>
           <w:lang w:val="sv-SE"/>
@@ -1733,7 +4019,7 @@
         </w:rPr>
         <w:t>Referenser</w:t>
       </w:r>
-      <w:bookmarkEnd w:id="10"/>
+      <w:bookmarkEnd w:id="18"/>
     </w:p>
     <w:p>
       <w:pPr>
@@ -1764,6 +4050,243 @@
     </w:sectPr>
   </w:body>
 </w:document>
+</file>
+
+<file path=word/numbering.xml><?xml version="1.0" encoding="utf-8"?>
+<w:numbering xmlns:wpc="http://schemas.microsoft.com/office/word/2010/wordprocessingCanvas" xmlns:cx="http://schemas.microsoft.com/office/drawing/2014/chartex" xmlns:cx1="http://schemas.microsoft.com/office/drawing/2015/9/8/chartex" xmlns:cx2="http://schemas.microsoft.com/office/drawing/2015/10/21/chartex" xmlns:cx3="http://schemas.microsoft.com/office/drawing/2016/5/9/chartex" xmlns:cx4="http://schemas.microsoft.com/office/drawing/2016/5/10/chartex" xmlns:cx5="http://schemas.microsoft.com/office/drawing/2016/5/11/chartex" xmlns:cx6="http://schemas.microsoft.com/office/drawing/2016/5/12/chartex" xmlns:cx7="http://schemas.microsoft.com/office/drawing/2016/5/13/chartex" xmlns:cx8="http://schemas.microsoft.com/office/drawing/2016/5/14/chartex" xmlns:mc="http://schemas.openxmlformats.org/markup-compatibility/2006" xmlns:aink="http://schemas.microsoft.com/office/drawing/2016/ink" xmlns:am3d="http://schemas.microsoft.com/office/drawing/2017/model3d" xmlns:o="urn:schemas-microsoft-com:office:office" xmlns:oel="http://schemas.microsoft.com/office/2019/extlst" xmlns:r="http://schemas.openxmlformats.org/officeDocument/2006/relationships" xmlns:m="http://schemas.openxmlformats.org/officeDocument/2006/math" xmlns:v="urn:schemas-microsoft-com:vml" xmlns:wp14="http://schemas.microsoft.com/office/word/2010/wordprocessingDrawing" xmlns:wp="http://schemas.openxmlformats.org/drawingml/2006/wordprocessingDrawing" xmlns:w10="urn:schemas-microsoft-com:office:word" xmlns:w="http://schemas.openxmlformats.org/wordprocessingml/2006/main" xmlns:w14="http://schemas.microsoft.com/office/word/2010/wordml" xmlns:w15="http://schemas.microsoft.com/office/word/2012/wordml" xmlns:w16cex="http://schemas.microsoft.com/office/word/2018/wordml/cex" xmlns:w16cid="http://schemas.microsoft.com/office/word/2016/wordml/cid" xmlns:w16="http://schemas.microsoft.com/office/word/2018/wordml" xmlns:w16du="http://schemas.microsoft.com/office/word/2023/wordml/word16du" xmlns:w16sdtdh="http://schemas.microsoft.com/office/word/2020/wordml/sdtdatahash" xmlns:w16sdtfl="http://schemas.microsoft.com/office/word/2024/wordml/sdtformatlock" xmlns:w16se="http://schemas.microsoft.com/office/word/2015/wordml/symex" xmlns:wpg="http://schemas.microsoft.com/office/word/2010/wordprocessingGroup" xmlns:wpi="http://schemas.microsoft.com/office/word/2010/wordprocessingInk" xmlns:wne="http://schemas.microsoft.com/office/word/2006/wordml" xmlns:wps="http://schemas.microsoft.com/office/word/2010/wordprocessingShape" mc:Ignorable="w14 w15 w16se w16cid w16 w16cex w16sdtdh w16sdtfl w16du wp14">
+  <w:abstractNum w:abstractNumId="0" w15:restartNumberingAfterBreak="0">
+    <w:nsid w:val="1450786A"/>
+    <w:multiLevelType w:val="hybridMultilevel"/>
+    <w:tmpl w:val="86946F66"/>
+    <w:lvl w:ilvl="0" w:tplc="20000001">
+      <w:start w:val="1"/>
+      <w:numFmt w:val="bullet"/>
+      <w:lvlText w:val=""/>
+      <w:lvlJc w:val="left"/>
+      <w:pPr>
+        <w:ind w:left="720" w:hanging="360"/>
+      </w:pPr>
+      <w:rPr>
+        <w:rFonts w:ascii="Symbol" w:hAnsi="Symbol" w:hint="default"/>
+      </w:rPr>
+    </w:lvl>
+    <w:lvl w:ilvl="1" w:tplc="20000003" w:tentative="1">
+      <w:start w:val="1"/>
+      <w:numFmt w:val="bullet"/>
+      <w:lvlText w:val="o"/>
+      <w:lvlJc w:val="left"/>
+      <w:pPr>
+        <w:ind w:left="1440" w:hanging="360"/>
+      </w:pPr>
+      <w:rPr>
+        <w:rFonts w:ascii="Courier New" w:hAnsi="Courier New" w:cs="Courier New" w:hint="default"/>
+      </w:rPr>
+    </w:lvl>
+    <w:lvl w:ilvl="2" w:tplc="20000005" w:tentative="1">
+      <w:start w:val="1"/>
+      <w:numFmt w:val="bullet"/>
+      <w:lvlText w:val=""/>
+      <w:lvlJc w:val="left"/>
+      <w:pPr>
+        <w:ind w:left="2160" w:hanging="360"/>
+      </w:pPr>
+      <w:rPr>
+        <w:rFonts w:ascii="Wingdings" w:hAnsi="Wingdings" w:hint="default"/>
+      </w:rPr>
+    </w:lvl>
+    <w:lvl w:ilvl="3" w:tplc="20000001" w:tentative="1">
+      <w:start w:val="1"/>
+      <w:numFmt w:val="bullet"/>
+      <w:lvlText w:val=""/>
+      <w:lvlJc w:val="left"/>
+      <w:pPr>
+        <w:ind w:left="2880" w:hanging="360"/>
+      </w:pPr>
+      <w:rPr>
+        <w:rFonts w:ascii="Symbol" w:hAnsi="Symbol" w:hint="default"/>
+      </w:rPr>
+    </w:lvl>
+    <w:lvl w:ilvl="4" w:tplc="20000003" w:tentative="1">
+      <w:start w:val="1"/>
+      <w:numFmt w:val="bullet"/>
+      <w:lvlText w:val="o"/>
+      <w:lvlJc w:val="left"/>
+      <w:pPr>
+        <w:ind w:left="3600" w:hanging="360"/>
+      </w:pPr>
+      <w:rPr>
+        <w:rFonts w:ascii="Courier New" w:hAnsi="Courier New" w:cs="Courier New" w:hint="default"/>
+      </w:rPr>
+    </w:lvl>
+    <w:lvl w:ilvl="5" w:tplc="20000005" w:tentative="1">
+      <w:start w:val="1"/>
+      <w:numFmt w:val="bullet"/>
+      <w:lvlText w:val=""/>
+      <w:lvlJc w:val="left"/>
+      <w:pPr>
+        <w:ind w:left="4320" w:hanging="360"/>
+      </w:pPr>
+      <w:rPr>
+        <w:rFonts w:ascii="Wingdings" w:hAnsi="Wingdings" w:hint="default"/>
+      </w:rPr>
+    </w:lvl>
+    <w:lvl w:ilvl="6" w:tplc="20000001" w:tentative="1">
+      <w:start w:val="1"/>
+      <w:numFmt w:val="bullet"/>
+      <w:lvlText w:val=""/>
+      <w:lvlJc w:val="left"/>
+      <w:pPr>
+        <w:ind w:left="5040" w:hanging="360"/>
+      </w:pPr>
+      <w:rPr>
+        <w:rFonts w:ascii="Symbol" w:hAnsi="Symbol" w:hint="default"/>
+      </w:rPr>
+    </w:lvl>
+    <w:lvl w:ilvl="7" w:tplc="20000003" w:tentative="1">
+      <w:start w:val="1"/>
+      <w:numFmt w:val="bullet"/>
+      <w:lvlText w:val="o"/>
+      <w:lvlJc w:val="left"/>
+      <w:pPr>
+        <w:ind w:left="5760" w:hanging="360"/>
+      </w:pPr>
+      <w:rPr>
+        <w:rFonts w:ascii="Courier New" w:hAnsi="Courier New" w:cs="Courier New" w:hint="default"/>
+      </w:rPr>
+    </w:lvl>
+    <w:lvl w:ilvl="8" w:tplc="20000005" w:tentative="1">
+      <w:start w:val="1"/>
+      <w:numFmt w:val="bullet"/>
+      <w:lvlText w:val=""/>
+      <w:lvlJc w:val="left"/>
+      <w:pPr>
+        <w:ind w:left="6480" w:hanging="360"/>
+      </w:pPr>
+      <w:rPr>
+        <w:rFonts w:ascii="Wingdings" w:hAnsi="Wingdings" w:hint="default"/>
+      </w:rPr>
+    </w:lvl>
+  </w:abstractNum>
+  <w:abstractNum w:abstractNumId="1" w15:restartNumberingAfterBreak="0">
+    <w:nsid w:val="64A9616B"/>
+    <w:multiLevelType w:val="hybridMultilevel"/>
+    <w:tmpl w:val="FE18986E"/>
+    <w:lvl w:ilvl="0" w:tplc="20000001">
+      <w:start w:val="1"/>
+      <w:numFmt w:val="bullet"/>
+      <w:lvlText w:val=""/>
+      <w:lvlJc w:val="left"/>
+      <w:pPr>
+        <w:ind w:left="720" w:hanging="360"/>
+      </w:pPr>
+      <w:rPr>
+        <w:rFonts w:ascii="Symbol" w:hAnsi="Symbol" w:hint="default"/>
+      </w:rPr>
+    </w:lvl>
+    <w:lvl w:ilvl="1" w:tplc="20000003" w:tentative="1">
+      <w:start w:val="1"/>
+      <w:numFmt w:val="bullet"/>
+      <w:lvlText w:val="o"/>
+      <w:lvlJc w:val="left"/>
+      <w:pPr>
+        <w:ind w:left="1440" w:hanging="360"/>
+      </w:pPr>
+      <w:rPr>
+        <w:rFonts w:ascii="Courier New" w:hAnsi="Courier New" w:cs="Courier New" w:hint="default"/>
+      </w:rPr>
+    </w:lvl>
+    <w:lvl w:ilvl="2" w:tplc="20000005" w:tentative="1">
+      <w:start w:val="1"/>
+      <w:numFmt w:val="bullet"/>
+      <w:lvlText w:val=""/>
+      <w:lvlJc w:val="left"/>
+      <w:pPr>
+        <w:ind w:left="2160" w:hanging="360"/>
+      </w:pPr>
+      <w:rPr>
+        <w:rFonts w:ascii="Wingdings" w:hAnsi="Wingdings" w:hint="default"/>
+      </w:rPr>
+    </w:lvl>
+    <w:lvl w:ilvl="3" w:tplc="20000001" w:tentative="1">
+      <w:start w:val="1"/>
+      <w:numFmt w:val="bullet"/>
+      <w:lvlText w:val=""/>
+      <w:lvlJc w:val="left"/>
+      <w:pPr>
+        <w:ind w:left="2880" w:hanging="360"/>
+      </w:pPr>
+      <w:rPr>
+        <w:rFonts w:ascii="Symbol" w:hAnsi="Symbol" w:hint="default"/>
+      </w:rPr>
+    </w:lvl>
+    <w:lvl w:ilvl="4" w:tplc="20000003" w:tentative="1">
+      <w:start w:val="1"/>
+      <w:numFmt w:val="bullet"/>
+      <w:lvlText w:val="o"/>
+      <w:lvlJc w:val="left"/>
+      <w:pPr>
+        <w:ind w:left="3600" w:hanging="360"/>
+      </w:pPr>
+      <w:rPr>
+        <w:rFonts w:ascii="Courier New" w:hAnsi="Courier New" w:cs="Courier New" w:hint="default"/>
+      </w:rPr>
+    </w:lvl>
+    <w:lvl w:ilvl="5" w:tplc="20000005" w:tentative="1">
+      <w:start w:val="1"/>
+      <w:numFmt w:val="bullet"/>
+      <w:lvlText w:val=""/>
+      <w:lvlJc w:val="left"/>
+      <w:pPr>
+        <w:ind w:left="4320" w:hanging="360"/>
+      </w:pPr>
+      <w:rPr>
+        <w:rFonts w:ascii="Wingdings" w:hAnsi="Wingdings" w:hint="default"/>
+      </w:rPr>
+    </w:lvl>
+    <w:lvl w:ilvl="6" w:tplc="20000001" w:tentative="1">
+      <w:start w:val="1"/>
+      <w:numFmt w:val="bullet"/>
+      <w:lvlText w:val=""/>
+      <w:lvlJc w:val="left"/>
+      <w:pPr>
+        <w:ind w:left="5040" w:hanging="360"/>
+      </w:pPr>
+      <w:rPr>
+        <w:rFonts w:ascii="Symbol" w:hAnsi="Symbol" w:hint="default"/>
+      </w:rPr>
+    </w:lvl>
+    <w:lvl w:ilvl="7" w:tplc="20000003" w:tentative="1">
+      <w:start w:val="1"/>
+      <w:numFmt w:val="bullet"/>
+      <w:lvlText w:val="o"/>
+      <w:lvlJc w:val="left"/>
+      <w:pPr>
+        <w:ind w:left="5760" w:hanging="360"/>
+      </w:pPr>
+      <w:rPr>
+        <w:rFonts w:ascii="Courier New" w:hAnsi="Courier New" w:cs="Courier New" w:hint="default"/>
+      </w:rPr>
+    </w:lvl>
+    <w:lvl w:ilvl="8" w:tplc="20000005" w:tentative="1">
+      <w:start w:val="1"/>
+      <w:numFmt w:val="bullet"/>
+      <w:lvlText w:val=""/>
+      <w:lvlJc w:val="left"/>
+      <w:pPr>
+        <w:ind w:left="6480" w:hanging="360"/>
+      </w:pPr>
+      <w:rPr>
+        <w:rFonts w:ascii="Wingdings" w:hAnsi="Wingdings" w:hint="default"/>
+      </w:rPr>
+    </w:lvl>
+  </w:abstractNum>
+  <w:num w:numId="1" w16cid:durableId="1485777234">
+    <w:abstractNumId w:val="1"/>
+  </w:num>
+  <w:num w:numId="2" w16cid:durableId="294219807">
+    <w:abstractNumId w:val="0"/>
+  </w:num>
+</w:numbering>
 </file>
 
 <file path=word/styles.xml><?xml version="1.0" encoding="utf-8"?>

</xml_diff>

<commit_message>
Documentation and cleanup: Updated documentation, powerpoint presentation and cleaned up an unecessary source code directory
</commit_message>
<xml_diff>
--- a/docs/school_related/verktygspresentation_clo24nikhal.docx
+++ b/docs/school_related/verktygspresentation_clo24nikhal.docx
@@ -151,7 +151,7 @@
           <w:r>
             <w:fldChar w:fldCharType="separate"/>
           </w:r>
-          <w:hyperlink w:anchor="_Toc216041734" w:history="1">
+          <w:hyperlink w:anchor="_Toc216213815" w:history="1">
             <w:r>
               <w:rPr>
                 <w:rStyle w:val="Hyperlink"/>
@@ -179,7 +179,7 @@
                 <w:noProof/>
                 <w:webHidden/>
               </w:rPr>
-              <w:instrText xml:space="preserve"> PAGEREF _Toc216041734 \h </w:instrText>
+              <w:instrText xml:space="preserve"> PAGEREF _Toc216213815 \h </w:instrText>
             </w:r>
             <w:r>
               <w:rPr>
@@ -224,7 +224,7 @@
               <w:lang w:val="en-SE" w:eastAsia="en-SE"/>
             </w:rPr>
           </w:pPr>
-          <w:hyperlink w:anchor="_Toc216041735" w:history="1">
+          <w:hyperlink w:anchor="_Toc216213816" w:history="1">
             <w:r>
               <w:rPr>
                 <w:rStyle w:val="Hyperlink"/>
@@ -252,7 +252,7 @@
                 <w:noProof/>
                 <w:webHidden/>
               </w:rPr>
-              <w:instrText xml:space="preserve"> PAGEREF _Toc216041735 \h </w:instrText>
+              <w:instrText xml:space="preserve"> PAGEREF _Toc216213816 \h </w:instrText>
             </w:r>
             <w:r>
               <w:rPr>
@@ -297,31 +297,14 @@
               <w:lang w:val="en-SE" w:eastAsia="en-SE"/>
             </w:rPr>
           </w:pPr>
-          <w:hyperlink w:anchor="_Toc216041736" w:history="1">
+          <w:hyperlink w:anchor="_Toc216213817" w:history="1">
             <w:r>
               <w:rPr>
                 <w:rStyle w:val="Hyperlink"/>
                 <w:noProof/>
                 <w:lang w:val="sv-SE"/>
               </w:rPr>
-              <w:t xml:space="preserve">1. </w:t>
-            </w:r>
-            <w:r>
-              <w:rPr>
-                <w:rStyle w:val="Hyperlink"/>
-                <w:rFonts w:hint="eastAsia"/>
-                <w:noProof/>
-                <w:lang w:val="sv-SE"/>
-              </w:rPr>
-              <w:t>Ö</w:t>
-            </w:r>
-            <w:r>
-              <w:rPr>
-                <w:rStyle w:val="Hyperlink"/>
-                <w:noProof/>
-                <w:lang w:val="sv-SE"/>
-              </w:rPr>
-              <w:t>versikt av verktygsval och motivering till valen</w:t>
+              <w:t>1. Översikt av verktygsval och motivering till valen</w:t>
             </w:r>
             <w:r>
               <w:rPr>
@@ -342,7 +325,7 @@
                 <w:noProof/>
                 <w:webHidden/>
               </w:rPr>
-              <w:instrText xml:space="preserve"> PAGEREF _Toc216041736 \h </w:instrText>
+              <w:instrText xml:space="preserve"> PAGEREF _Toc216213817 \h </w:instrText>
             </w:r>
             <w:r>
               <w:rPr>
@@ -387,7 +370,7 @@
               <w:lang w:val="en-SE" w:eastAsia="en-SE"/>
             </w:rPr>
           </w:pPr>
-          <w:hyperlink w:anchor="_Toc216041737" w:history="1">
+          <w:hyperlink w:anchor="_Toc216213818" w:history="1">
             <w:r>
               <w:rPr>
                 <w:rStyle w:val="Hyperlink"/>
@@ -415,7 +398,7 @@
                 <w:noProof/>
                 <w:webHidden/>
               </w:rPr>
-              <w:instrText xml:space="preserve"> PAGEREF _Toc216041737 \h </w:instrText>
+              <w:instrText xml:space="preserve"> PAGEREF _Toc216213818 \h </w:instrText>
             </w:r>
             <w:r>
               <w:rPr>
@@ -460,7 +443,7 @@
               <w:lang w:val="en-SE" w:eastAsia="en-SE"/>
             </w:rPr>
           </w:pPr>
-          <w:hyperlink w:anchor="_Toc216041738" w:history="1">
+          <w:hyperlink w:anchor="_Toc216213819" w:history="1">
             <w:r>
               <w:rPr>
                 <w:rStyle w:val="Hyperlink"/>
@@ -488,7 +471,7 @@
                 <w:noProof/>
                 <w:webHidden/>
               </w:rPr>
-              <w:instrText xml:space="preserve"> PAGEREF _Toc216041738 \h </w:instrText>
+              <w:instrText xml:space="preserve"> PAGEREF _Toc216213819 \h </w:instrText>
             </w:r>
             <w:r>
               <w:rPr>
@@ -533,7 +516,7 @@
               <w:lang w:val="en-SE" w:eastAsia="en-SE"/>
             </w:rPr>
           </w:pPr>
-          <w:hyperlink w:anchor="_Toc216041739" w:history="1">
+          <w:hyperlink w:anchor="_Toc216213820" w:history="1">
             <w:r>
               <w:rPr>
                 <w:rStyle w:val="Hyperlink"/>
@@ -561,7 +544,7 @@
                 <w:noProof/>
                 <w:webHidden/>
               </w:rPr>
-              <w:instrText xml:space="preserve"> PAGEREF _Toc216041739 \h </w:instrText>
+              <w:instrText xml:space="preserve"> PAGEREF _Toc216213820 \h </w:instrText>
             </w:r>
             <w:r>
               <w:rPr>
@@ -606,31 +589,14 @@
               <w:lang w:val="en-SE" w:eastAsia="en-SE"/>
             </w:rPr>
           </w:pPr>
-          <w:hyperlink w:anchor="_Toc216041740" w:history="1">
+          <w:hyperlink w:anchor="_Toc216213821" w:history="1">
             <w:r>
               <w:rPr>
                 <w:rStyle w:val="Hyperlink"/>
                 <w:noProof/>
                 <w:lang w:val="sv-SE"/>
               </w:rPr>
-              <w:t>3. Azure och CosmosDB (molntj</w:t>
-            </w:r>
-            <w:r>
-              <w:rPr>
-                <w:rStyle w:val="Hyperlink"/>
-                <w:rFonts w:hint="eastAsia"/>
-                <w:noProof/>
-                <w:lang w:val="sv-SE"/>
-              </w:rPr>
-              <w:t>ä</w:t>
-            </w:r>
-            <w:r>
-              <w:rPr>
-                <w:rStyle w:val="Hyperlink"/>
-                <w:noProof/>
-                <w:lang w:val="sv-SE"/>
-              </w:rPr>
-              <w:t>nster och databas)</w:t>
+              <w:t>3. Azure och CosmosDB (molntjänster och databas)</w:t>
             </w:r>
             <w:r>
               <w:rPr>
@@ -651,7 +617,7 @@
                 <w:noProof/>
                 <w:webHidden/>
               </w:rPr>
-              <w:instrText xml:space="preserve"> PAGEREF _Toc216041740 \h </w:instrText>
+              <w:instrText xml:space="preserve"> PAGEREF _Toc216213821 \h </w:instrText>
             </w:r>
             <w:r>
               <w:rPr>
@@ -696,12 +662,12 @@
               <w:lang w:val="en-SE" w:eastAsia="en-SE"/>
             </w:rPr>
           </w:pPr>
-          <w:hyperlink w:anchor="_Toc216041741" w:history="1">
+          <w:hyperlink w:anchor="_Toc216213822" w:history="1">
             <w:r>
               <w:rPr>
                 <w:rStyle w:val="Hyperlink"/>
                 <w:noProof/>
-                <w:lang w:val="en-US"/>
+                <w:lang w:val="sv-SE"/>
               </w:rPr>
               <w:t>3.1 Azure Service Bus</w:t>
             </w:r>
@@ -724,7 +690,7 @@
                 <w:noProof/>
                 <w:webHidden/>
               </w:rPr>
-              <w:instrText xml:space="preserve"> PAGEREF _Toc216041741 \h </w:instrText>
+              <w:instrText xml:space="preserve"> PAGEREF _Toc216213822 \h </w:instrText>
             </w:r>
             <w:r>
               <w:rPr>
@@ -769,7 +735,7 @@
               <w:lang w:val="en-SE" w:eastAsia="en-SE"/>
             </w:rPr>
           </w:pPr>
-          <w:hyperlink w:anchor="_Toc216041742" w:history="1">
+          <w:hyperlink w:anchor="_Toc216213823" w:history="1">
             <w:r>
               <w:rPr>
                 <w:rStyle w:val="Hyperlink"/>
@@ -797,7 +763,7 @@
                 <w:noProof/>
                 <w:webHidden/>
               </w:rPr>
-              <w:instrText xml:space="preserve"> PAGEREF _Toc216041742 \h </w:instrText>
+              <w:instrText xml:space="preserve"> PAGEREF _Toc216213823 \h </w:instrText>
             </w:r>
             <w:r>
               <w:rPr>
@@ -842,7 +808,7 @@
               <w:lang w:val="en-SE" w:eastAsia="en-SE"/>
             </w:rPr>
           </w:pPr>
-          <w:hyperlink w:anchor="_Toc216041743" w:history="1">
+          <w:hyperlink w:anchor="_Toc216213824" w:history="1">
             <w:r>
               <w:rPr>
                 <w:rStyle w:val="Hyperlink"/>
@@ -870,7 +836,7 @@
                 <w:noProof/>
                 <w:webHidden/>
               </w:rPr>
-              <w:instrText xml:space="preserve"> PAGEREF _Toc216041743 \h </w:instrText>
+              <w:instrText xml:space="preserve"> PAGEREF _Toc216213824 \h </w:instrText>
             </w:r>
             <w:r>
               <w:rPr>
@@ -915,7 +881,7 @@
               <w:lang w:val="en-SE" w:eastAsia="en-SE"/>
             </w:rPr>
           </w:pPr>
-          <w:hyperlink w:anchor="_Toc216041744" w:history="1">
+          <w:hyperlink w:anchor="_Toc216213825" w:history="1">
             <w:r>
               <w:rPr>
                 <w:rStyle w:val="Hyperlink"/>
@@ -943,7 +909,7 @@
                 <w:noProof/>
                 <w:webHidden/>
               </w:rPr>
-              <w:instrText xml:space="preserve"> PAGEREF _Toc216041744 \h </w:instrText>
+              <w:instrText xml:space="preserve"> PAGEREF _Toc216213825 \h </w:instrText>
             </w:r>
             <w:r>
               <w:rPr>
@@ -988,12 +954,12 @@
               <w:lang w:val="en-SE" w:eastAsia="en-SE"/>
             </w:rPr>
           </w:pPr>
-          <w:hyperlink w:anchor="_Toc216041745" w:history="1">
+          <w:hyperlink w:anchor="_Toc216213826" w:history="1">
             <w:r>
               <w:rPr>
                 <w:rStyle w:val="Hyperlink"/>
                 <w:noProof/>
-                <w:lang w:val="en-US"/>
+                <w:lang w:val="sv-SE"/>
               </w:rPr>
               <w:t>3.5 Azure App Configuration</w:t>
             </w:r>
@@ -1016,7 +982,7 @@
                 <w:noProof/>
                 <w:webHidden/>
               </w:rPr>
-              <w:instrText xml:space="preserve"> PAGEREF _Toc216041745 \h </w:instrText>
+              <w:instrText xml:space="preserve"> PAGEREF _Toc216213826 \h </w:instrText>
             </w:r>
             <w:r>
               <w:rPr>
@@ -1061,31 +1027,14 @@
               <w:lang w:val="en-SE" w:eastAsia="en-SE"/>
             </w:rPr>
           </w:pPr>
-          <w:hyperlink w:anchor="_Toc216041746" w:history="1">
+          <w:hyperlink w:anchor="_Toc216213827" w:history="1">
             <w:r>
               <w:rPr>
                 <w:rStyle w:val="Hyperlink"/>
                 <w:noProof/>
                 <w:lang w:val="sv-SE"/>
               </w:rPr>
-              <w:t xml:space="preserve">3.6 Azure Key Vault och roll-baserad </w:t>
-            </w:r>
-            <w:r>
-              <w:rPr>
-                <w:rStyle w:val="Hyperlink"/>
-                <w:rFonts w:hint="eastAsia"/>
-                <w:noProof/>
-                <w:lang w:val="sv-SE"/>
-              </w:rPr>
-              <w:t>å</w:t>
-            </w:r>
-            <w:r>
-              <w:rPr>
-                <w:rStyle w:val="Hyperlink"/>
-                <w:noProof/>
-                <w:lang w:val="sv-SE"/>
-              </w:rPr>
-              <w:t>tkomst (Managed Identity + RBAC).</w:t>
+              <w:t>3.6 Azure Key Vault och roll-baserad åtkomst (Managed Identity + RBAC).</w:t>
             </w:r>
             <w:r>
               <w:rPr>
@@ -1106,7 +1055,7 @@
                 <w:noProof/>
                 <w:webHidden/>
               </w:rPr>
-              <w:instrText xml:space="preserve"> PAGEREF _Toc216041746 \h </w:instrText>
+              <w:instrText xml:space="preserve"> PAGEREF _Toc216213827 \h </w:instrText>
             </w:r>
             <w:r>
               <w:rPr>
@@ -1151,12 +1100,12 @@
               <w:lang w:val="en-SE" w:eastAsia="en-SE"/>
             </w:rPr>
           </w:pPr>
-          <w:hyperlink w:anchor="_Toc216041747" w:history="1">
+          <w:hyperlink w:anchor="_Toc216213828" w:history="1">
             <w:r>
               <w:rPr>
                 <w:rStyle w:val="Hyperlink"/>
                 <w:noProof/>
-                <w:lang w:val="en-US"/>
+                <w:lang w:val="sv-SE"/>
               </w:rPr>
               <w:t>3.7 Azure Storage Account</w:t>
             </w:r>
@@ -1179,7 +1128,7 @@
                 <w:noProof/>
                 <w:webHidden/>
               </w:rPr>
-              <w:instrText xml:space="preserve"> PAGEREF _Toc216041747 \h </w:instrText>
+              <w:instrText xml:space="preserve"> PAGEREF _Toc216213828 \h </w:instrText>
             </w:r>
             <w:r>
               <w:rPr>
@@ -1224,7 +1173,7 @@
               <w:lang w:val="en-SE" w:eastAsia="en-SE"/>
             </w:rPr>
           </w:pPr>
-          <w:hyperlink w:anchor="_Toc216041748" w:history="1">
+          <w:hyperlink w:anchor="_Toc216213829" w:history="1">
             <w:r>
               <w:rPr>
                 <w:rStyle w:val="Hyperlink"/>
@@ -1252,7 +1201,7 @@
                 <w:noProof/>
                 <w:webHidden/>
               </w:rPr>
-              <w:instrText xml:space="preserve"> PAGEREF _Toc216041748 \h </w:instrText>
+              <w:instrText xml:space="preserve"> PAGEREF _Toc216213829 \h </w:instrText>
             </w:r>
             <w:r>
               <w:rPr>
@@ -1297,7 +1246,7 @@
               <w:lang w:val="en-SE" w:eastAsia="en-SE"/>
             </w:rPr>
           </w:pPr>
-          <w:hyperlink w:anchor="_Toc216041749" w:history="1">
+          <w:hyperlink w:anchor="_Toc216213830" w:history="1">
             <w:r>
               <w:rPr>
                 <w:rStyle w:val="Hyperlink"/>
@@ -1325,7 +1274,7 @@
                 <w:noProof/>
                 <w:webHidden/>
               </w:rPr>
-              <w:instrText xml:space="preserve"> PAGEREF _Toc216041749 \h </w:instrText>
+              <w:instrText xml:space="preserve"> PAGEREF _Toc216213830 \h </w:instrText>
             </w:r>
             <w:r>
               <w:rPr>
@@ -1370,12 +1319,12 @@
               <w:lang w:val="en-SE" w:eastAsia="en-SE"/>
             </w:rPr>
           </w:pPr>
-          <w:hyperlink w:anchor="_Toc216041750" w:history="1">
+          <w:hyperlink w:anchor="_Toc216213831" w:history="1">
             <w:r>
               <w:rPr>
                 <w:rStyle w:val="Hyperlink"/>
                 <w:noProof/>
-                <w:lang w:val="en-US"/>
+                <w:lang w:val="sv-SE"/>
               </w:rPr>
               <w:t>4.1 GitHub och GitHub Actions</w:t>
             </w:r>
@@ -1398,7 +1347,7 @@
                 <w:noProof/>
                 <w:webHidden/>
               </w:rPr>
-              <w:instrText xml:space="preserve"> PAGEREF _Toc216041750 \h </w:instrText>
+              <w:instrText xml:space="preserve"> PAGEREF _Toc216213831 \h </w:instrText>
             </w:r>
             <w:r>
               <w:rPr>
@@ -1443,7 +1392,7 @@
               <w:lang w:val="en-SE" w:eastAsia="en-SE"/>
             </w:rPr>
           </w:pPr>
-          <w:hyperlink w:anchor="_Toc216041751" w:history="1">
+          <w:hyperlink w:anchor="_Toc216213832" w:history="1">
             <w:r>
               <w:rPr>
                 <w:rStyle w:val="Hyperlink"/>
@@ -1471,7 +1420,7 @@
                 <w:noProof/>
                 <w:webHidden/>
               </w:rPr>
-              <w:instrText xml:space="preserve"> PAGEREF _Toc216041751 \h </w:instrText>
+              <w:instrText xml:space="preserve"> PAGEREF _Toc216213832 \h </w:instrText>
             </w:r>
             <w:r>
               <w:rPr>
@@ -1516,31 +1465,14 @@
               <w:lang w:val="en-SE" w:eastAsia="en-SE"/>
             </w:rPr>
           </w:pPr>
-          <w:hyperlink w:anchor="_Toc216041752" w:history="1">
+          <w:hyperlink w:anchor="_Toc216213833" w:history="1">
             <w:r>
               <w:rPr>
                 <w:rStyle w:val="Hyperlink"/>
                 <w:noProof/>
                 <w:lang w:val="sv-SE"/>
               </w:rPr>
-              <w:t>4.4 Bicep (Infrastructure as Code, f</w:t>
-            </w:r>
-            <w:r>
-              <w:rPr>
-                <w:rStyle w:val="Hyperlink"/>
-                <w:rFonts w:hint="eastAsia"/>
-                <w:noProof/>
-                <w:lang w:val="sv-SE"/>
-              </w:rPr>
-              <w:t>ö</w:t>
-            </w:r>
-            <w:r>
-              <w:rPr>
-                <w:rStyle w:val="Hyperlink"/>
-                <w:noProof/>
-                <w:lang w:val="sv-SE"/>
-              </w:rPr>
-              <w:t>rkortat IaC)</w:t>
+              <w:t>4.4 Bicep (Infrastructure as Code, förkortat IaC)</w:t>
             </w:r>
             <w:r>
               <w:rPr>
@@ -1561,7 +1493,7 @@
                 <w:noProof/>
                 <w:webHidden/>
               </w:rPr>
-              <w:instrText xml:space="preserve"> PAGEREF _Toc216041752 \h </w:instrText>
+              <w:instrText xml:space="preserve"> PAGEREF _Toc216213833 \h </w:instrText>
             </w:r>
             <w:r>
               <w:rPr>
@@ -1606,31 +1538,14 @@
               <w:lang w:val="en-SE" w:eastAsia="en-SE"/>
             </w:rPr>
           </w:pPr>
-          <w:hyperlink w:anchor="_Toc216041753" w:history="1">
+          <w:hyperlink w:anchor="_Toc216213834" w:history="1">
             <w:r>
               <w:rPr>
                 <w:rStyle w:val="Hyperlink"/>
                 <w:noProof/>
                 <w:lang w:val="sv-SE"/>
               </w:rPr>
-              <w:t>5. Testning, kvalitetss</w:t>
-            </w:r>
-            <w:r>
-              <w:rPr>
-                <w:rStyle w:val="Hyperlink"/>
-                <w:rFonts w:hint="eastAsia"/>
-                <w:noProof/>
-                <w:lang w:val="sv-SE"/>
-              </w:rPr>
-              <w:t>ä</w:t>
-            </w:r>
-            <w:r>
-              <w:rPr>
-                <w:rStyle w:val="Hyperlink"/>
-                <w:noProof/>
-                <w:lang w:val="sv-SE"/>
-              </w:rPr>
-              <w:t>kring och ytterligare verktyg</w:t>
+              <w:t>5. Testning, kvalitetssäkring och ytterligare verktyg</w:t>
             </w:r>
             <w:r>
               <w:rPr>
@@ -1651,7 +1566,7 @@
                 <w:noProof/>
                 <w:webHidden/>
               </w:rPr>
-              <w:instrText xml:space="preserve"> PAGEREF _Toc216041753 \h </w:instrText>
+              <w:instrText xml:space="preserve"> PAGEREF _Toc216213834 \h </w:instrText>
             </w:r>
             <w:r>
               <w:rPr>
@@ -1696,7 +1611,7 @@
               <w:lang w:val="en-SE" w:eastAsia="en-SE"/>
             </w:rPr>
           </w:pPr>
-          <w:hyperlink w:anchor="_Toc216041754" w:history="1">
+          <w:hyperlink w:anchor="_Toc216213835" w:history="1">
             <w:r>
               <w:rPr>
                 <w:rStyle w:val="Hyperlink"/>
@@ -1724,7 +1639,7 @@
                 <w:noProof/>
                 <w:webHidden/>
               </w:rPr>
-              <w:instrText xml:space="preserve"> PAGEREF _Toc216041754 \h </w:instrText>
+              <w:instrText xml:space="preserve"> PAGEREF _Toc216213835 \h </w:instrText>
             </w:r>
             <w:r>
               <w:rPr>
@@ -1769,7 +1684,7 @@
               <w:lang w:val="en-SE" w:eastAsia="en-SE"/>
             </w:rPr>
           </w:pPr>
-          <w:hyperlink w:anchor="_Toc216041755" w:history="1">
+          <w:hyperlink w:anchor="_Toc216213836" w:history="1">
             <w:r>
               <w:rPr>
                 <w:rStyle w:val="Hyperlink"/>
@@ -1797,7 +1712,7 @@
                 <w:noProof/>
                 <w:webHidden/>
               </w:rPr>
-              <w:instrText xml:space="preserve"> PAGEREF _Toc216041755 \h </w:instrText>
+              <w:instrText xml:space="preserve"> PAGEREF _Toc216213836 \h </w:instrText>
             </w:r>
             <w:r>
               <w:rPr>
@@ -1842,48 +1757,14 @@
               <w:lang w:val="en-SE" w:eastAsia="en-SE"/>
             </w:rPr>
           </w:pPr>
-          <w:hyperlink w:anchor="_Toc216041756" w:history="1">
+          <w:hyperlink w:anchor="_Toc216213837" w:history="1">
             <w:r>
               <w:rPr>
                 <w:rStyle w:val="Hyperlink"/>
                 <w:noProof/>
                 <w:lang w:val="sv-SE"/>
               </w:rPr>
-              <w:t xml:space="preserve">6. Huvudfunktionen </w:t>
-            </w:r>
-            <w:r>
-              <w:rPr>
-                <w:rStyle w:val="Hyperlink"/>
-                <w:rFonts w:hint="eastAsia"/>
-                <w:noProof/>
-                <w:lang w:val="sv-SE"/>
-              </w:rPr>
-              <w:t>–</w:t>
-            </w:r>
-            <w:r>
-              <w:rPr>
-                <w:rStyle w:val="Hyperlink"/>
-                <w:noProof/>
-                <w:lang w:val="sv-SE"/>
-              </w:rPr>
-              <w:t xml:space="preserve"> Den Stora R</w:t>
-            </w:r>
-            <w:r>
-              <w:rPr>
-                <w:rStyle w:val="Hyperlink"/>
-                <w:rFonts w:hint="eastAsia"/>
-                <w:noProof/>
-                <w:lang w:val="sv-SE"/>
-              </w:rPr>
-              <w:t>ö</w:t>
-            </w:r>
-            <w:r>
-              <w:rPr>
-                <w:rStyle w:val="Hyperlink"/>
-                <w:noProof/>
-                <w:lang w:val="sv-SE"/>
-              </w:rPr>
-              <w:t>da Knappen</w:t>
+              <w:t>6. Huvudfunktionen – Den Stora Röda Knappen</w:t>
             </w:r>
             <w:r>
               <w:rPr>
@@ -1904,7 +1785,7 @@
                 <w:noProof/>
                 <w:webHidden/>
               </w:rPr>
-              <w:instrText xml:space="preserve"> PAGEREF _Toc216041756 \h </w:instrText>
+              <w:instrText xml:space="preserve"> PAGEREF _Toc216213837 \h </w:instrText>
             </w:r>
             <w:r>
               <w:rPr>
@@ -1949,7 +1830,7 @@
               <w:lang w:val="en-SE" w:eastAsia="en-SE"/>
             </w:rPr>
           </w:pPr>
-          <w:hyperlink w:anchor="_Toc216041757" w:history="1">
+          <w:hyperlink w:anchor="_Toc216213838" w:history="1">
             <w:r>
               <w:rPr>
                 <w:rStyle w:val="Hyperlink"/>
@@ -1977,7 +1858,7 @@
                 <w:noProof/>
                 <w:webHidden/>
               </w:rPr>
-              <w:instrText xml:space="preserve"> PAGEREF _Toc216041757 \h </w:instrText>
+              <w:instrText xml:space="preserve"> PAGEREF _Toc216213838 \h </w:instrText>
             </w:r>
             <w:r>
               <w:rPr>
@@ -2022,7 +1903,7 @@
               <w:lang w:val="en-SE" w:eastAsia="en-SE"/>
             </w:rPr>
           </w:pPr>
-          <w:hyperlink w:anchor="_Toc216041758" w:history="1">
+          <w:hyperlink w:anchor="_Toc216213839" w:history="1">
             <w:r>
               <w:rPr>
                 <w:rStyle w:val="Hyperlink"/>
@@ -2050,7 +1931,7 @@
                 <w:noProof/>
                 <w:webHidden/>
               </w:rPr>
-              <w:instrText xml:space="preserve"> PAGEREF _Toc216041758 \h </w:instrText>
+              <w:instrText xml:space="preserve"> PAGEREF _Toc216213839 \h </w:instrText>
             </w:r>
             <w:r>
               <w:rPr>
@@ -2095,7 +1976,7 @@
               <w:lang w:val="en-SE" w:eastAsia="en-SE"/>
             </w:rPr>
           </w:pPr>
-          <w:hyperlink w:anchor="_Toc216041759" w:history="1">
+          <w:hyperlink w:anchor="_Toc216213840" w:history="1">
             <w:r>
               <w:rPr>
                 <w:rStyle w:val="Hyperlink"/>
@@ -2123,7 +2004,7 @@
                 <w:noProof/>
                 <w:webHidden/>
               </w:rPr>
-              <w:instrText xml:space="preserve"> PAGEREF _Toc216041759 \h </w:instrText>
+              <w:instrText xml:space="preserve"> PAGEREF _Toc216213840 \h </w:instrText>
             </w:r>
             <w:r>
               <w:rPr>
@@ -2143,7 +2024,7 @@
                 <w:noProof/>
                 <w:webHidden/>
               </w:rPr>
-              <w:t>8</w:t>
+              <w:t>9</w:t>
             </w:r>
             <w:r>
               <w:rPr>
@@ -2168,31 +2049,14 @@
               <w:lang w:val="en-SE" w:eastAsia="en-SE"/>
             </w:rPr>
           </w:pPr>
-          <w:hyperlink w:anchor="_Toc216041760" w:history="1">
+          <w:hyperlink w:anchor="_Toc216213841" w:history="1">
             <w:r>
               <w:rPr>
                 <w:rStyle w:val="Hyperlink"/>
                 <w:noProof/>
                 <w:lang w:val="sv-SE"/>
               </w:rPr>
-              <w:t>7.3 Hur Azure-tj</w:t>
-            </w:r>
-            <w:r>
-              <w:rPr>
-                <w:rStyle w:val="Hyperlink"/>
-                <w:rFonts w:hint="eastAsia"/>
-                <w:noProof/>
-                <w:lang w:val="sv-SE"/>
-              </w:rPr>
-              <w:t>ä</w:t>
-            </w:r>
-            <w:r>
-              <w:rPr>
-                <w:rStyle w:val="Hyperlink"/>
-                <w:noProof/>
-                <w:lang w:val="sv-SE"/>
-              </w:rPr>
-              <w:t>nsterna samverkar</w:t>
+              <w:t>7.3 Hur Azure-tjänsterna samverkar</w:t>
             </w:r>
             <w:r>
               <w:rPr>
@@ -2213,7 +2077,7 @@
                 <w:noProof/>
                 <w:webHidden/>
               </w:rPr>
-              <w:instrText xml:space="preserve"> PAGEREF _Toc216041760 \h </w:instrText>
+              <w:instrText xml:space="preserve"> PAGEREF _Toc216213841 \h </w:instrText>
             </w:r>
             <w:r>
               <w:rPr>
@@ -2258,31 +2122,14 @@
               <w:lang w:val="en-SE" w:eastAsia="en-SE"/>
             </w:rPr>
           </w:pPr>
-          <w:hyperlink w:anchor="_Toc216041761" w:history="1">
+          <w:hyperlink w:anchor="_Toc216213842" w:history="1">
             <w:r>
               <w:rPr>
                 <w:rStyle w:val="Hyperlink"/>
                 <w:noProof/>
                 <w:lang w:val="sv-SE"/>
               </w:rPr>
-              <w:t xml:space="preserve">7.4 </w:t>
-            </w:r>
-            <w:r>
-              <w:rPr>
-                <w:rStyle w:val="Hyperlink"/>
-                <w:rFonts w:hint="eastAsia"/>
-                <w:noProof/>
-                <w:lang w:val="sv-SE"/>
-              </w:rPr>
-              <w:t>Ö</w:t>
-            </w:r>
-            <w:r>
-              <w:rPr>
-                <w:rStyle w:val="Hyperlink"/>
-                <w:noProof/>
-                <w:lang w:val="sv-SE"/>
-              </w:rPr>
-              <w:t>verblick och analogi</w:t>
+              <w:t>7.4 Överblick och analogi</w:t>
             </w:r>
             <w:r>
               <w:rPr>
@@ -2303,7 +2150,7 @@
                 <w:noProof/>
                 <w:webHidden/>
               </w:rPr>
-              <w:instrText xml:space="preserve"> PAGEREF _Toc216041761 \h </w:instrText>
+              <w:instrText xml:space="preserve"> PAGEREF _Toc216213842 \h </w:instrText>
             </w:r>
             <w:r>
               <w:rPr>
@@ -2323,7 +2170,7 @@
                 <w:noProof/>
                 <w:webHidden/>
               </w:rPr>
-              <w:t>9</w:t>
+              <w:t>10</w:t>
             </w:r>
             <w:r>
               <w:rPr>
@@ -2348,7 +2195,7 @@
               <w:lang w:val="en-SE" w:eastAsia="en-SE"/>
             </w:rPr>
           </w:pPr>
-          <w:hyperlink w:anchor="_Toc216041762" w:history="1">
+          <w:hyperlink w:anchor="_Toc216213843" w:history="1">
             <w:r>
               <w:rPr>
                 <w:rStyle w:val="Hyperlink"/>
@@ -2376,7 +2223,7 @@
                 <w:noProof/>
                 <w:webHidden/>
               </w:rPr>
-              <w:instrText xml:space="preserve"> PAGEREF _Toc216041762 \h </w:instrText>
+              <w:instrText xml:space="preserve"> PAGEREF _Toc216213843 \h </w:instrText>
             </w:r>
             <w:r>
               <w:rPr>
@@ -2421,31 +2268,14 @@
               <w:lang w:val="en-SE" w:eastAsia="en-SE"/>
             </w:rPr>
           </w:pPr>
-          <w:hyperlink w:anchor="_Toc216041763" w:history="1">
+          <w:hyperlink w:anchor="_Toc216213844" w:history="1">
             <w:r>
               <w:rPr>
                 <w:rStyle w:val="Hyperlink"/>
                 <w:noProof/>
                 <w:lang w:val="sv-SE"/>
               </w:rPr>
-              <w:t>8.1 Viktiga ADRer f</w:t>
-            </w:r>
-            <w:r>
-              <w:rPr>
-                <w:rStyle w:val="Hyperlink"/>
-                <w:rFonts w:hint="eastAsia"/>
-                <w:noProof/>
-                <w:lang w:val="sv-SE"/>
-              </w:rPr>
-              <w:t>ö</w:t>
-            </w:r>
-            <w:r>
-              <w:rPr>
-                <w:rStyle w:val="Hyperlink"/>
-                <w:noProof/>
-                <w:lang w:val="sv-SE"/>
-              </w:rPr>
-              <w:t>r verktygsval:</w:t>
+              <w:t>8.1 Viktiga ADRer för verktygsval:</w:t>
             </w:r>
             <w:r>
               <w:rPr>
@@ -2466,7 +2296,7 @@
                 <w:noProof/>
                 <w:webHidden/>
               </w:rPr>
-              <w:instrText xml:space="preserve"> PAGEREF _Toc216041763 \h </w:instrText>
+              <w:instrText xml:space="preserve"> PAGEREF _Toc216213844 \h </w:instrText>
             </w:r>
             <w:r>
               <w:rPr>
@@ -2516,7 +2346,7 @@
           <w:lang w:val="sv-SE"/>
         </w:rPr>
       </w:pPr>
-      <w:bookmarkStart w:id="0" w:name="_Toc216041734"/>
+      <w:bookmarkStart w:id="0" w:name="_Toc216213815"/>
       <w:r>
         <w:rPr>
           <w:lang w:val="sv-SE"/>
@@ -2594,7 +2424,7 @@
           <w:lang w:val="sv-SE"/>
         </w:rPr>
       </w:pPr>
-      <w:bookmarkStart w:id="1" w:name="_Toc216041735"/>
+      <w:bookmarkStart w:id="1" w:name="_Toc216213816"/>
       <w:r>
         <w:rPr>
           <w:lang w:val="sv-SE"/>
@@ -2742,20 +2572,33 @@
           <w:lang w:val="sv-SE"/>
         </w:rPr>
       </w:pPr>
-      <w:hyperlink r:id="rId7" w:history="1">
-        <w:proofErr w:type="spellStart"/>
-        <w:r>
-          <w:rPr>
-            <w:rStyle w:val="Hyperlink"/>
-            <w:rFonts w:ascii="Calibri" w:hAnsi="Calibri" w:cs="Calibri"/>
-            <w:sz w:val="24"/>
-            <w:szCs w:val="24"/>
-            <w:lang w:val="sv-SE"/>
-          </w:rPr>
-          <w:t>Glossary</w:t>
-        </w:r>
-        <w:proofErr w:type="spellEnd"/>
-      </w:hyperlink>
+      <w:r>
+        <w:fldChar w:fldCharType="begin"/>
+      </w:r>
+      <w:r>
+        <w:rPr>
+          <w:lang w:val="sv-SE"/>
+        </w:rPr>
+        <w:instrText>HYPERLINK "https://github.com/mymh13/clo24-nikhal78-examwork/blob/main/docs/glossary.md"</w:instrText>
+      </w:r>
+      <w:r>
+        <w:fldChar w:fldCharType="separate"/>
+      </w:r>
+      <w:proofErr w:type="spellStart"/>
+      <w:r>
+        <w:rPr>
+          <w:rStyle w:val="Hyperlink"/>
+          <w:rFonts w:ascii="Calibri" w:hAnsi="Calibri" w:cs="Calibri"/>
+          <w:sz w:val="24"/>
+          <w:szCs w:val="24"/>
+          <w:lang w:val="sv-SE"/>
+        </w:rPr>
+        <w:t>Glossary</w:t>
+      </w:r>
+      <w:proofErr w:type="spellEnd"/>
+      <w:r>
+        <w:fldChar w:fldCharType="end"/>
+      </w:r>
       <w:r>
         <w:rPr>
           <w:rFonts w:ascii="Calibri" w:hAnsi="Calibri" w:cs="Calibri"/>
@@ -2775,18 +2618,31 @@
           <w:lang w:val="sv-SE"/>
         </w:rPr>
       </w:pPr>
-      <w:hyperlink r:id="rId8" w:history="1">
-        <w:r>
-          <w:rPr>
-            <w:rStyle w:val="Hyperlink"/>
-            <w:rFonts w:ascii="Calibri" w:hAnsi="Calibri" w:cs="Calibri"/>
-            <w:sz w:val="24"/>
-            <w:szCs w:val="24"/>
-            <w:lang w:val="sv-SE"/>
-          </w:rPr>
-          <w:t>Systemöversikt</w:t>
-        </w:r>
-      </w:hyperlink>
+      <w:r>
+        <w:fldChar w:fldCharType="begin"/>
+      </w:r>
+      <w:r>
+        <w:rPr>
+          <w:lang w:val="sv-SE"/>
+        </w:rPr>
+        <w:instrText>HYPERLINK "https://github.com/mymh13/clo24-nikhal78-examwork/blob/main/docs/initial_outtakes/system_overview.md"</w:instrText>
+      </w:r>
+      <w:r>
+        <w:fldChar w:fldCharType="separate"/>
+      </w:r>
+      <w:r>
+        <w:rPr>
+          <w:rStyle w:val="Hyperlink"/>
+          <w:rFonts w:ascii="Calibri" w:hAnsi="Calibri" w:cs="Calibri"/>
+          <w:sz w:val="24"/>
+          <w:szCs w:val="24"/>
+          <w:lang w:val="sv-SE"/>
+        </w:rPr>
+        <w:t>Systemöversikt</w:t>
+      </w:r>
+      <w:r>
+        <w:fldChar w:fldCharType="end"/>
+      </w:r>
       <w:r>
         <w:rPr>
           <w:rFonts w:ascii="Calibri" w:hAnsi="Calibri" w:cs="Calibri"/>
@@ -2811,7 +2667,7 @@
           <w:lang w:val="sv-SE"/>
         </w:rPr>
       </w:pPr>
-      <w:bookmarkStart w:id="2" w:name="_Toc216041736"/>
+      <w:bookmarkStart w:id="2" w:name="_Toc216213817"/>
       <w:r>
         <w:rPr>
           <w:lang w:val="sv-SE"/>
@@ -3003,7 +2859,7 @@
           <w:lang w:val="sv-SE"/>
         </w:rPr>
       </w:pPr>
-      <w:bookmarkStart w:id="3" w:name="_Toc216041737"/>
+      <w:bookmarkStart w:id="3" w:name="_Toc216213818"/>
       <w:r>
         <w:rPr>
           <w:lang w:val="sv-SE"/>
@@ -3274,7 +3130,7 @@
           <w:lang w:val="sv-SE"/>
         </w:rPr>
       </w:pPr>
-      <w:bookmarkStart w:id="4" w:name="_Toc216041738"/>
+      <w:bookmarkStart w:id="4" w:name="_Toc216213819"/>
       <w:r>
         <w:rPr>
           <w:lang w:val="sv-SE"/>
@@ -3336,7 +3192,16 @@
           <w:szCs w:val="24"/>
           <w:lang w:val="sv-SE"/>
         </w:rPr>
-        <w:t>.</w:t>
+        <w:t xml:space="preserve">. </w:t>
+      </w:r>
+      <w:r>
+        <w:rPr>
+          <w:rFonts w:ascii="Calibri" w:hAnsi="Calibri" w:cs="Calibri"/>
+          <w:sz w:val="24"/>
+          <w:szCs w:val="24"/>
+          <w:lang w:val="sv-SE"/>
+        </w:rPr>
+        <w:t>Det ger stabilitet</w:t>
       </w:r>
       <w:r>
         <w:rPr>
@@ -3354,24 +3219,6 @@
           <w:szCs w:val="24"/>
           <w:lang w:val="sv-SE"/>
         </w:rPr>
-        <w:t>Det ger stabilitet</w:t>
-      </w:r>
-      <w:r>
-        <w:rPr>
-          <w:rFonts w:ascii="Calibri" w:hAnsi="Calibri" w:cs="Calibri"/>
-          <w:sz w:val="24"/>
-          <w:szCs w:val="24"/>
-          <w:lang w:val="sv-SE"/>
-        </w:rPr>
-        <w:t xml:space="preserve"> </w:t>
-      </w:r>
-      <w:r>
-        <w:rPr>
-          <w:rFonts w:ascii="Calibri" w:hAnsi="Calibri" w:cs="Calibri"/>
-          <w:sz w:val="24"/>
-          <w:szCs w:val="24"/>
-          <w:lang w:val="sv-SE"/>
-        </w:rPr>
         <w:t xml:space="preserve">och </w:t>
       </w:r>
       <w:r>
@@ -3400,7 +3247,7 @@
           <w:lang w:val="sv-SE"/>
         </w:rPr>
       </w:pPr>
-      <w:bookmarkStart w:id="5" w:name="_Toc216041739"/>
+      <w:bookmarkStart w:id="5" w:name="_Toc216213820"/>
       <w:r>
         <w:rPr>
           <w:lang w:val="sv-SE"/>
@@ -3736,7 +3583,7 @@
           <w:lang w:val="sv-SE"/>
         </w:rPr>
       </w:pPr>
-      <w:bookmarkStart w:id="6" w:name="_Toc216041740"/>
+      <w:bookmarkStart w:id="6" w:name="_Toc216213821"/>
       <w:r>
         <w:rPr>
           <w:lang w:val="sv-SE"/>
@@ -3829,29 +3676,7 @@
           <w:szCs w:val="24"/>
           <w:lang w:val="sv-SE"/>
         </w:rPr>
-        <w:t>En bra liknelse är en stor parkeringsplats där vi hyr utrymme</w:t>
-      </w:r>
-      <w:r>
-        <w:rPr>
-          <w:rFonts w:ascii="Calibri" w:hAnsi="Calibri" w:cs="Calibri"/>
-          <w:i/>
-          <w:iCs/>
-          <w:sz w:val="24"/>
-          <w:szCs w:val="24"/>
-          <w:lang w:val="sv-SE"/>
-        </w:rPr>
-        <w:t xml:space="preserve"> (vid behov, eller över längre perioder) </w:t>
-      </w:r>
-      <w:r>
-        <w:rPr>
-          <w:rFonts w:ascii="Calibri" w:hAnsi="Calibri" w:cs="Calibri"/>
-          <w:i/>
-          <w:iCs/>
-          <w:sz w:val="24"/>
-          <w:szCs w:val="24"/>
-          <w:lang w:val="sv-SE"/>
-        </w:rPr>
-        <w:t>och bara betalar för den del vi använder.</w:t>
+        <w:t>En bra liknelse är en stor parkeringsplats där vi hyr utrymme (vid behov, eller över längre perioder) och bara betalar för den del vi använder.</w:t>
       </w:r>
     </w:p>
     <w:p>
@@ -3967,7 +3792,7 @@
                     <pic:cNvPicPr/>
                   </pic:nvPicPr>
                   <pic:blipFill>
-                    <a:blip r:embed="rId9"/>
+                    <a:blip r:embed="rId7"/>
                     <a:stretch>
                       <a:fillRect/>
                     </a:stretch>
@@ -4031,19 +3856,27 @@
       <w:pPr>
         <w:pStyle w:val="Heading3"/>
         <w:rPr>
-          <w:lang w:val="en-US"/>
-        </w:rPr>
-      </w:pPr>
-      <w:bookmarkStart w:id="7" w:name="_Toc216041741"/>
-      <w:r>
-        <w:rPr>
-          <w:lang w:val="en-US"/>
-        </w:rPr>
-        <w:t>3.1 Azure</w:t>
-      </w:r>
-      <w:r>
-        <w:rPr>
-          <w:lang w:val="en-US"/>
+          <w:lang w:val="sv-SE"/>
+        </w:rPr>
+      </w:pPr>
+      <w:bookmarkStart w:id="7" w:name="_Toc216213822"/>
+      <w:r>
+        <w:rPr>
+          <w:lang w:val="sv-SE"/>
+        </w:rPr>
+        <w:t xml:space="preserve">3.1 </w:t>
+      </w:r>
+      <w:proofErr w:type="spellStart"/>
+      <w:r>
+        <w:rPr>
+          <w:lang w:val="sv-SE"/>
+        </w:rPr>
+        <w:t>Azure</w:t>
+      </w:r>
+      <w:proofErr w:type="spellEnd"/>
+      <w:r>
+        <w:rPr>
+          <w:lang w:val="sv-SE"/>
         </w:rPr>
         <w:t xml:space="preserve"> Service Bus</w:t>
       </w:r>
@@ -4118,7 +3951,7 @@
           <w:lang w:val="sv-SE"/>
         </w:rPr>
       </w:pPr>
-      <w:bookmarkStart w:id="8" w:name="_Toc216041742"/>
+      <w:bookmarkStart w:id="8" w:name="_Toc216213823"/>
       <w:r>
         <w:rPr>
           <w:lang w:val="sv-SE"/>
@@ -4238,7 +4071,7 @@
           <w:lang w:val="sv-SE"/>
         </w:rPr>
       </w:pPr>
-      <w:bookmarkStart w:id="9" w:name="_Toc216041743"/>
+      <w:bookmarkStart w:id="9" w:name="_Toc216213824"/>
       <w:r>
         <w:rPr>
           <w:lang w:val="sv-SE"/>
@@ -4529,7 +4362,7 @@
           <w:lang w:val="sv-SE"/>
         </w:rPr>
       </w:pPr>
-      <w:bookmarkStart w:id="10" w:name="_Toc216041744"/>
+      <w:bookmarkStart w:id="10" w:name="_Toc216213825"/>
       <w:r>
         <w:rPr>
           <w:lang w:val="sv-SE"/>
@@ -4708,23 +4541,53 @@
       <w:pPr>
         <w:pStyle w:val="Heading3"/>
         <w:rPr>
-          <w:lang w:val="en-US"/>
-        </w:rPr>
-      </w:pPr>
-      <w:bookmarkStart w:id="11" w:name="_Toc216041745"/>
-      <w:r>
-        <w:rPr>
-          <w:lang w:val="en-US"/>
-        </w:rPr>
-        <w:t>3.5 Azure</w:t>
-      </w:r>
-      <w:r>
-        <w:rPr>
-          <w:lang w:val="en-US"/>
-        </w:rPr>
-        <w:t xml:space="preserve"> App Configuration</w:t>
+          <w:lang w:val="sv-SE"/>
+        </w:rPr>
+      </w:pPr>
+      <w:bookmarkStart w:id="11" w:name="_Toc216213826"/>
+      <w:r>
+        <w:rPr>
+          <w:lang w:val="sv-SE"/>
+        </w:rPr>
+        <w:t xml:space="preserve">3.5 </w:t>
+      </w:r>
+      <w:proofErr w:type="spellStart"/>
+      <w:r>
+        <w:rPr>
+          <w:lang w:val="sv-SE"/>
+        </w:rPr>
+        <w:t>Azure</w:t>
+      </w:r>
+      <w:proofErr w:type="spellEnd"/>
+      <w:r>
+        <w:rPr>
+          <w:lang w:val="sv-SE"/>
+        </w:rPr>
+        <w:t xml:space="preserve"> </w:t>
+      </w:r>
+      <w:proofErr w:type="spellStart"/>
+      <w:r>
+        <w:rPr>
+          <w:lang w:val="sv-SE"/>
+        </w:rPr>
+        <w:t>App</w:t>
+      </w:r>
+      <w:proofErr w:type="spellEnd"/>
+      <w:r>
+        <w:rPr>
+          <w:lang w:val="sv-SE"/>
+        </w:rPr>
+        <w:t xml:space="preserve"> </w:t>
+      </w:r>
+      <w:proofErr w:type="spellStart"/>
+      <w:r>
+        <w:rPr>
+          <w:lang w:val="sv-SE"/>
+        </w:rPr>
+        <w:t>Configuration</w:t>
       </w:r>
       <w:bookmarkEnd w:id="11"/>
+      <w:proofErr w:type="spellEnd"/>
     </w:p>
     <w:p>
       <w:pPr>
@@ -4871,7 +4734,7 @@
           <w:lang w:val="sv-SE"/>
         </w:rPr>
       </w:pPr>
-      <w:bookmarkStart w:id="12" w:name="_Toc216041746"/>
+      <w:bookmarkStart w:id="12" w:name="_Toc216213827"/>
       <w:r>
         <w:rPr>
           <w:lang w:val="sv-SE"/>
@@ -5071,35 +4934,53 @@
       <w:pPr>
         <w:pStyle w:val="Heading3"/>
         <w:rPr>
-          <w:lang w:val="en-US"/>
-        </w:rPr>
-      </w:pPr>
-      <w:bookmarkStart w:id="13" w:name="_Toc216041747"/>
-      <w:r>
-        <w:rPr>
-          <w:lang w:val="en-US"/>
-        </w:rPr>
-        <w:t>3.</w:t>
-      </w:r>
-      <w:r>
-        <w:rPr>
-          <w:lang w:val="en-US"/>
-        </w:rPr>
-        <w:t>7</w:t>
-      </w:r>
-      <w:r>
-        <w:rPr>
-          <w:lang w:val="en-US"/>
-        </w:rPr>
-        <w:t xml:space="preserve"> Azure </w:t>
-      </w:r>
-      <w:r>
-        <w:rPr>
-          <w:lang w:val="en-US"/>
-        </w:rPr>
-        <w:t>Storage Account</w:t>
+          <w:lang w:val="sv-SE"/>
+        </w:rPr>
+      </w:pPr>
+      <w:bookmarkStart w:id="13" w:name="_Toc216213828"/>
+      <w:r>
+        <w:rPr>
+          <w:lang w:val="sv-SE"/>
+        </w:rPr>
+        <w:t xml:space="preserve">3.7 </w:t>
+      </w:r>
+      <w:proofErr w:type="spellStart"/>
+      <w:r>
+        <w:rPr>
+          <w:lang w:val="sv-SE"/>
+        </w:rPr>
+        <w:t>Azure</w:t>
+      </w:r>
+      <w:proofErr w:type="spellEnd"/>
+      <w:r>
+        <w:rPr>
+          <w:lang w:val="sv-SE"/>
+        </w:rPr>
+        <w:t xml:space="preserve"> </w:t>
+      </w:r>
+      <w:proofErr w:type="spellStart"/>
+      <w:r>
+        <w:rPr>
+          <w:lang w:val="sv-SE"/>
+        </w:rPr>
+        <w:t>Storage</w:t>
+      </w:r>
+      <w:proofErr w:type="spellEnd"/>
+      <w:r>
+        <w:rPr>
+          <w:lang w:val="sv-SE"/>
+        </w:rPr>
+        <w:t xml:space="preserve"> </w:t>
+      </w:r>
+      <w:proofErr w:type="spellStart"/>
+      <w:r>
+        <w:rPr>
+          <w:lang w:val="sv-SE"/>
+        </w:rPr>
+        <w:t>Account</w:t>
       </w:r>
       <w:bookmarkEnd w:id="13"/>
+      <w:proofErr w:type="spellEnd"/>
     </w:p>
     <w:p>
       <w:pPr>
@@ -5250,7 +5131,7 @@
           <w:lang w:val="sv-SE"/>
         </w:rPr>
       </w:pPr>
-      <w:bookmarkStart w:id="14" w:name="_Toc216041748"/>
+      <w:bookmarkStart w:id="14" w:name="_Toc216213829"/>
       <w:r>
         <w:rPr>
           <w:lang w:val="sv-SE"/>
@@ -5406,7 +5287,7 @@
           <w:lang w:val="sv-SE"/>
         </w:rPr>
       </w:pPr>
-      <w:bookmarkStart w:id="15" w:name="_Toc216041749"/>
+      <w:bookmarkStart w:id="15" w:name="_Toc216213830"/>
       <w:r>
         <w:rPr>
           <w:lang w:val="sv-SE"/>
@@ -5581,28 +5462,44 @@
       <w:pPr>
         <w:pStyle w:val="Heading3"/>
         <w:rPr>
-          <w:lang w:val="en-US"/>
-        </w:rPr>
-      </w:pPr>
-      <w:bookmarkStart w:id="16" w:name="_Toc216041750"/>
-      <w:r>
-        <w:rPr>
-          <w:lang w:val="en-US"/>
+          <w:lang w:val="sv-SE"/>
+        </w:rPr>
+      </w:pPr>
+      <w:bookmarkStart w:id="16" w:name="_Toc216213831"/>
+      <w:r>
+        <w:rPr>
+          <w:lang w:val="sv-SE"/>
         </w:rPr>
         <w:lastRenderedPageBreak/>
-        <w:t>4.1 GitHub</w:t>
-      </w:r>
-      <w:r>
-        <w:rPr>
-          <w:lang w:val="en-US"/>
+        <w:t xml:space="preserve">4.1 </w:t>
+      </w:r>
+      <w:proofErr w:type="spellStart"/>
+      <w:r>
+        <w:rPr>
+          <w:lang w:val="sv-SE"/>
+        </w:rPr>
+        <w:t>GitHub</w:t>
+      </w:r>
+      <w:proofErr w:type="spellEnd"/>
+      <w:r>
+        <w:rPr>
+          <w:lang w:val="sv-SE"/>
         </w:rPr>
         <w:t xml:space="preserve"> och </w:t>
       </w:r>
-      <w:r>
-        <w:rPr>
-          <w:lang w:val="en-US"/>
-        </w:rPr>
-        <w:t>GitHub Actions</w:t>
+      <w:proofErr w:type="spellStart"/>
+      <w:r>
+        <w:rPr>
+          <w:lang w:val="sv-SE"/>
+        </w:rPr>
+        <w:t>GitHub</w:t>
+      </w:r>
+      <w:proofErr w:type="spellEnd"/>
+      <w:r>
+        <w:rPr>
+          <w:lang w:val="sv-SE"/>
+        </w:rPr>
+        <w:t xml:space="preserve"> Actions</w:t>
       </w:r>
       <w:bookmarkEnd w:id="16"/>
     </w:p>
@@ -5982,7 +5879,7 @@
           <w:lang w:val="sv-SE"/>
         </w:rPr>
       </w:pPr>
-      <w:bookmarkStart w:id="17" w:name="_Toc216041751"/>
+      <w:bookmarkStart w:id="17" w:name="_Toc216213832"/>
       <w:r>
         <w:rPr>
           <w:lang w:val="sv-SE"/>
@@ -6145,24 +6042,12 @@
           <w:lang w:val="sv-SE"/>
         </w:rPr>
       </w:pPr>
-      <w:bookmarkStart w:id="18" w:name="_Toc216041752"/>
-      <w:r>
-        <w:rPr>
-          <w:lang w:val="sv-SE"/>
-        </w:rPr>
-        <w:t>4.</w:t>
-      </w:r>
-      <w:r>
-        <w:rPr>
-          <w:lang w:val="sv-SE"/>
-        </w:rPr>
-        <w:t>4</w:t>
-      </w:r>
-      <w:r>
-        <w:rPr>
-          <w:lang w:val="sv-SE"/>
-        </w:rPr>
-        <w:t xml:space="preserve"> </w:t>
+      <w:bookmarkStart w:id="18" w:name="_Toc216213833"/>
+      <w:r>
+        <w:rPr>
+          <w:lang w:val="sv-SE"/>
+        </w:rPr>
+        <w:t xml:space="preserve">4.4 </w:t>
       </w:r>
       <w:proofErr w:type="spellStart"/>
       <w:r>
@@ -6473,7 +6358,7 @@
           <w:lang w:val="sv-SE"/>
         </w:rPr>
       </w:pPr>
-      <w:bookmarkStart w:id="19" w:name="_Toc216041753"/>
+      <w:bookmarkStart w:id="19" w:name="_Toc216213834"/>
       <w:r>
         <w:rPr>
           <w:lang w:val="sv-SE"/>
@@ -6521,7 +6406,7 @@
           <w:lang w:val="sv-SE"/>
         </w:rPr>
       </w:pPr>
-      <w:bookmarkStart w:id="20" w:name="_Toc216041754"/>
+      <w:bookmarkStart w:id="20" w:name="_Toc216213835"/>
       <w:r>
         <w:rPr>
           <w:lang w:val="sv-SE"/>
@@ -6752,7 +6637,7 @@
           <w:lang w:val="sv-SE"/>
         </w:rPr>
       </w:pPr>
-      <w:bookmarkStart w:id="21" w:name="_Toc216041755"/>
+      <w:bookmarkStart w:id="21" w:name="_Toc216213836"/>
       <w:r>
         <w:rPr>
           <w:lang w:val="sv-SE"/>
@@ -6859,7 +6744,7 @@
           <w:lang w:val="sv-SE"/>
         </w:rPr>
       </w:pPr>
-      <w:bookmarkStart w:id="22" w:name="_Toc216041756"/>
+      <w:bookmarkStart w:id="22" w:name="_Toc216213837"/>
       <w:r>
         <w:rPr>
           <w:lang w:val="sv-SE"/>
@@ -6931,7 +6816,7 @@
                     <pic:cNvPicPr/>
                   </pic:nvPicPr>
                   <pic:blipFill>
-                    <a:blip r:embed="rId10"/>
+                    <a:blip r:embed="rId8"/>
                     <a:stretch>
                       <a:fillRect/>
                     </a:stretch>
@@ -7283,7 +7168,7 @@
           <w:lang w:val="sv-SE"/>
         </w:rPr>
       </w:pPr>
-      <w:bookmarkStart w:id="23" w:name="_Toc216041757"/>
+      <w:bookmarkStart w:id="23" w:name="_Toc216213838"/>
       <w:r>
         <w:rPr>
           <w:lang w:val="sv-SE"/>
@@ -7336,100 +7221,55 @@
       <w:pPr>
         <w:rPr>
           <w:rFonts w:ascii="Calibri" w:hAnsi="Calibri" w:cs="Calibri"/>
-          <w:color w:val="EE0000"/>
-          <w:sz w:val="28"/>
-          <w:szCs w:val="28"/>
-          <w:lang w:val="sv-SE"/>
-        </w:rPr>
-      </w:pPr>
-      <w:r>
-        <w:rPr>
-          <w:rFonts w:ascii="Calibri" w:hAnsi="Calibri" w:cs="Calibri"/>
-          <w:color w:val="EE0000"/>
-          <w:sz w:val="28"/>
-          <w:szCs w:val="28"/>
-          <w:lang w:val="sv-SE"/>
-        </w:rPr>
-        <w:t xml:space="preserve">Infoga här ett flödesschema eller liknande som visar webfront/.NET, </w:t>
-      </w:r>
-      <w:proofErr w:type="spellStart"/>
-      <w:r>
-        <w:rPr>
-          <w:rFonts w:ascii="Calibri" w:hAnsi="Calibri" w:cs="Calibri"/>
-          <w:color w:val="EE0000"/>
-          <w:sz w:val="28"/>
-          <w:szCs w:val="28"/>
-          <w:lang w:val="sv-SE"/>
-        </w:rPr>
-        <w:t>APIer</w:t>
-      </w:r>
-      <w:proofErr w:type="spellEnd"/>
-      <w:r>
-        <w:rPr>
-          <w:rFonts w:ascii="Calibri" w:hAnsi="Calibri" w:cs="Calibri"/>
-          <w:color w:val="EE0000"/>
-          <w:sz w:val="28"/>
-          <w:szCs w:val="28"/>
-          <w:lang w:val="sv-SE"/>
-        </w:rPr>
-        <w:t>/.NET, databas/</w:t>
-      </w:r>
-      <w:proofErr w:type="spellStart"/>
-      <w:r>
-        <w:rPr>
-          <w:rFonts w:ascii="Calibri" w:hAnsi="Calibri" w:cs="Calibri"/>
-          <w:color w:val="EE0000"/>
-          <w:sz w:val="28"/>
-          <w:szCs w:val="28"/>
-          <w:lang w:val="sv-SE"/>
-        </w:rPr>
-        <w:t>CosmosDB</w:t>
-      </w:r>
-      <w:proofErr w:type="spellEnd"/>
-      <w:r>
-        <w:rPr>
-          <w:rFonts w:ascii="Calibri" w:hAnsi="Calibri" w:cs="Calibri"/>
-          <w:color w:val="EE0000"/>
-          <w:sz w:val="28"/>
-          <w:szCs w:val="28"/>
-          <w:lang w:val="sv-SE"/>
-        </w:rPr>
-        <w:t xml:space="preserve"> samt olika transportsträckor: synkron direkt mellan DB och applikation, och en eventbaserad som går via Service Bus, </w:t>
-      </w:r>
-      <w:proofErr w:type="spellStart"/>
-      <w:r>
-        <w:rPr>
-          <w:rFonts w:ascii="Calibri" w:hAnsi="Calibri" w:cs="Calibri"/>
-          <w:color w:val="EE0000"/>
-          <w:sz w:val="28"/>
-          <w:szCs w:val="28"/>
-          <w:lang w:val="sv-SE"/>
-        </w:rPr>
-        <w:t>Functions</w:t>
-      </w:r>
-      <w:proofErr w:type="spellEnd"/>
-      <w:r>
-        <w:rPr>
-          <w:rFonts w:ascii="Calibri" w:hAnsi="Calibri" w:cs="Calibri"/>
-          <w:color w:val="EE0000"/>
-          <w:sz w:val="28"/>
-          <w:szCs w:val="28"/>
-          <w:lang w:val="sv-SE"/>
-        </w:rPr>
-        <w:t xml:space="preserve"> </w:t>
-      </w:r>
-      <w:proofErr w:type="gramStart"/>
-      <w:r>
-        <w:rPr>
-          <w:rFonts w:ascii="Calibri" w:hAnsi="Calibri" w:cs="Calibri"/>
-          <w:color w:val="EE0000"/>
-          <w:sz w:val="28"/>
-          <w:szCs w:val="28"/>
-          <w:lang w:val="sv-SE"/>
-        </w:rPr>
-        <w:t>etc.</w:t>
-      </w:r>
-      <w:proofErr w:type="gramEnd"/>
+          <w:sz w:val="24"/>
+          <w:szCs w:val="24"/>
+          <w:lang w:val="sv-SE"/>
+        </w:rPr>
+      </w:pPr>
+      <w:r>
+        <w:rPr>
+          <w:rFonts w:ascii="Calibri" w:hAnsi="Calibri" w:cs="Calibri"/>
+          <w:noProof/>
+          <w:sz w:val="24"/>
+          <w:szCs w:val="24"/>
+          <w:lang w:val="sv-SE"/>
+        </w:rPr>
+        <w:drawing>
+          <wp:inline distT="0" distB="0" distL="0" distR="0" wp14:anchorId="67FDF0F3" wp14:editId="519FC3BA">
+            <wp:extent cx="5743575" cy="2740025"/>
+            <wp:effectExtent l="0" t="0" r="9525" b="3175"/>
+            <wp:docPr id="1734415643" name="Picture 1" descr="A screenshot of a computer&#10;&#10;AI-generated content may be incorrect."/>
+            <wp:cNvGraphicFramePr>
+              <a:graphicFrameLocks xmlns:a="http://schemas.openxmlformats.org/drawingml/2006/main" noChangeAspect="1"/>
+            </wp:cNvGraphicFramePr>
+            <a:graphic xmlns:a="http://schemas.openxmlformats.org/drawingml/2006/main">
+              <a:graphicData uri="http://schemas.openxmlformats.org/drawingml/2006/picture">
+                <pic:pic xmlns:pic="http://schemas.openxmlformats.org/drawingml/2006/picture">
+                  <pic:nvPicPr>
+                    <pic:cNvPr id="1734415643" name="Picture 1" descr="A screenshot of a computer&#10;&#10;AI-generated content may be incorrect."/>
+                    <pic:cNvPicPr/>
+                  </pic:nvPicPr>
+                  <pic:blipFill>
+                    <a:blip r:embed="rId9"/>
+                    <a:stretch>
+                      <a:fillRect/>
+                    </a:stretch>
+                  </pic:blipFill>
+                  <pic:spPr>
+                    <a:xfrm>
+                      <a:off x="0" y="0"/>
+                      <a:ext cx="5743575" cy="2740025"/>
+                    </a:xfrm>
+                    <a:prstGeom prst="rect">
+                      <a:avLst/>
+                    </a:prstGeom>
+                  </pic:spPr>
+                </pic:pic>
+              </a:graphicData>
+            </a:graphic>
+          </wp:inline>
+        </w:drawing>
+      </w:r>
     </w:p>
     <w:p>
       <w:pPr>
@@ -7439,7 +7279,7 @@
         </w:rPr>
       </w:pPr>
       <w:bookmarkStart w:id="24" w:name="_7.1_Synkront_system:"/>
-      <w:bookmarkStart w:id="25" w:name="_Toc216041758"/>
+      <w:bookmarkStart w:id="25" w:name="_Toc216213839"/>
       <w:bookmarkEnd w:id="24"/>
       <w:r>
         <w:rPr>
@@ -7462,16 +7302,7 @@
           <w:szCs w:val="24"/>
           <w:lang w:val="sv-SE"/>
         </w:rPr>
-        <w:t>Flöde</w:t>
-      </w:r>
-      <w:r>
-        <w:rPr>
-          <w:rFonts w:ascii="Calibri" w:hAnsi="Calibri" w:cs="Calibri"/>
-          <w:sz w:val="24"/>
-          <w:szCs w:val="24"/>
-          <w:lang w:val="sv-SE"/>
-        </w:rPr>
-        <w:t>:</w:t>
+        <w:t>Flöde:</w:t>
       </w:r>
     </w:p>
     <w:p>
@@ -7639,6 +7470,7 @@
           <w:szCs w:val="24"/>
           <w:lang w:val="sv-SE"/>
         </w:rPr>
+        <w:lastRenderedPageBreak/>
         <w:t>Fördelar: Snabb respons, lätt att förstå.</w:t>
       </w:r>
     </w:p>
@@ -7669,37 +7501,13 @@
         </w:rPr>
       </w:pPr>
       <w:bookmarkStart w:id="26" w:name="_7.2_Eventdrivet_system:"/>
-      <w:bookmarkStart w:id="27" w:name="_Toc216041759"/>
+      <w:bookmarkStart w:id="27" w:name="_Toc216213840"/>
       <w:bookmarkEnd w:id="26"/>
       <w:r>
         <w:rPr>
           <w:lang w:val="sv-SE"/>
         </w:rPr>
-        <w:t>7.</w:t>
-      </w:r>
-      <w:r>
-        <w:rPr>
-          <w:lang w:val="sv-SE"/>
-        </w:rPr>
-        <w:t>2</w:t>
-      </w:r>
-      <w:r>
-        <w:rPr>
-          <w:lang w:val="sv-SE"/>
-        </w:rPr>
-        <w:t xml:space="preserve"> </w:t>
-      </w:r>
-      <w:r>
-        <w:rPr>
-          <w:lang w:val="sv-SE"/>
-        </w:rPr>
-        <w:t>Eventdrivet</w:t>
-      </w:r>
-      <w:r>
-        <w:rPr>
-          <w:lang w:val="sv-SE"/>
-        </w:rPr>
-        <w:t xml:space="preserve"> system:</w:t>
+        <w:t>7.2 Eventdrivet system:</w:t>
       </w:r>
       <w:bookmarkEnd w:id="27"/>
     </w:p>
@@ -7716,16 +7524,7 @@
           <w:szCs w:val="24"/>
           <w:lang w:val="sv-SE"/>
         </w:rPr>
-        <w:t>Flöde</w:t>
-      </w:r>
-      <w:r>
-        <w:rPr>
-          <w:rFonts w:ascii="Calibri" w:hAnsi="Calibri" w:cs="Calibri"/>
-          <w:sz w:val="24"/>
-          <w:szCs w:val="24"/>
-          <w:lang w:val="sv-SE"/>
-        </w:rPr>
-        <w:t>:</w:t>
+        <w:t>Flöde:</w:t>
       </w:r>
     </w:p>
     <w:p>
@@ -7968,17 +7767,7 @@
           <w:szCs w:val="24"/>
           <w:lang w:val="sv-SE"/>
         </w:rPr>
-        <w:t xml:space="preserve">. Sedan </w:t>
-      </w:r>
-      <w:r>
-        <w:rPr>
-          <w:rFonts w:ascii="Calibri" w:hAnsi="Calibri" w:cs="Calibri"/>
-          <w:sz w:val="24"/>
-          <w:szCs w:val="24"/>
-          <w:lang w:val="sv-SE"/>
-        </w:rPr>
-        <w:lastRenderedPageBreak/>
-        <w:t xml:space="preserve">skickas det vidare till Service Bus, som i sin tur triggar en </w:t>
+        <w:t xml:space="preserve">. Sedan skickas det vidare till Service Bus, som i sin tur triggar en </w:t>
       </w:r>
       <w:proofErr w:type="spellStart"/>
       <w:r>
@@ -8066,18 +7855,12 @@
           <w:lang w:val="sv-SE"/>
         </w:rPr>
       </w:pPr>
-      <w:bookmarkStart w:id="28" w:name="_Toc216041760"/>
-      <w:r>
-        <w:rPr>
-          <w:lang w:val="sv-SE"/>
-        </w:rPr>
-        <w:t>7.</w:t>
-      </w:r>
-      <w:r>
-        <w:rPr>
-          <w:lang w:val="sv-SE"/>
-        </w:rPr>
-        <w:t xml:space="preserve">3 Hur </w:t>
+      <w:bookmarkStart w:id="28" w:name="_Toc216213841"/>
+      <w:r>
+        <w:rPr>
+          <w:lang w:val="sv-SE"/>
+        </w:rPr>
+        <w:t xml:space="preserve">7.3 Hur </w:t>
       </w:r>
       <w:proofErr w:type="spellStart"/>
       <w:r>
@@ -9133,11 +8916,12 @@
           <w:lang w:val="sv-SE"/>
         </w:rPr>
       </w:pPr>
-      <w:bookmarkStart w:id="29" w:name="_Toc216041761"/>
-      <w:r>
-        <w:rPr>
-          <w:lang w:val="sv-SE"/>
-        </w:rPr>
+      <w:bookmarkStart w:id="29" w:name="_Toc216213842"/>
+      <w:r>
+        <w:rPr>
+          <w:lang w:val="sv-SE"/>
+        </w:rPr>
+        <w:lastRenderedPageBreak/>
         <w:t>7.</w:t>
       </w:r>
       <w:r>
@@ -9150,13 +8934,7 @@
         <w:rPr>
           <w:lang w:val="sv-SE"/>
         </w:rPr>
-        <w:t xml:space="preserve"> </w:t>
-      </w:r>
-      <w:r>
-        <w:rPr>
-          <w:lang w:val="sv-SE"/>
-        </w:rPr>
-        <w:t>Överblick och analogi</w:t>
+        <w:t xml:space="preserve"> Överblick och analogi</w:t>
       </w:r>
       <w:bookmarkEnd w:id="29"/>
     </w:p>
@@ -9287,19 +9065,7 @@
           <w:szCs w:val="24"/>
           <w:lang w:val="sv-SE"/>
         </w:rPr>
-        <w:t xml:space="preserve">-knappen) som styr vilket system som används. Allt används </w:t>
-      </w:r>
-      <w:r>
-        <w:rPr>
-          <w:rFonts w:ascii="Calibri" w:hAnsi="Calibri" w:cs="Calibri"/>
-          <w:i/>
-          <w:iCs/>
-          <w:sz w:val="24"/>
-          <w:szCs w:val="24"/>
-          <w:lang w:val="sv-SE"/>
-        </w:rPr>
-        <w:lastRenderedPageBreak/>
-        <w:t>tillsammans för att säkerställa att passagerarna (användarna) kan köpa biljetter och resa smidigt, oavsett vilket system som används.</w:t>
+        <w:t>-knappen) som styr vilket system som används. Allt används tillsammans för att säkerställa att passagerarna (användarna) kan köpa biljetter och resa smidigt, oavsett vilket system som används.</w:t>
       </w:r>
     </w:p>
     <w:p>
@@ -9316,7 +9082,7 @@
           <w:lang w:val="sv-SE"/>
         </w:rPr>
       </w:pPr>
-      <w:bookmarkStart w:id="30" w:name="_Toc216041762"/>
+      <w:bookmarkStart w:id="30" w:name="_Toc216213843"/>
       <w:r>
         <w:rPr>
           <w:lang w:val="sv-SE"/>
@@ -9457,7 +9223,12 @@
       </w:r>
     </w:p>
     <w:p>
-      <w:hyperlink r:id="rId11" w:history="1">
+      <w:pPr>
+        <w:rPr>
+          <w:lang w:val="sv-SE"/>
+        </w:rPr>
+      </w:pPr>
+      <w:hyperlink r:id="rId10" w:history="1">
         <w:r>
           <w:rPr>
             <w:rStyle w:val="Hyperlink"/>
@@ -9477,7 +9248,7 @@
           <w:lang w:val="sv-SE"/>
         </w:rPr>
       </w:pPr>
-      <w:bookmarkStart w:id="31" w:name="_Toc216041763"/>
+      <w:bookmarkStart w:id="31" w:name="_Toc216213844"/>
       <w:r>
         <w:rPr>
           <w:lang w:val="sv-SE"/>
@@ -11479,6 +11250,7 @@
   <w:style w:type="character" w:default="1" w:styleId="DefaultParagraphFont">
     <w:name w:val="Default Paragraph Font"/>
     <w:uiPriority w:val="1"/>
+    <w:semiHidden/>
     <w:unhideWhenUsed/>
   </w:style>
   <w:style w:type="table" w:default="1" w:styleId="TableNormal">

</xml_diff>